<commit_message>
commit fin de seance 28/04/2026
</commit_message>
<xml_diff>
--- a/carnet de bord_LitterAi.docx
+++ b/carnet de bord_LitterAi.docx
@@ -52,6 +52,7 @@
             <w:pPr>
               <w:pStyle w:val="Normal"/>
               <w:widowControl/>
+              <w:suppressAutoHyphens w:val="true"/>
               <w:spacing w:beforeAutospacing="1" w:after="0"/>
               <w:rPr>
                 <w:rFonts w:ascii="Avenir Next Regular" w:hAnsi="Avenir Next Regular" w:eastAsia="Times New Roman" w:cs="Gill Sans"/>
@@ -61,10 +62,7 @@
               </w:rPr>
             </w:pPr>
             <w:r>
-              <w:rPr>
-                <w:kern w:val="0"/>
-                <w:lang w:val="fr-FR" w:bidi="ar-SA"/>
-              </w:rPr>
+              <w:rPr/>
               <w:drawing>
                 <wp:inline distT="0" distB="0" distL="0" distR="0">
                   <wp:extent cx="1276350" cy="1276350"/>
@@ -119,6 +117,7 @@
             <w:pPr>
               <w:pStyle w:val="Normal"/>
               <w:widowControl/>
+              <w:suppressAutoHyphens w:val="true"/>
               <w:spacing w:beforeAutospacing="1" w:after="0"/>
               <w:jc w:val="right"/>
               <w:rPr>
@@ -129,10 +128,7 @@
               </w:rPr>
             </w:pPr>
             <w:r>
-              <w:rPr>
-                <w:kern w:val="0"/>
-                <w:lang w:val="fr-FR" w:bidi="ar-SA"/>
-              </w:rPr>
+              <w:rPr/>
               <w:drawing>
                 <wp:inline distT="0" distB="0" distL="0" distR="0">
                   <wp:extent cx="1743075" cy="1161415"/>
@@ -301,7 +297,7 @@
               <w:tab w:val="right" w:pos="9056" w:leader="dot"/>
             </w:tabs>
             <w:rPr>
-              <w:rFonts w:eastAsia="游明朝" w:cs="" w:cstheme="minorBidi" w:eastAsiaTheme="minorEastAsia"/>
+              <w:rFonts w:eastAsia="" w:cs="" w:cstheme="minorBidi" w:eastAsiaTheme="minorEastAsia"/>
               <w:b w:val="false"/>
               <w:bCs w:val="false"/>
               <w:caps w:val="false"/>
@@ -341,7 +337,7 @@
           </w:r>
           <w:r>
             <w:rPr>
-              <w:rFonts w:eastAsia="游明朝" w:cs="" w:cstheme="minorBidi" w:eastAsiaTheme="minorEastAsia"/>
+              <w:rFonts w:eastAsia="" w:cs="" w:cstheme="minorBidi" w:eastAsiaTheme="minorEastAsia"/>
               <w:b w:val="false"/>
               <w:bCs w:val="false"/>
               <w:caps w:val="false"/>
@@ -376,7 +372,7 @@
               <w:tab w:val="right" w:pos="9056" w:leader="dot"/>
             </w:tabs>
             <w:rPr>
-              <w:rFonts w:eastAsia="游明朝" w:cs="" w:cstheme="minorBidi" w:eastAsiaTheme="minorEastAsia"/>
+              <w:rFonts w:eastAsia="" w:cs="" w:cstheme="minorBidi" w:eastAsiaTheme="minorEastAsia"/>
               <w:b w:val="false"/>
               <w:bCs w:val="false"/>
               <w:caps w:val="false"/>
@@ -396,7 +392,7 @@
           </w:r>
           <w:r>
             <w:rPr>
-              <w:rFonts w:eastAsia="游明朝" w:cs="" w:cstheme="minorBidi" w:eastAsiaTheme="minorEastAsia"/>
+              <w:rFonts w:eastAsia="" w:cs="" w:cstheme="minorBidi" w:eastAsiaTheme="minorEastAsia"/>
               <w:b w:val="false"/>
               <w:bCs w:val="false"/>
               <w:caps w:val="false"/>
@@ -430,7 +426,7 @@
               <w:tab w:val="right" w:pos="9056" w:leader="dot"/>
             </w:tabs>
             <w:rPr>
-              <w:rFonts w:eastAsia="游明朝" w:cs="" w:cstheme="minorBidi" w:eastAsiaTheme="minorEastAsia"/>
+              <w:rFonts w:eastAsia="" w:cs="" w:cstheme="minorBidi" w:eastAsiaTheme="minorEastAsia"/>
               <w:b w:val="false"/>
               <w:bCs w:val="false"/>
               <w:caps w:val="false"/>
@@ -450,7 +446,7 @@
           </w:r>
           <w:r>
             <w:rPr>
-              <w:rFonts w:eastAsia="游明朝" w:cs="" w:cstheme="minorBidi" w:eastAsiaTheme="minorEastAsia"/>
+              <w:rFonts w:eastAsia="" w:cs="" w:cstheme="minorBidi" w:eastAsiaTheme="minorEastAsia"/>
               <w:b w:val="false"/>
               <w:bCs w:val="false"/>
               <w:caps w:val="false"/>
@@ -484,7 +480,7 @@
               <w:tab w:val="right" w:pos="9056" w:leader="dot"/>
             </w:tabs>
             <w:rPr>
-              <w:rFonts w:eastAsia="游明朝" w:cs="" w:cstheme="minorBidi" w:eastAsiaTheme="minorEastAsia"/>
+              <w:rFonts w:eastAsia="" w:cs="" w:cstheme="minorBidi" w:eastAsiaTheme="minorEastAsia"/>
               <w:b w:val="false"/>
               <w:bCs w:val="false"/>
               <w:caps w:val="false"/>
@@ -504,7 +500,7 @@
           </w:r>
           <w:r>
             <w:rPr>
-              <w:rFonts w:eastAsia="游明朝" w:cs="" w:cstheme="minorBidi" w:eastAsiaTheme="minorEastAsia"/>
+              <w:rFonts w:eastAsia="" w:cs="" w:cstheme="minorBidi" w:eastAsiaTheme="minorEastAsia"/>
               <w:b w:val="false"/>
               <w:bCs w:val="false"/>
               <w:caps w:val="false"/>
@@ -622,8 +618,6 @@
           <w:b/>
         </w:rPr>
       </w:r>
-      <w:bookmarkStart w:id="2" w:name="_Toc26772959"/>
-      <w:bookmarkStart w:id="3" w:name="_Toc26772959"/>
     </w:p>
     <w:p>
       <w:pPr>
@@ -981,8 +975,8 @@
           <w:b w:val="false"/>
         </w:rPr>
       </w:pPr>
-      <w:bookmarkStart w:id="4" w:name="_Toc26772959"/>
-      <w:bookmarkStart w:id="5" w:name="_Toc61806043"/>
+      <w:bookmarkStart w:id="2" w:name="_Toc61806043"/>
+      <w:bookmarkStart w:id="3" w:name="_Toc26772959"/>
       <w:r>
         <w:rPr>
           <w:rFonts w:cs="Gill Sans" w:ascii="Avenir Next Regular" w:hAnsi="Avenir Next Regular"/>
@@ -990,7 +984,7 @@
         </w:rPr>
         <w:t xml:space="preserve">Les </w:t>
       </w:r>
-      <w:bookmarkEnd w:id="4"/>
+      <w:bookmarkEnd w:id="3"/>
       <w:r>
         <w:rPr>
           <w:rFonts w:cs="Gill Sans" w:ascii="Avenir Next Regular" w:hAnsi="Avenir Next Regular"/>
@@ -998,7 +992,7 @@
         </w:rPr>
         <w:t>outils</w:t>
       </w:r>
-      <w:bookmarkEnd w:id="5"/>
+      <w:bookmarkEnd w:id="2"/>
       <w:r>
         <w:rPr>
           <w:rFonts w:cs="Gill Sans" w:ascii="Avenir Next Regular" w:hAnsi="Avenir Next Regular"/>
@@ -1076,7 +1070,7 @@
           <w:b w:val="false"/>
         </w:rPr>
       </w:pPr>
-      <w:bookmarkStart w:id="6" w:name="_Toc61806044"/>
+      <w:bookmarkStart w:id="4" w:name="_Toc61806044"/>
       <w:r>
         <w:rPr>
           <w:rFonts w:cs="Gill Sans" w:ascii="Avenir Next Regular" w:hAnsi="Avenir Next Regular"/>
@@ -1084,7 +1078,7 @@
         </w:rPr>
         <w:t>Mon expérience au quotidien</w:t>
       </w:r>
-      <w:bookmarkEnd w:id="6"/>
+      <w:bookmarkEnd w:id="4"/>
     </w:p>
     <w:tbl>
       <w:tblPr>
@@ -1117,6 +1111,7 @@
             <w:pPr>
               <w:pStyle w:val="Normal"/>
               <w:widowControl/>
+              <w:suppressAutoHyphens w:val="true"/>
               <w:spacing w:before="0" w:after="0"/>
               <w:ind w:hanging="0"/>
               <w:rPr>
@@ -1146,6 +1141,7 @@
             <w:pPr>
               <w:pStyle w:val="Normal"/>
               <w:widowControl/>
+              <w:suppressAutoHyphens w:val="true"/>
               <w:spacing w:before="0" w:after="0"/>
               <w:ind w:hanging="0"/>
               <w:rPr>
@@ -1162,7 +1158,18 @@
                 <w:szCs w:val="24"/>
                 <w:lang w:val="fr-FR" w:eastAsia="en-US" w:bidi="ar-SA"/>
               </w:rPr>
-              <w:t>27/04/2005</w:t>
+              <w:t>27/04/</w:t>
+            </w:r>
+            <w:r>
+              <w:rPr>
+                <w:rFonts w:eastAsia="Calibri" w:cs="" w:ascii="Calibri Light" w:hAnsi="Calibri Light" w:asciiTheme="majorHAnsi" w:hAnsiTheme="majorHAnsi"/>
+                <w:b/>
+                <w:kern w:val="0"/>
+                <w:sz w:val="24"/>
+                <w:szCs w:val="24"/>
+                <w:lang w:val="fr-FR" w:eastAsia="en-US" w:bidi="ar-SA"/>
+              </w:rPr>
+              <w:t>2026</w:t>
             </w:r>
           </w:p>
         </w:tc>
@@ -1175,6 +1182,7 @@
             <w:pPr>
               <w:pStyle w:val="Normal"/>
               <w:widowControl/>
+              <w:suppressAutoHyphens w:val="true"/>
               <w:spacing w:before="0" w:after="0"/>
               <w:ind w:hanging="0"/>
               <w:rPr>
@@ -1184,12 +1192,8 @@
             </w:pPr>
             <w:r>
               <w:rPr>
-                <w:rFonts w:eastAsia="Calibri" w:cs="" w:ascii="Calibri Light" w:hAnsi="Calibri Light"/>
+                <w:rFonts w:asciiTheme="majorHAnsi" w:hAnsiTheme="majorHAnsi" w:ascii="Calibri Light" w:hAnsi="Calibri Light"/>
                 <w:b/>
-                <w:kern w:val="0"/>
-                <w:sz w:val="24"/>
-                <w:szCs w:val="24"/>
-                <w:lang w:val="fr-FR" w:eastAsia="en-US" w:bidi="ar-SA"/>
               </w:rPr>
             </w:r>
           </w:p>
@@ -1208,6 +1212,7 @@
             <w:pPr>
               <w:pStyle w:val="Normal"/>
               <w:widowControl/>
+              <w:suppressAutoHyphens w:val="true"/>
               <w:spacing w:before="0" w:after="0"/>
               <w:ind w:hanging="0"/>
               <w:rPr>
@@ -1229,6 +1234,7 @@
             <w:pPr>
               <w:pStyle w:val="Normal"/>
               <w:widowControl/>
+              <w:suppressAutoHyphens w:val="true"/>
               <w:spacing w:before="0" w:after="0"/>
               <w:ind w:hanging="0"/>
               <w:rPr>
@@ -1256,6 +1262,7 @@
             <w:pPr>
               <w:pStyle w:val="Normal"/>
               <w:widowControl/>
+              <w:suppressAutoHyphens w:val="true"/>
               <w:spacing w:before="0" w:after="0"/>
               <w:ind w:hanging="0"/>
               <w:rPr>
@@ -1283,19 +1290,16 @@
             <w:pPr>
               <w:pStyle w:val="Normal"/>
               <w:widowControl/>
-              <w:spacing w:before="0" w:after="0"/>
-              <w:ind w:hanging="0"/>
-              <w:rPr>
-                <w:rFonts w:ascii="Calibri Light" w:hAnsi="Calibri Light" w:asciiTheme="majorHAnsi" w:hAnsiTheme="majorHAnsi"/>
-              </w:rPr>
-            </w:pPr>
-            <w:r>
-              <w:rPr>
-                <w:rFonts w:eastAsia="Calibri" w:cs="" w:ascii="Calibri Light" w:hAnsi="Calibri Light"/>
-                <w:kern w:val="0"/>
-                <w:sz w:val="24"/>
-                <w:szCs w:val="24"/>
-                <w:lang w:val="fr-FR" w:eastAsia="en-US" w:bidi="ar-SA"/>
+              <w:suppressAutoHyphens w:val="true"/>
+              <w:spacing w:before="0" w:after="0"/>
+              <w:ind w:hanging="0"/>
+              <w:rPr>
+                <w:rFonts w:ascii="Calibri Light" w:hAnsi="Calibri Light" w:asciiTheme="majorHAnsi" w:hAnsiTheme="majorHAnsi"/>
+              </w:rPr>
+            </w:pPr>
+            <w:r>
+              <w:rPr>
+                <w:rFonts w:asciiTheme="majorHAnsi" w:hAnsiTheme="majorHAnsi" w:ascii="Calibri Light" w:hAnsi="Calibri Light"/>
               </w:rPr>
             </w:r>
           </w:p>
@@ -1312,6 +1316,7 @@
             <w:pPr>
               <w:pStyle w:val="Normal"/>
               <w:widowControl/>
+              <w:suppressAutoHyphens w:val="true"/>
               <w:spacing w:before="0" w:after="0"/>
               <w:ind w:hanging="0"/>
               <w:rPr>
@@ -1339,6 +1344,7 @@
             <w:pPr>
               <w:pStyle w:val="Normal"/>
               <w:widowControl/>
+              <w:suppressAutoHyphens w:val="true"/>
               <w:spacing w:before="0" w:after="0"/>
               <w:ind w:hanging="0"/>
               <w:rPr>
@@ -1366,19 +1372,16 @@
             <w:pPr>
               <w:pStyle w:val="Normal"/>
               <w:widowControl/>
-              <w:spacing w:before="0" w:after="0"/>
-              <w:ind w:hanging="0"/>
-              <w:rPr>
-                <w:rFonts w:ascii="Calibri Light" w:hAnsi="Calibri Light" w:asciiTheme="majorHAnsi" w:hAnsiTheme="majorHAnsi"/>
-              </w:rPr>
-            </w:pPr>
-            <w:r>
-              <w:rPr>
-                <w:rFonts w:eastAsia="Calibri" w:cs="" w:ascii="Calibri Light" w:hAnsi="Calibri Light"/>
-                <w:kern w:val="0"/>
-                <w:sz w:val="24"/>
-                <w:szCs w:val="24"/>
-                <w:lang w:val="fr-FR" w:eastAsia="en-US" w:bidi="ar-SA"/>
+              <w:suppressAutoHyphens w:val="true"/>
+              <w:spacing w:before="0" w:after="0"/>
+              <w:ind w:hanging="0"/>
+              <w:rPr>
+                <w:rFonts w:ascii="Calibri Light" w:hAnsi="Calibri Light" w:asciiTheme="majorHAnsi" w:hAnsiTheme="majorHAnsi"/>
+              </w:rPr>
+            </w:pPr>
+            <w:r>
+              <w:rPr>
+                <w:rFonts w:asciiTheme="majorHAnsi" w:hAnsiTheme="majorHAnsi" w:ascii="Calibri Light" w:hAnsi="Calibri Light"/>
               </w:rPr>
             </w:r>
           </w:p>
@@ -1397,6 +1400,7 @@
             <w:pPr>
               <w:pStyle w:val="Normal"/>
               <w:widowControl/>
+              <w:suppressAutoHyphens w:val="true"/>
               <w:spacing w:before="0" w:after="0"/>
               <w:ind w:hanging="0"/>
               <w:rPr>
@@ -1418,6 +1422,7 @@
             <w:pPr>
               <w:pStyle w:val="Normal"/>
               <w:widowControl/>
+              <w:suppressAutoHyphens w:val="true"/>
               <w:spacing w:before="0" w:after="0"/>
               <w:ind w:hanging="0"/>
               <w:rPr>
@@ -1439,6 +1444,7 @@
             <w:pPr>
               <w:pStyle w:val="Normal"/>
               <w:widowControl/>
+              <w:suppressAutoHyphens w:val="true"/>
               <w:spacing w:before="0" w:after="0"/>
               <w:ind w:hanging="0"/>
               <w:rPr>
@@ -1460,6 +1466,7 @@
             <w:pPr>
               <w:pStyle w:val="Normal"/>
               <w:widowControl/>
+              <w:suppressAutoHyphens w:val="true"/>
               <w:spacing w:before="0" w:after="0"/>
               <w:ind w:hanging="0"/>
               <w:rPr>
@@ -1487,6 +1494,7 @@
             <w:pPr>
               <w:pStyle w:val="Normal"/>
               <w:widowControl/>
+              <w:suppressAutoHyphens w:val="true"/>
               <w:spacing w:before="0" w:after="0"/>
               <w:ind w:hanging="0"/>
               <w:rPr>
@@ -1514,19 +1522,16 @@
             <w:pPr>
               <w:pStyle w:val="Normal"/>
               <w:widowControl/>
-              <w:spacing w:before="0" w:after="0"/>
-              <w:ind w:hanging="0"/>
-              <w:rPr>
-                <w:rFonts w:ascii="Calibri Light" w:hAnsi="Calibri Light" w:asciiTheme="majorHAnsi" w:hAnsiTheme="majorHAnsi"/>
-              </w:rPr>
-            </w:pPr>
-            <w:r>
-              <w:rPr>
-                <w:rFonts w:eastAsia="Calibri" w:cs="" w:ascii="Calibri Light" w:hAnsi="Calibri Light"/>
-                <w:kern w:val="0"/>
-                <w:sz w:val="24"/>
-                <w:szCs w:val="24"/>
-                <w:lang w:val="fr-FR" w:eastAsia="en-US" w:bidi="ar-SA"/>
+              <w:suppressAutoHyphens w:val="true"/>
+              <w:spacing w:before="0" w:after="0"/>
+              <w:ind w:hanging="0"/>
+              <w:rPr>
+                <w:rFonts w:ascii="Calibri Light" w:hAnsi="Calibri Light" w:asciiTheme="majorHAnsi" w:hAnsiTheme="majorHAnsi"/>
+              </w:rPr>
+            </w:pPr>
+            <w:r>
+              <w:rPr>
+                <w:rFonts w:asciiTheme="majorHAnsi" w:hAnsiTheme="majorHAnsi" w:ascii="Calibri Light" w:hAnsi="Calibri Light"/>
               </w:rPr>
             </w:r>
           </w:p>
@@ -1545,6 +1550,7 @@
             <w:pPr>
               <w:pStyle w:val="Normal"/>
               <w:widowControl/>
+              <w:suppressAutoHyphens w:val="true"/>
               <w:spacing w:before="0" w:after="0"/>
               <w:ind w:hanging="0"/>
               <w:rPr>
@@ -1566,6 +1572,7 @@
             <w:pPr>
               <w:pStyle w:val="Normal"/>
               <w:widowControl/>
+              <w:suppressAutoHyphens w:val="true"/>
               <w:spacing w:before="0" w:after="0"/>
               <w:ind w:hanging="0"/>
               <w:rPr>
@@ -1587,19 +1594,16 @@
             <w:pPr>
               <w:pStyle w:val="Normal"/>
               <w:widowControl/>
-              <w:spacing w:before="0" w:after="0"/>
-              <w:ind w:hanging="0"/>
-              <w:rPr>
-                <w:rFonts w:ascii="Calibri Light" w:hAnsi="Calibri Light" w:asciiTheme="majorHAnsi" w:hAnsiTheme="majorHAnsi"/>
-              </w:rPr>
-            </w:pPr>
-            <w:r>
-              <w:rPr>
-                <w:rFonts w:eastAsia="Calibri" w:cs="" w:ascii="Calibri Light" w:hAnsi="Calibri Light"/>
-                <w:kern w:val="0"/>
-                <w:sz w:val="24"/>
-                <w:szCs w:val="24"/>
-                <w:lang w:val="fr-FR" w:eastAsia="en-US" w:bidi="ar-SA"/>
+              <w:suppressAutoHyphens w:val="true"/>
+              <w:spacing w:before="0" w:after="0"/>
+              <w:ind w:hanging="0"/>
+              <w:rPr>
+                <w:rFonts w:ascii="Calibri Light" w:hAnsi="Calibri Light" w:asciiTheme="majorHAnsi" w:hAnsiTheme="majorHAnsi"/>
+              </w:rPr>
+            </w:pPr>
+            <w:r>
+              <w:rPr>
+                <w:rFonts w:asciiTheme="majorHAnsi" w:hAnsiTheme="majorHAnsi" w:ascii="Calibri Light" w:hAnsi="Calibri Light"/>
               </w:rPr>
             </w:r>
           </w:p>
@@ -1613,18 +1617,15 @@
             <w:pPr>
               <w:pStyle w:val="Normal"/>
               <w:widowControl/>
-              <w:spacing w:before="0" w:after="0"/>
-              <w:rPr>
-                <w:rFonts w:ascii="Calibri Light" w:hAnsi="Calibri Light" w:asciiTheme="majorHAnsi" w:hAnsiTheme="majorHAnsi"/>
-              </w:rPr>
-            </w:pPr>
-            <w:r>
-              <w:rPr>
-                <w:rFonts w:eastAsia="Calibri" w:cs="" w:ascii="Calibri Light" w:hAnsi="Calibri Light"/>
-                <w:kern w:val="0"/>
-                <w:sz w:val="24"/>
-                <w:szCs w:val="24"/>
-                <w:lang w:val="fr-FR" w:eastAsia="en-US" w:bidi="ar-SA"/>
+              <w:suppressAutoHyphens w:val="true"/>
+              <w:spacing w:before="0" w:after="0"/>
+              <w:rPr>
+                <w:rFonts w:ascii="Calibri Light" w:hAnsi="Calibri Light" w:asciiTheme="majorHAnsi" w:hAnsiTheme="majorHAnsi"/>
+              </w:rPr>
+            </w:pPr>
+            <w:r>
+              <w:rPr>
+                <w:rFonts w:asciiTheme="majorHAnsi" w:hAnsiTheme="majorHAnsi" w:ascii="Calibri Light" w:hAnsi="Calibri Light"/>
               </w:rPr>
             </w:r>
           </w:p>
@@ -1638,19 +1639,16 @@
             <w:pPr>
               <w:pStyle w:val="Normal"/>
               <w:widowControl/>
-              <w:spacing w:before="0" w:after="0"/>
-              <w:ind w:hanging="0"/>
-              <w:rPr>
-                <w:rFonts w:ascii="Calibri Light" w:hAnsi="Calibri Light" w:asciiTheme="majorHAnsi" w:hAnsiTheme="majorHAnsi"/>
-              </w:rPr>
-            </w:pPr>
-            <w:r>
-              <w:rPr>
-                <w:rFonts w:eastAsia="Calibri" w:cs="" w:ascii="Calibri Light" w:hAnsi="Calibri Light"/>
-                <w:kern w:val="0"/>
-                <w:sz w:val="24"/>
-                <w:szCs w:val="24"/>
-                <w:lang w:val="fr-FR" w:eastAsia="en-US" w:bidi="ar-SA"/>
+              <w:suppressAutoHyphens w:val="true"/>
+              <w:spacing w:before="0" w:after="0"/>
+              <w:ind w:hanging="0"/>
+              <w:rPr>
+                <w:rFonts w:ascii="Calibri Light" w:hAnsi="Calibri Light" w:asciiTheme="majorHAnsi" w:hAnsiTheme="majorHAnsi"/>
+              </w:rPr>
+            </w:pPr>
+            <w:r>
+              <w:rPr>
+                <w:rFonts w:asciiTheme="majorHAnsi" w:hAnsiTheme="majorHAnsi" w:ascii="Calibri Light" w:hAnsi="Calibri Light"/>
               </w:rPr>
             </w:r>
           </w:p>
@@ -1669,6 +1667,7 @@
             <w:pPr>
               <w:pStyle w:val="Normal"/>
               <w:widowControl/>
+              <w:suppressAutoHyphens w:val="true"/>
               <w:spacing w:before="0" w:after="0"/>
               <w:ind w:hanging="0"/>
               <w:rPr>
@@ -1690,19 +1689,16 @@
             <w:pPr>
               <w:pStyle w:val="Normal"/>
               <w:widowControl/>
-              <w:spacing w:before="0" w:after="0"/>
-              <w:ind w:hanging="0"/>
-              <w:rPr>
-                <w:rFonts w:ascii="Calibri Light" w:hAnsi="Calibri Light" w:asciiTheme="majorHAnsi" w:hAnsiTheme="majorHAnsi"/>
-              </w:rPr>
-            </w:pPr>
-            <w:r>
-              <w:rPr>
-                <w:rFonts w:eastAsia="Calibri" w:cs="" w:ascii="Calibri Light" w:hAnsi="Calibri Light"/>
-                <w:kern w:val="0"/>
-                <w:sz w:val="24"/>
-                <w:szCs w:val="24"/>
-                <w:lang w:val="fr-FR" w:eastAsia="en-US" w:bidi="ar-SA"/>
+              <w:suppressAutoHyphens w:val="true"/>
+              <w:spacing w:before="0" w:after="0"/>
+              <w:ind w:hanging="0"/>
+              <w:rPr>
+                <w:rFonts w:ascii="Calibri Light" w:hAnsi="Calibri Light" w:asciiTheme="majorHAnsi" w:hAnsiTheme="majorHAnsi"/>
+              </w:rPr>
+            </w:pPr>
+            <w:r>
+              <w:rPr>
+                <w:rFonts w:asciiTheme="majorHAnsi" w:hAnsiTheme="majorHAnsi" w:ascii="Calibri Light" w:hAnsi="Calibri Light"/>
               </w:rPr>
             </w:r>
           </w:p>
@@ -1716,18 +1712,15 @@
             <w:pPr>
               <w:pStyle w:val="Normal"/>
               <w:widowControl/>
-              <w:spacing w:before="0" w:after="0"/>
-              <w:rPr>
-                <w:rFonts w:ascii="Calibri Light" w:hAnsi="Calibri Light" w:asciiTheme="majorHAnsi" w:hAnsiTheme="majorHAnsi"/>
-              </w:rPr>
-            </w:pPr>
-            <w:r>
-              <w:rPr>
-                <w:rFonts w:eastAsia="Calibri" w:cs="" w:ascii="Calibri Light" w:hAnsi="Calibri Light"/>
-                <w:kern w:val="0"/>
-                <w:sz w:val="24"/>
-                <w:szCs w:val="24"/>
-                <w:lang w:val="fr-FR" w:eastAsia="en-US" w:bidi="ar-SA"/>
+              <w:suppressAutoHyphens w:val="true"/>
+              <w:spacing w:before="0" w:after="0"/>
+              <w:rPr>
+                <w:rFonts w:ascii="Calibri Light" w:hAnsi="Calibri Light" w:asciiTheme="majorHAnsi" w:hAnsiTheme="majorHAnsi"/>
+              </w:rPr>
+            </w:pPr>
+            <w:r>
+              <w:rPr>
+                <w:rFonts w:asciiTheme="majorHAnsi" w:hAnsiTheme="majorHAnsi" w:ascii="Calibri Light" w:hAnsi="Calibri Light"/>
               </w:rPr>
             </w:r>
           </w:p>
@@ -1741,19 +1734,16 @@
             <w:pPr>
               <w:pStyle w:val="Normal"/>
               <w:widowControl/>
-              <w:spacing w:before="0" w:after="0"/>
-              <w:ind w:hanging="0"/>
-              <w:rPr>
-                <w:rFonts w:ascii="Calibri Light" w:hAnsi="Calibri Light" w:asciiTheme="majorHAnsi" w:hAnsiTheme="majorHAnsi"/>
-              </w:rPr>
-            </w:pPr>
-            <w:r>
-              <w:rPr>
-                <w:rFonts w:eastAsia="Calibri" w:cs="" w:ascii="Calibri Light" w:hAnsi="Calibri Light"/>
-                <w:kern w:val="0"/>
-                <w:sz w:val="24"/>
-                <w:szCs w:val="24"/>
-                <w:lang w:val="fr-FR" w:eastAsia="en-US" w:bidi="ar-SA"/>
+              <w:suppressAutoHyphens w:val="true"/>
+              <w:spacing w:before="0" w:after="0"/>
+              <w:ind w:hanging="0"/>
+              <w:rPr>
+                <w:rFonts w:ascii="Calibri Light" w:hAnsi="Calibri Light" w:asciiTheme="majorHAnsi" w:hAnsiTheme="majorHAnsi"/>
+              </w:rPr>
+            </w:pPr>
+            <w:r>
+              <w:rPr>
+                <w:rFonts w:asciiTheme="majorHAnsi" w:hAnsiTheme="majorHAnsi" w:ascii="Calibri Light" w:hAnsi="Calibri Light"/>
               </w:rPr>
             </w:r>
           </w:p>
@@ -1772,6 +1762,7 @@
             <w:pPr>
               <w:pStyle w:val="Normal"/>
               <w:widowControl/>
+              <w:suppressAutoHyphens w:val="true"/>
               <w:spacing w:before="0" w:after="0"/>
               <w:ind w:hanging="0"/>
               <w:rPr>
@@ -1793,6 +1784,7 @@
             <w:pPr>
               <w:pStyle w:val="Normal"/>
               <w:widowControl/>
+              <w:suppressAutoHyphens w:val="true"/>
               <w:spacing w:before="0" w:after="0"/>
               <w:ind w:hanging="0"/>
               <w:rPr>
@@ -1820,6 +1812,7 @@
             <w:pPr>
               <w:pStyle w:val="Normal"/>
               <w:widowControl/>
+              <w:suppressAutoHyphens w:val="true"/>
               <w:spacing w:before="0" w:after="0"/>
               <w:ind w:hanging="0"/>
               <w:rPr>
@@ -1847,19 +1840,16 @@
             <w:pPr>
               <w:pStyle w:val="Normal"/>
               <w:widowControl/>
-              <w:spacing w:before="0" w:after="0"/>
-              <w:ind w:hanging="0"/>
-              <w:rPr>
-                <w:rFonts w:ascii="Calibri Light" w:hAnsi="Calibri Light" w:asciiTheme="majorHAnsi" w:hAnsiTheme="majorHAnsi"/>
-              </w:rPr>
-            </w:pPr>
-            <w:r>
-              <w:rPr>
-                <w:rFonts w:eastAsia="Calibri" w:cs="" w:ascii="Calibri Light" w:hAnsi="Calibri Light"/>
-                <w:kern w:val="0"/>
-                <w:sz w:val="24"/>
-                <w:szCs w:val="24"/>
-                <w:lang w:val="fr-FR" w:eastAsia="en-US" w:bidi="ar-SA"/>
+              <w:suppressAutoHyphens w:val="true"/>
+              <w:spacing w:before="0" w:after="0"/>
+              <w:ind w:hanging="0"/>
+              <w:rPr>
+                <w:rFonts w:ascii="Calibri Light" w:hAnsi="Calibri Light" w:asciiTheme="majorHAnsi" w:hAnsiTheme="majorHAnsi"/>
+              </w:rPr>
+            </w:pPr>
+            <w:r>
+              <w:rPr>
+                <w:rFonts w:asciiTheme="majorHAnsi" w:hAnsiTheme="majorHAnsi" w:ascii="Calibri Light" w:hAnsi="Calibri Light"/>
               </w:rPr>
             </w:r>
           </w:p>
@@ -1912,6 +1902,7 @@
             <w:pPr>
               <w:pStyle w:val="Normal"/>
               <w:widowControl/>
+              <w:suppressAutoHyphens w:val="true"/>
               <w:spacing w:before="0" w:after="0"/>
               <w:ind w:hanging="0"/>
               <w:rPr>
@@ -1941,6 +1932,7 @@
             <w:pPr>
               <w:pStyle w:val="Normal"/>
               <w:widowControl/>
+              <w:suppressAutoHyphens w:val="true"/>
               <w:spacing w:before="0" w:after="0"/>
               <w:ind w:hanging="0"/>
               <w:rPr>
@@ -1957,7 +1949,40 @@
                 <w:szCs w:val="24"/>
                 <w:lang w:val="fr-FR" w:eastAsia="en-US" w:bidi="ar-SA"/>
               </w:rPr>
-              <w:t>TP2</w:t>
+              <w:t>2</w:t>
+            </w:r>
+            <w:r>
+              <w:rPr>
+                <w:rFonts w:eastAsia="Calibri" w:cs="" w:ascii="Calibri Light" w:hAnsi="Calibri Light" w:asciiTheme="majorHAnsi" w:hAnsiTheme="majorHAnsi"/>
+                <w:b/>
+                <w:kern w:val="0"/>
+                <w:sz w:val="24"/>
+                <w:szCs w:val="24"/>
+                <w:lang w:val="fr-FR" w:eastAsia="en-US" w:bidi="ar-SA"/>
+              </w:rPr>
+              <w:t>8</w:t>
+            </w:r>
+            <w:r>
+              <w:rPr>
+                <w:rFonts w:eastAsia="Calibri" w:cs="" w:ascii="Calibri Light" w:hAnsi="Calibri Light" w:asciiTheme="majorHAnsi" w:hAnsiTheme="majorHAnsi"/>
+                <w:b/>
+                <w:kern w:val="0"/>
+                <w:sz w:val="24"/>
+                <w:szCs w:val="24"/>
+                <w:lang w:val="fr-FR" w:eastAsia="en-US" w:bidi="ar-SA"/>
+              </w:rPr>
+              <w:t>/04/</w:t>
+            </w:r>
+            <w:r>
+              <w:rPr>
+                <w:rFonts w:eastAsia="Calibri" w:cs="" w:ascii="Calibri Light" w:hAnsi="Calibri Light" w:asciiTheme="majorHAnsi" w:hAnsiTheme="majorHAnsi"/>
+                <w:b/>
+                <w:kern w:val="0"/>
+                <w:sz w:val="24"/>
+                <w:szCs w:val="24"/>
+                <w:lang w:val="fr-FR" w:eastAsia="en-US" w:bidi="ar-SA"/>
+              </w:rPr>
+              <w:t>2026</w:t>
             </w:r>
           </w:p>
         </w:tc>
@@ -1970,6 +1995,7 @@
             <w:pPr>
               <w:pStyle w:val="Normal"/>
               <w:widowControl/>
+              <w:suppressAutoHyphens w:val="true"/>
               <w:spacing w:before="0" w:after="0"/>
               <w:ind w:hanging="0"/>
               <w:rPr>
@@ -1979,12 +2005,8 @@
             </w:pPr>
             <w:r>
               <w:rPr>
-                <w:rFonts w:eastAsia="Calibri" w:cs="" w:ascii="Calibri Light" w:hAnsi="Calibri Light"/>
+                <w:rFonts w:asciiTheme="majorHAnsi" w:hAnsiTheme="majorHAnsi" w:ascii="Calibri Light" w:hAnsi="Calibri Light"/>
                 <w:b/>
-                <w:kern w:val="0"/>
-                <w:sz w:val="24"/>
-                <w:szCs w:val="24"/>
-                <w:lang w:val="fr-FR" w:eastAsia="en-US" w:bidi="ar-SA"/>
               </w:rPr>
             </w:r>
           </w:p>
@@ -2003,6 +2025,7 @@
             <w:pPr>
               <w:pStyle w:val="Normal"/>
               <w:widowControl/>
+              <w:suppressAutoHyphens w:val="true"/>
               <w:spacing w:before="0" w:after="0"/>
               <w:ind w:hanging="0"/>
               <w:rPr>
@@ -2024,6 +2047,7 @@
             <w:pPr>
               <w:pStyle w:val="Normal"/>
               <w:widowControl/>
+              <w:suppressAutoHyphens w:val="true"/>
               <w:spacing w:before="0" w:after="0"/>
               <w:ind w:hanging="0"/>
               <w:rPr>
@@ -2051,19 +2075,16 @@
             <w:pPr>
               <w:pStyle w:val="Normal"/>
               <w:widowControl/>
-              <w:spacing w:before="0" w:after="0"/>
-              <w:ind w:hanging="0"/>
-              <w:rPr>
-                <w:rFonts w:ascii="Calibri Light" w:hAnsi="Calibri Light" w:asciiTheme="majorHAnsi" w:hAnsiTheme="majorHAnsi"/>
-              </w:rPr>
-            </w:pPr>
-            <w:r>
-              <w:rPr>
-                <w:rFonts w:eastAsia="Calibri" w:cs="" w:ascii="Calibri Light" w:hAnsi="Calibri Light"/>
-                <w:kern w:val="0"/>
-                <w:sz w:val="24"/>
-                <w:szCs w:val="24"/>
-                <w:lang w:val="fr-FR" w:eastAsia="en-US" w:bidi="ar-SA"/>
+              <w:suppressAutoHyphens w:val="true"/>
+              <w:spacing w:before="0" w:after="0"/>
+              <w:ind w:hanging="0"/>
+              <w:rPr>
+                <w:rFonts w:ascii="Calibri Light" w:hAnsi="Calibri Light" w:asciiTheme="majorHAnsi" w:hAnsiTheme="majorHAnsi"/>
+              </w:rPr>
+            </w:pPr>
+            <w:r>
+              <w:rPr>
+                <w:rFonts w:asciiTheme="majorHAnsi" w:hAnsiTheme="majorHAnsi" w:ascii="Calibri Light" w:hAnsi="Calibri Light"/>
               </w:rPr>
             </w:r>
           </w:p>
@@ -2077,19 +2098,16 @@
             <w:pPr>
               <w:pStyle w:val="Normal"/>
               <w:widowControl/>
-              <w:spacing w:before="0" w:after="0"/>
-              <w:ind w:hanging="0"/>
-              <w:rPr>
-                <w:rFonts w:ascii="Calibri Light" w:hAnsi="Calibri Light" w:asciiTheme="majorHAnsi" w:hAnsiTheme="majorHAnsi"/>
-              </w:rPr>
-            </w:pPr>
-            <w:r>
-              <w:rPr>
-                <w:rFonts w:eastAsia="Calibri" w:cs="" w:ascii="Calibri Light" w:hAnsi="Calibri Light"/>
-                <w:kern w:val="0"/>
-                <w:sz w:val="24"/>
-                <w:szCs w:val="24"/>
-                <w:lang w:val="fr-FR" w:eastAsia="en-US" w:bidi="ar-SA"/>
+              <w:suppressAutoHyphens w:val="true"/>
+              <w:spacing w:before="0" w:after="0"/>
+              <w:ind w:hanging="0"/>
+              <w:rPr>
+                <w:rFonts w:ascii="Calibri Light" w:hAnsi="Calibri Light" w:asciiTheme="majorHAnsi" w:hAnsiTheme="majorHAnsi"/>
+              </w:rPr>
+            </w:pPr>
+            <w:r>
+              <w:rPr>
+                <w:rFonts w:asciiTheme="majorHAnsi" w:hAnsiTheme="majorHAnsi" w:ascii="Calibri Light" w:hAnsi="Calibri Light"/>
               </w:rPr>
             </w:r>
           </w:p>
@@ -2106,6 +2124,7 @@
             <w:pPr>
               <w:pStyle w:val="Normal"/>
               <w:widowControl/>
+              <w:suppressAutoHyphens w:val="true"/>
               <w:spacing w:before="0" w:after="0"/>
               <w:ind w:hanging="0"/>
               <w:rPr>
@@ -2133,19 +2152,16 @@
             <w:pPr>
               <w:pStyle w:val="Normal"/>
               <w:widowControl/>
-              <w:spacing w:before="0" w:after="0"/>
-              <w:ind w:hanging="0"/>
-              <w:rPr>
-                <w:rFonts w:ascii="Calibri Light" w:hAnsi="Calibri Light" w:asciiTheme="majorHAnsi" w:hAnsiTheme="majorHAnsi"/>
-              </w:rPr>
-            </w:pPr>
-            <w:r>
-              <w:rPr>
-                <w:rFonts w:eastAsia="Calibri" w:cs="" w:ascii="Calibri Light" w:hAnsi="Calibri Light"/>
-                <w:kern w:val="0"/>
-                <w:sz w:val="24"/>
-                <w:szCs w:val="24"/>
-                <w:lang w:val="fr-FR" w:eastAsia="en-US" w:bidi="ar-SA"/>
+              <w:suppressAutoHyphens w:val="true"/>
+              <w:spacing w:before="0" w:after="0"/>
+              <w:ind w:hanging="0"/>
+              <w:rPr>
+                <w:rFonts w:ascii="Calibri Light" w:hAnsi="Calibri Light" w:asciiTheme="majorHAnsi" w:hAnsiTheme="majorHAnsi"/>
+              </w:rPr>
+            </w:pPr>
+            <w:r>
+              <w:rPr>
+                <w:rFonts w:asciiTheme="majorHAnsi" w:hAnsiTheme="majorHAnsi" w:ascii="Calibri Light" w:hAnsi="Calibri Light"/>
               </w:rPr>
             </w:r>
           </w:p>
@@ -2159,19 +2175,16 @@
             <w:pPr>
               <w:pStyle w:val="Normal"/>
               <w:widowControl/>
-              <w:spacing w:before="0" w:after="0"/>
-              <w:ind w:hanging="0"/>
-              <w:rPr>
-                <w:rFonts w:ascii="Calibri Light" w:hAnsi="Calibri Light" w:asciiTheme="majorHAnsi" w:hAnsiTheme="majorHAnsi"/>
-              </w:rPr>
-            </w:pPr>
-            <w:r>
-              <w:rPr>
-                <w:rFonts w:eastAsia="Calibri" w:cs="" w:ascii="Calibri Light" w:hAnsi="Calibri Light"/>
-                <w:kern w:val="0"/>
-                <w:sz w:val="24"/>
-                <w:szCs w:val="24"/>
-                <w:lang w:val="fr-FR" w:eastAsia="en-US" w:bidi="ar-SA"/>
+              <w:suppressAutoHyphens w:val="true"/>
+              <w:spacing w:before="0" w:after="0"/>
+              <w:ind w:hanging="0"/>
+              <w:rPr>
+                <w:rFonts w:ascii="Calibri Light" w:hAnsi="Calibri Light" w:asciiTheme="majorHAnsi" w:hAnsiTheme="majorHAnsi"/>
+              </w:rPr>
+            </w:pPr>
+            <w:r>
+              <w:rPr>
+                <w:rFonts w:asciiTheme="majorHAnsi" w:hAnsiTheme="majorHAnsi" w:ascii="Calibri Light" w:hAnsi="Calibri Light"/>
               </w:rPr>
             </w:r>
           </w:p>
@@ -2190,6 +2203,7 @@
             <w:pPr>
               <w:pStyle w:val="Normal"/>
               <w:widowControl/>
+              <w:suppressAutoHyphens w:val="true"/>
               <w:spacing w:before="0" w:after="0"/>
               <w:ind w:hanging="0"/>
               <w:rPr>
@@ -2211,6 +2225,7 @@
             <w:pPr>
               <w:pStyle w:val="Normal"/>
               <w:widowControl/>
+              <w:suppressAutoHyphens w:val="true"/>
               <w:spacing w:before="0" w:after="0"/>
               <w:ind w:hanging="0"/>
               <w:rPr>
@@ -2232,6 +2247,7 @@
             <w:pPr>
               <w:pStyle w:val="Normal"/>
               <w:widowControl/>
+              <w:suppressAutoHyphens w:val="true"/>
               <w:spacing w:before="0" w:after="0"/>
               <w:ind w:hanging="0"/>
               <w:rPr>
@@ -2253,6 +2269,7 @@
             <w:pPr>
               <w:pStyle w:val="Normal"/>
               <w:widowControl/>
+              <w:suppressAutoHyphens w:val="true"/>
               <w:spacing w:before="0" w:after="0"/>
               <w:ind w:hanging="0"/>
               <w:rPr>
@@ -2280,20 +2297,18 @@
             <w:pPr>
               <w:pStyle w:val="Normal"/>
               <w:widowControl/>
-              <w:spacing w:before="0" w:after="0"/>
-              <w:ind w:hanging="0"/>
-              <w:rPr>
-                <w:rFonts w:ascii="Calibri Light" w:hAnsi="Calibri Light" w:asciiTheme="majorHAnsi" w:hAnsiTheme="majorHAnsi"/>
-              </w:rPr>
-            </w:pPr>
-            <w:r>
-              <w:rPr>
-                <w:rFonts w:eastAsia="Calibri" w:cs="" w:ascii="Calibri Light" w:hAnsi="Calibri Light"/>
-                <w:kern w:val="0"/>
-                <w:sz w:val="24"/>
-                <w:szCs w:val="24"/>
-                <w:lang w:val="fr-FR" w:eastAsia="en-US" w:bidi="ar-SA"/>
-              </w:rPr>
+              <w:suppressAutoHyphens w:val="true"/>
+              <w:spacing w:before="0" w:after="0"/>
+              <w:ind w:hanging="0"/>
+              <w:rPr>
+                <w:rFonts w:ascii="Calibri Light" w:hAnsi="Calibri Light" w:asciiTheme="majorHAnsi" w:hAnsiTheme="majorHAnsi"/>
+              </w:rPr>
+            </w:pPr>
+            <w:r>
+              <w:rPr>
+                <w:rFonts w:asciiTheme="majorHAnsi" w:hAnsiTheme="majorHAnsi" w:ascii="Calibri Light" w:hAnsi="Calibri Light"/>
+              </w:rPr>
+              <w:t>Donc aujourdhh’ui j’ai peaufinner un ptit peu le design avec la version mobile et j’ai msi en place les equations aléatoire pour les exemples  de la page de modélisation et debut de l’implementation de l’ia maintenant</w:t>
             </w:r>
           </w:p>
         </w:tc>
@@ -2306,19 +2321,16 @@
             <w:pPr>
               <w:pStyle w:val="Normal"/>
               <w:widowControl/>
-              <w:spacing w:before="0" w:after="0"/>
-              <w:ind w:hanging="0"/>
-              <w:rPr>
-                <w:rFonts w:ascii="Calibri Light" w:hAnsi="Calibri Light" w:asciiTheme="majorHAnsi" w:hAnsiTheme="majorHAnsi"/>
-              </w:rPr>
-            </w:pPr>
-            <w:r>
-              <w:rPr>
-                <w:rFonts w:eastAsia="Calibri" w:cs="" w:ascii="Calibri Light" w:hAnsi="Calibri Light"/>
-                <w:kern w:val="0"/>
-                <w:sz w:val="24"/>
-                <w:szCs w:val="24"/>
-                <w:lang w:val="fr-FR" w:eastAsia="en-US" w:bidi="ar-SA"/>
+              <w:suppressAutoHyphens w:val="true"/>
+              <w:spacing w:before="0" w:after="0"/>
+              <w:ind w:hanging="0"/>
+              <w:rPr>
+                <w:rFonts w:ascii="Calibri Light" w:hAnsi="Calibri Light" w:asciiTheme="majorHAnsi" w:hAnsiTheme="majorHAnsi"/>
+              </w:rPr>
+            </w:pPr>
+            <w:r>
+              <w:rPr>
+                <w:rFonts w:asciiTheme="majorHAnsi" w:hAnsiTheme="majorHAnsi" w:ascii="Calibri Light" w:hAnsi="Calibri Light"/>
               </w:rPr>
             </w:r>
           </w:p>
@@ -2337,6 +2349,7 @@
             <w:pPr>
               <w:pStyle w:val="Normal"/>
               <w:widowControl/>
+              <w:suppressAutoHyphens w:val="true"/>
               <w:spacing w:before="0" w:after="0"/>
               <w:ind w:hanging="0"/>
               <w:rPr>
@@ -2358,6 +2371,7 @@
             <w:pPr>
               <w:pStyle w:val="Normal"/>
               <w:widowControl/>
+              <w:suppressAutoHyphens w:val="true"/>
               <w:spacing w:before="0" w:after="0"/>
               <w:ind w:hanging="0"/>
               <w:rPr>
@@ -2379,19 +2393,16 @@
             <w:pPr>
               <w:pStyle w:val="Normal"/>
               <w:widowControl/>
-              <w:spacing w:before="0" w:after="0"/>
-              <w:ind w:hanging="0"/>
-              <w:rPr>
-                <w:rFonts w:ascii="Calibri Light" w:hAnsi="Calibri Light" w:asciiTheme="majorHAnsi" w:hAnsiTheme="majorHAnsi"/>
-              </w:rPr>
-            </w:pPr>
-            <w:r>
-              <w:rPr>
-                <w:rFonts w:eastAsia="Calibri" w:cs="" w:ascii="Calibri Light" w:hAnsi="Calibri Light"/>
-                <w:kern w:val="0"/>
-                <w:sz w:val="24"/>
-                <w:szCs w:val="24"/>
-                <w:lang w:val="fr-FR" w:eastAsia="en-US" w:bidi="ar-SA"/>
+              <w:suppressAutoHyphens w:val="true"/>
+              <w:spacing w:before="0" w:after="0"/>
+              <w:ind w:hanging="0"/>
+              <w:rPr>
+                <w:rFonts w:ascii="Calibri Light" w:hAnsi="Calibri Light" w:asciiTheme="majorHAnsi" w:hAnsiTheme="majorHAnsi"/>
+              </w:rPr>
+            </w:pPr>
+            <w:r>
+              <w:rPr>
+                <w:rFonts w:asciiTheme="majorHAnsi" w:hAnsiTheme="majorHAnsi" w:ascii="Calibri Light" w:hAnsi="Calibri Light"/>
               </w:rPr>
             </w:r>
           </w:p>
@@ -2405,18 +2416,15 @@
             <w:pPr>
               <w:pStyle w:val="Normal"/>
               <w:widowControl/>
-              <w:spacing w:before="0" w:after="0"/>
-              <w:rPr>
-                <w:rFonts w:ascii="Calibri Light" w:hAnsi="Calibri Light" w:asciiTheme="majorHAnsi" w:hAnsiTheme="majorHAnsi"/>
-              </w:rPr>
-            </w:pPr>
-            <w:r>
-              <w:rPr>
-                <w:rFonts w:eastAsia="Calibri" w:cs="" w:ascii="Calibri Light" w:hAnsi="Calibri Light"/>
-                <w:kern w:val="0"/>
-                <w:sz w:val="24"/>
-                <w:szCs w:val="24"/>
-                <w:lang w:val="fr-FR" w:eastAsia="en-US" w:bidi="ar-SA"/>
+              <w:suppressAutoHyphens w:val="true"/>
+              <w:spacing w:before="0" w:after="0"/>
+              <w:rPr>
+                <w:rFonts w:ascii="Calibri Light" w:hAnsi="Calibri Light" w:asciiTheme="majorHAnsi" w:hAnsiTheme="majorHAnsi"/>
+              </w:rPr>
+            </w:pPr>
+            <w:r>
+              <w:rPr>
+                <w:rFonts w:asciiTheme="majorHAnsi" w:hAnsiTheme="majorHAnsi" w:ascii="Calibri Light" w:hAnsi="Calibri Light"/>
               </w:rPr>
             </w:r>
           </w:p>
@@ -2430,19 +2438,16 @@
             <w:pPr>
               <w:pStyle w:val="Normal"/>
               <w:widowControl/>
-              <w:spacing w:before="0" w:after="0"/>
-              <w:ind w:hanging="0"/>
-              <w:rPr>
-                <w:rFonts w:ascii="Calibri Light" w:hAnsi="Calibri Light" w:asciiTheme="majorHAnsi" w:hAnsiTheme="majorHAnsi"/>
-              </w:rPr>
-            </w:pPr>
-            <w:r>
-              <w:rPr>
-                <w:rFonts w:eastAsia="Calibri" w:cs="" w:ascii="Calibri Light" w:hAnsi="Calibri Light"/>
-                <w:kern w:val="0"/>
-                <w:sz w:val="24"/>
-                <w:szCs w:val="24"/>
-                <w:lang w:val="fr-FR" w:eastAsia="en-US" w:bidi="ar-SA"/>
+              <w:suppressAutoHyphens w:val="true"/>
+              <w:spacing w:before="0" w:after="0"/>
+              <w:ind w:hanging="0"/>
+              <w:rPr>
+                <w:rFonts w:ascii="Calibri Light" w:hAnsi="Calibri Light" w:asciiTheme="majorHAnsi" w:hAnsiTheme="majorHAnsi"/>
+              </w:rPr>
+            </w:pPr>
+            <w:r>
+              <w:rPr>
+                <w:rFonts w:asciiTheme="majorHAnsi" w:hAnsiTheme="majorHAnsi" w:ascii="Calibri Light" w:hAnsi="Calibri Light"/>
               </w:rPr>
             </w:r>
           </w:p>
@@ -2461,6 +2466,7 @@
             <w:pPr>
               <w:pStyle w:val="Normal"/>
               <w:widowControl/>
+              <w:suppressAutoHyphens w:val="true"/>
               <w:spacing w:before="0" w:after="0"/>
               <w:ind w:hanging="0"/>
               <w:rPr>
@@ -2482,19 +2488,16 @@
             <w:pPr>
               <w:pStyle w:val="Normal"/>
               <w:widowControl/>
-              <w:spacing w:before="0" w:after="0"/>
-              <w:ind w:hanging="0"/>
-              <w:rPr>
-                <w:rFonts w:ascii="Calibri Light" w:hAnsi="Calibri Light" w:asciiTheme="majorHAnsi" w:hAnsiTheme="majorHAnsi"/>
-              </w:rPr>
-            </w:pPr>
-            <w:r>
-              <w:rPr>
-                <w:rFonts w:eastAsia="Calibri" w:cs="" w:ascii="Calibri Light" w:hAnsi="Calibri Light"/>
-                <w:kern w:val="0"/>
-                <w:sz w:val="24"/>
-                <w:szCs w:val="24"/>
-                <w:lang w:val="fr-FR" w:eastAsia="en-US" w:bidi="ar-SA"/>
+              <w:suppressAutoHyphens w:val="true"/>
+              <w:spacing w:before="0" w:after="0"/>
+              <w:ind w:hanging="0"/>
+              <w:rPr>
+                <w:rFonts w:ascii="Calibri Light" w:hAnsi="Calibri Light" w:asciiTheme="majorHAnsi" w:hAnsiTheme="majorHAnsi"/>
+              </w:rPr>
+            </w:pPr>
+            <w:r>
+              <w:rPr>
+                <w:rFonts w:asciiTheme="majorHAnsi" w:hAnsiTheme="majorHAnsi" w:ascii="Calibri Light" w:hAnsi="Calibri Light"/>
               </w:rPr>
             </w:r>
           </w:p>
@@ -2508,18 +2511,15 @@
             <w:pPr>
               <w:pStyle w:val="Normal"/>
               <w:widowControl/>
-              <w:spacing w:before="0" w:after="0"/>
-              <w:rPr>
-                <w:rFonts w:ascii="Calibri Light" w:hAnsi="Calibri Light" w:asciiTheme="majorHAnsi" w:hAnsiTheme="majorHAnsi"/>
-              </w:rPr>
-            </w:pPr>
-            <w:r>
-              <w:rPr>
-                <w:rFonts w:eastAsia="Calibri" w:cs="" w:ascii="Calibri Light" w:hAnsi="Calibri Light"/>
-                <w:kern w:val="0"/>
-                <w:sz w:val="24"/>
-                <w:szCs w:val="24"/>
-                <w:lang w:val="fr-FR" w:eastAsia="en-US" w:bidi="ar-SA"/>
+              <w:suppressAutoHyphens w:val="true"/>
+              <w:spacing w:before="0" w:after="0"/>
+              <w:rPr>
+                <w:rFonts w:ascii="Calibri Light" w:hAnsi="Calibri Light" w:asciiTheme="majorHAnsi" w:hAnsiTheme="majorHAnsi"/>
+              </w:rPr>
+            </w:pPr>
+            <w:r>
+              <w:rPr>
+                <w:rFonts w:asciiTheme="majorHAnsi" w:hAnsiTheme="majorHAnsi" w:ascii="Calibri Light" w:hAnsi="Calibri Light"/>
               </w:rPr>
             </w:r>
           </w:p>
@@ -2533,19 +2533,16 @@
             <w:pPr>
               <w:pStyle w:val="Normal"/>
               <w:widowControl/>
-              <w:spacing w:before="0" w:after="0"/>
-              <w:ind w:hanging="0"/>
-              <w:rPr>
-                <w:rFonts w:ascii="Calibri Light" w:hAnsi="Calibri Light" w:asciiTheme="majorHAnsi" w:hAnsiTheme="majorHAnsi"/>
-              </w:rPr>
-            </w:pPr>
-            <w:r>
-              <w:rPr>
-                <w:rFonts w:eastAsia="Calibri" w:cs="" w:ascii="Calibri Light" w:hAnsi="Calibri Light"/>
-                <w:kern w:val="0"/>
-                <w:sz w:val="24"/>
-                <w:szCs w:val="24"/>
-                <w:lang w:val="fr-FR" w:eastAsia="en-US" w:bidi="ar-SA"/>
+              <w:suppressAutoHyphens w:val="true"/>
+              <w:spacing w:before="0" w:after="0"/>
+              <w:ind w:hanging="0"/>
+              <w:rPr>
+                <w:rFonts w:ascii="Calibri Light" w:hAnsi="Calibri Light" w:asciiTheme="majorHAnsi" w:hAnsiTheme="majorHAnsi"/>
+              </w:rPr>
+            </w:pPr>
+            <w:r>
+              <w:rPr>
+                <w:rFonts w:asciiTheme="majorHAnsi" w:hAnsiTheme="majorHAnsi" w:ascii="Calibri Light" w:hAnsi="Calibri Light"/>
               </w:rPr>
             </w:r>
           </w:p>
@@ -2564,6 +2561,7 @@
             <w:pPr>
               <w:pStyle w:val="Normal"/>
               <w:widowControl/>
+              <w:suppressAutoHyphens w:val="true"/>
               <w:spacing w:before="0" w:after="0"/>
               <w:ind w:hanging="0"/>
               <w:rPr>
@@ -2585,6 +2583,7 @@
             <w:pPr>
               <w:pStyle w:val="Normal"/>
               <w:widowControl/>
+              <w:suppressAutoHyphens w:val="true"/>
               <w:spacing w:before="0" w:after="0"/>
               <w:ind w:hanging="0"/>
               <w:rPr>
@@ -2612,19 +2611,16 @@
             <w:pPr>
               <w:pStyle w:val="Normal"/>
               <w:widowControl/>
-              <w:spacing w:before="0" w:after="0"/>
-              <w:ind w:hanging="0"/>
-              <w:rPr>
-                <w:rFonts w:ascii="Calibri Light" w:hAnsi="Calibri Light" w:asciiTheme="majorHAnsi" w:hAnsiTheme="majorHAnsi"/>
-              </w:rPr>
-            </w:pPr>
-            <w:r>
-              <w:rPr>
-                <w:rFonts w:eastAsia="Calibri" w:cs="" w:ascii="Calibri Light" w:hAnsi="Calibri Light"/>
-                <w:kern w:val="0"/>
-                <w:sz w:val="24"/>
-                <w:szCs w:val="24"/>
-                <w:lang w:val="fr-FR" w:eastAsia="en-US" w:bidi="ar-SA"/>
+              <w:suppressAutoHyphens w:val="true"/>
+              <w:spacing w:before="0" w:after="0"/>
+              <w:ind w:hanging="0"/>
+              <w:rPr>
+                <w:rFonts w:ascii="Calibri Light" w:hAnsi="Calibri Light" w:asciiTheme="majorHAnsi" w:hAnsiTheme="majorHAnsi"/>
+              </w:rPr>
+            </w:pPr>
+            <w:r>
+              <w:rPr>
+                <w:rFonts w:asciiTheme="majorHAnsi" w:hAnsiTheme="majorHAnsi" w:ascii="Calibri Light" w:hAnsi="Calibri Light"/>
               </w:rPr>
             </w:r>
           </w:p>
@@ -2638,19 +2634,16 @@
             <w:pPr>
               <w:pStyle w:val="Normal"/>
               <w:widowControl/>
-              <w:spacing w:before="0" w:after="0"/>
-              <w:ind w:hanging="0"/>
-              <w:rPr>
-                <w:rFonts w:ascii="Calibri Light" w:hAnsi="Calibri Light" w:asciiTheme="majorHAnsi" w:hAnsiTheme="majorHAnsi"/>
-              </w:rPr>
-            </w:pPr>
-            <w:r>
-              <w:rPr>
-                <w:rFonts w:eastAsia="Calibri" w:cs="" w:ascii="Calibri Light" w:hAnsi="Calibri Light"/>
-                <w:kern w:val="0"/>
-                <w:sz w:val="24"/>
-                <w:szCs w:val="24"/>
-                <w:lang w:val="fr-FR" w:eastAsia="en-US" w:bidi="ar-SA"/>
+              <w:suppressAutoHyphens w:val="true"/>
+              <w:spacing w:before="0" w:after="0"/>
+              <w:ind w:hanging="0"/>
+              <w:rPr>
+                <w:rFonts w:ascii="Calibri Light" w:hAnsi="Calibri Light" w:asciiTheme="majorHAnsi" w:hAnsiTheme="majorHAnsi"/>
+              </w:rPr>
+            </w:pPr>
+            <w:r>
+              <w:rPr>
+                <w:rFonts w:asciiTheme="majorHAnsi" w:hAnsiTheme="majorHAnsi" w:ascii="Calibri Light" w:hAnsi="Calibri Light"/>
               </w:rPr>
             </w:r>
           </w:p>
@@ -2703,6 +2696,7 @@
             <w:pPr>
               <w:pStyle w:val="Normal"/>
               <w:widowControl/>
+              <w:suppressAutoHyphens w:val="true"/>
               <w:spacing w:before="0" w:after="0"/>
               <w:ind w:hanging="0"/>
               <w:rPr>
@@ -2732,6 +2726,7 @@
             <w:pPr>
               <w:pStyle w:val="Normal"/>
               <w:widowControl/>
+              <w:suppressAutoHyphens w:val="true"/>
               <w:spacing w:before="0" w:after="0"/>
               <w:ind w:hanging="0"/>
               <w:rPr>
@@ -2761,6 +2756,7 @@
             <w:pPr>
               <w:pStyle w:val="Normal"/>
               <w:widowControl/>
+              <w:suppressAutoHyphens w:val="true"/>
               <w:spacing w:before="0" w:after="0"/>
               <w:ind w:hanging="0"/>
               <w:rPr>
@@ -2770,12 +2766,8 @@
             </w:pPr>
             <w:r>
               <w:rPr>
-                <w:rFonts w:eastAsia="Calibri" w:cs="" w:ascii="Calibri Light" w:hAnsi="Calibri Light"/>
+                <w:rFonts w:asciiTheme="majorHAnsi" w:hAnsiTheme="majorHAnsi" w:ascii="Calibri Light" w:hAnsi="Calibri Light"/>
                 <w:b/>
-                <w:kern w:val="0"/>
-                <w:sz w:val="24"/>
-                <w:szCs w:val="24"/>
-                <w:lang w:val="fr-FR" w:eastAsia="en-US" w:bidi="ar-SA"/>
               </w:rPr>
             </w:r>
           </w:p>
@@ -2794,6 +2786,7 @@
             <w:pPr>
               <w:pStyle w:val="Normal"/>
               <w:widowControl/>
+              <w:suppressAutoHyphens w:val="true"/>
               <w:spacing w:before="0" w:after="0"/>
               <w:ind w:hanging="0"/>
               <w:rPr>
@@ -2815,6 +2808,7 @@
             <w:pPr>
               <w:pStyle w:val="Normal"/>
               <w:widowControl/>
+              <w:suppressAutoHyphens w:val="true"/>
               <w:spacing w:before="0" w:after="0"/>
               <w:ind w:hanging="0"/>
               <w:rPr>
@@ -2842,19 +2836,16 @@
             <w:pPr>
               <w:pStyle w:val="Normal"/>
               <w:widowControl/>
-              <w:spacing w:before="0" w:after="0"/>
-              <w:ind w:hanging="0"/>
-              <w:rPr>
-                <w:rFonts w:ascii="Calibri Light" w:hAnsi="Calibri Light" w:asciiTheme="majorHAnsi" w:hAnsiTheme="majorHAnsi"/>
-              </w:rPr>
-            </w:pPr>
-            <w:r>
-              <w:rPr>
-                <w:rFonts w:eastAsia="Calibri" w:cs="" w:ascii="Calibri Light" w:hAnsi="Calibri Light"/>
-                <w:kern w:val="0"/>
-                <w:sz w:val="24"/>
-                <w:szCs w:val="24"/>
-                <w:lang w:val="fr-FR" w:eastAsia="en-US" w:bidi="ar-SA"/>
+              <w:suppressAutoHyphens w:val="true"/>
+              <w:spacing w:before="0" w:after="0"/>
+              <w:ind w:hanging="0"/>
+              <w:rPr>
+                <w:rFonts w:ascii="Calibri Light" w:hAnsi="Calibri Light" w:asciiTheme="majorHAnsi" w:hAnsiTheme="majorHAnsi"/>
+              </w:rPr>
+            </w:pPr>
+            <w:r>
+              <w:rPr>
+                <w:rFonts w:asciiTheme="majorHAnsi" w:hAnsiTheme="majorHAnsi" w:ascii="Calibri Light" w:hAnsi="Calibri Light"/>
               </w:rPr>
             </w:r>
           </w:p>
@@ -2868,19 +2859,16 @@
             <w:pPr>
               <w:pStyle w:val="Normal"/>
               <w:widowControl/>
-              <w:spacing w:before="0" w:after="0"/>
-              <w:ind w:hanging="0"/>
-              <w:rPr>
-                <w:rFonts w:ascii="Calibri Light" w:hAnsi="Calibri Light" w:asciiTheme="majorHAnsi" w:hAnsiTheme="majorHAnsi"/>
-              </w:rPr>
-            </w:pPr>
-            <w:r>
-              <w:rPr>
-                <w:rFonts w:eastAsia="Calibri" w:cs="" w:ascii="Calibri Light" w:hAnsi="Calibri Light"/>
-                <w:kern w:val="0"/>
-                <w:sz w:val="24"/>
-                <w:szCs w:val="24"/>
-                <w:lang w:val="fr-FR" w:eastAsia="en-US" w:bidi="ar-SA"/>
+              <w:suppressAutoHyphens w:val="true"/>
+              <w:spacing w:before="0" w:after="0"/>
+              <w:ind w:hanging="0"/>
+              <w:rPr>
+                <w:rFonts w:ascii="Calibri Light" w:hAnsi="Calibri Light" w:asciiTheme="majorHAnsi" w:hAnsiTheme="majorHAnsi"/>
+              </w:rPr>
+            </w:pPr>
+            <w:r>
+              <w:rPr>
+                <w:rFonts w:asciiTheme="majorHAnsi" w:hAnsiTheme="majorHAnsi" w:ascii="Calibri Light" w:hAnsi="Calibri Light"/>
               </w:rPr>
             </w:r>
           </w:p>
@@ -2897,6 +2885,7 @@
             <w:pPr>
               <w:pStyle w:val="Normal"/>
               <w:widowControl/>
+              <w:suppressAutoHyphens w:val="true"/>
               <w:spacing w:before="0" w:after="0"/>
               <w:ind w:hanging="0"/>
               <w:rPr>
@@ -2924,19 +2913,16 @@
             <w:pPr>
               <w:pStyle w:val="Normal"/>
               <w:widowControl/>
-              <w:spacing w:before="0" w:after="0"/>
-              <w:ind w:hanging="0"/>
-              <w:rPr>
-                <w:rFonts w:ascii="Calibri Light" w:hAnsi="Calibri Light" w:asciiTheme="majorHAnsi" w:hAnsiTheme="majorHAnsi"/>
-              </w:rPr>
-            </w:pPr>
-            <w:r>
-              <w:rPr>
-                <w:rFonts w:eastAsia="Calibri" w:cs="" w:ascii="Calibri Light" w:hAnsi="Calibri Light"/>
-                <w:kern w:val="0"/>
-                <w:sz w:val="24"/>
-                <w:szCs w:val="24"/>
-                <w:lang w:val="fr-FR" w:eastAsia="en-US" w:bidi="ar-SA"/>
+              <w:suppressAutoHyphens w:val="true"/>
+              <w:spacing w:before="0" w:after="0"/>
+              <w:ind w:hanging="0"/>
+              <w:rPr>
+                <w:rFonts w:ascii="Calibri Light" w:hAnsi="Calibri Light" w:asciiTheme="majorHAnsi" w:hAnsiTheme="majorHAnsi"/>
+              </w:rPr>
+            </w:pPr>
+            <w:r>
+              <w:rPr>
+                <w:rFonts w:asciiTheme="majorHAnsi" w:hAnsiTheme="majorHAnsi" w:ascii="Calibri Light" w:hAnsi="Calibri Light"/>
               </w:rPr>
             </w:r>
           </w:p>
@@ -2950,19 +2936,16 @@
             <w:pPr>
               <w:pStyle w:val="Normal"/>
               <w:widowControl/>
-              <w:spacing w:before="0" w:after="0"/>
-              <w:ind w:hanging="0"/>
-              <w:rPr>
-                <w:rFonts w:ascii="Calibri Light" w:hAnsi="Calibri Light" w:asciiTheme="majorHAnsi" w:hAnsiTheme="majorHAnsi"/>
-              </w:rPr>
-            </w:pPr>
-            <w:r>
-              <w:rPr>
-                <w:rFonts w:eastAsia="Calibri" w:cs="" w:ascii="Calibri Light" w:hAnsi="Calibri Light"/>
-                <w:kern w:val="0"/>
-                <w:sz w:val="24"/>
-                <w:szCs w:val="24"/>
-                <w:lang w:val="fr-FR" w:eastAsia="en-US" w:bidi="ar-SA"/>
+              <w:suppressAutoHyphens w:val="true"/>
+              <w:spacing w:before="0" w:after="0"/>
+              <w:ind w:hanging="0"/>
+              <w:rPr>
+                <w:rFonts w:ascii="Calibri Light" w:hAnsi="Calibri Light" w:asciiTheme="majorHAnsi" w:hAnsiTheme="majorHAnsi"/>
+              </w:rPr>
+            </w:pPr>
+            <w:r>
+              <w:rPr>
+                <w:rFonts w:asciiTheme="majorHAnsi" w:hAnsiTheme="majorHAnsi" w:ascii="Calibri Light" w:hAnsi="Calibri Light"/>
               </w:rPr>
             </w:r>
           </w:p>
@@ -2981,6 +2964,7 @@
             <w:pPr>
               <w:pStyle w:val="Normal"/>
               <w:widowControl/>
+              <w:suppressAutoHyphens w:val="true"/>
               <w:spacing w:before="0" w:after="0"/>
               <w:ind w:hanging="0"/>
               <w:rPr>
@@ -3002,6 +2986,7 @@
             <w:pPr>
               <w:pStyle w:val="Normal"/>
               <w:widowControl/>
+              <w:suppressAutoHyphens w:val="true"/>
               <w:spacing w:before="0" w:after="0"/>
               <w:ind w:hanging="0"/>
               <w:rPr>
@@ -3023,6 +3008,7 @@
             <w:pPr>
               <w:pStyle w:val="Normal"/>
               <w:widowControl/>
+              <w:suppressAutoHyphens w:val="true"/>
               <w:spacing w:before="0" w:after="0"/>
               <w:ind w:hanging="0"/>
               <w:rPr>
@@ -3044,6 +3030,7 @@
             <w:pPr>
               <w:pStyle w:val="Normal"/>
               <w:widowControl/>
+              <w:suppressAutoHyphens w:val="true"/>
               <w:spacing w:before="0" w:after="0"/>
               <w:ind w:hanging="0"/>
               <w:rPr>
@@ -3071,19 +3058,16 @@
             <w:pPr>
               <w:pStyle w:val="Normal"/>
               <w:widowControl/>
-              <w:spacing w:before="0" w:after="0"/>
-              <w:ind w:hanging="0"/>
-              <w:rPr>
-                <w:rFonts w:ascii="Calibri Light" w:hAnsi="Calibri Light" w:asciiTheme="majorHAnsi" w:hAnsiTheme="majorHAnsi"/>
-              </w:rPr>
-            </w:pPr>
-            <w:r>
-              <w:rPr>
-                <w:rFonts w:eastAsia="Calibri" w:cs="" w:ascii="Calibri Light" w:hAnsi="Calibri Light"/>
-                <w:kern w:val="0"/>
-                <w:sz w:val="24"/>
-                <w:szCs w:val="24"/>
-                <w:lang w:val="fr-FR" w:eastAsia="en-US" w:bidi="ar-SA"/>
+              <w:suppressAutoHyphens w:val="true"/>
+              <w:spacing w:before="0" w:after="0"/>
+              <w:ind w:hanging="0"/>
+              <w:rPr>
+                <w:rFonts w:ascii="Calibri Light" w:hAnsi="Calibri Light" w:asciiTheme="majorHAnsi" w:hAnsiTheme="majorHAnsi"/>
+              </w:rPr>
+            </w:pPr>
+            <w:r>
+              <w:rPr>
+                <w:rFonts w:asciiTheme="majorHAnsi" w:hAnsiTheme="majorHAnsi" w:ascii="Calibri Light" w:hAnsi="Calibri Light"/>
               </w:rPr>
             </w:r>
           </w:p>
@@ -3097,19 +3081,16 @@
             <w:pPr>
               <w:pStyle w:val="Normal"/>
               <w:widowControl/>
-              <w:spacing w:before="0" w:after="0"/>
-              <w:ind w:hanging="0"/>
-              <w:rPr>
-                <w:rFonts w:ascii="Calibri Light" w:hAnsi="Calibri Light" w:asciiTheme="majorHAnsi" w:hAnsiTheme="majorHAnsi"/>
-              </w:rPr>
-            </w:pPr>
-            <w:r>
-              <w:rPr>
-                <w:rFonts w:eastAsia="Calibri" w:cs="" w:ascii="Calibri Light" w:hAnsi="Calibri Light"/>
-                <w:kern w:val="0"/>
-                <w:sz w:val="24"/>
-                <w:szCs w:val="24"/>
-                <w:lang w:val="fr-FR" w:eastAsia="en-US" w:bidi="ar-SA"/>
+              <w:suppressAutoHyphens w:val="true"/>
+              <w:spacing w:before="0" w:after="0"/>
+              <w:ind w:hanging="0"/>
+              <w:rPr>
+                <w:rFonts w:ascii="Calibri Light" w:hAnsi="Calibri Light" w:asciiTheme="majorHAnsi" w:hAnsiTheme="majorHAnsi"/>
+              </w:rPr>
+            </w:pPr>
+            <w:r>
+              <w:rPr>
+                <w:rFonts w:asciiTheme="majorHAnsi" w:hAnsiTheme="majorHAnsi" w:ascii="Calibri Light" w:hAnsi="Calibri Light"/>
               </w:rPr>
             </w:r>
           </w:p>
@@ -3128,6 +3109,7 @@
             <w:pPr>
               <w:pStyle w:val="Normal"/>
               <w:widowControl/>
+              <w:suppressAutoHyphens w:val="true"/>
               <w:spacing w:before="0" w:after="0"/>
               <w:ind w:hanging="0"/>
               <w:rPr>
@@ -3149,6 +3131,7 @@
             <w:pPr>
               <w:pStyle w:val="Normal"/>
               <w:widowControl/>
+              <w:suppressAutoHyphens w:val="true"/>
               <w:spacing w:before="0" w:after="0"/>
               <w:ind w:hanging="0"/>
               <w:rPr>
@@ -3170,19 +3153,16 @@
             <w:pPr>
               <w:pStyle w:val="Normal"/>
               <w:widowControl/>
-              <w:spacing w:before="0" w:after="0"/>
-              <w:ind w:hanging="0"/>
-              <w:rPr>
-                <w:rFonts w:ascii="Calibri Light" w:hAnsi="Calibri Light" w:asciiTheme="majorHAnsi" w:hAnsiTheme="majorHAnsi"/>
-              </w:rPr>
-            </w:pPr>
-            <w:r>
-              <w:rPr>
-                <w:rFonts w:eastAsia="Calibri" w:cs="" w:ascii="Calibri Light" w:hAnsi="Calibri Light"/>
-                <w:kern w:val="0"/>
-                <w:sz w:val="24"/>
-                <w:szCs w:val="24"/>
-                <w:lang w:val="fr-FR" w:eastAsia="en-US" w:bidi="ar-SA"/>
+              <w:suppressAutoHyphens w:val="true"/>
+              <w:spacing w:before="0" w:after="0"/>
+              <w:ind w:hanging="0"/>
+              <w:rPr>
+                <w:rFonts w:ascii="Calibri Light" w:hAnsi="Calibri Light" w:asciiTheme="majorHAnsi" w:hAnsiTheme="majorHAnsi"/>
+              </w:rPr>
+            </w:pPr>
+            <w:r>
+              <w:rPr>
+                <w:rFonts w:asciiTheme="majorHAnsi" w:hAnsiTheme="majorHAnsi" w:ascii="Calibri Light" w:hAnsi="Calibri Light"/>
               </w:rPr>
             </w:r>
           </w:p>
@@ -3196,18 +3176,15 @@
             <w:pPr>
               <w:pStyle w:val="Normal"/>
               <w:widowControl/>
-              <w:spacing w:before="0" w:after="0"/>
-              <w:rPr>
-                <w:rFonts w:ascii="Calibri Light" w:hAnsi="Calibri Light" w:asciiTheme="majorHAnsi" w:hAnsiTheme="majorHAnsi"/>
-              </w:rPr>
-            </w:pPr>
-            <w:r>
-              <w:rPr>
-                <w:rFonts w:eastAsia="Calibri" w:cs="" w:ascii="Calibri Light" w:hAnsi="Calibri Light"/>
-                <w:kern w:val="0"/>
-                <w:sz w:val="24"/>
-                <w:szCs w:val="24"/>
-                <w:lang w:val="fr-FR" w:eastAsia="en-US" w:bidi="ar-SA"/>
+              <w:suppressAutoHyphens w:val="true"/>
+              <w:spacing w:before="0" w:after="0"/>
+              <w:rPr>
+                <w:rFonts w:ascii="Calibri Light" w:hAnsi="Calibri Light" w:asciiTheme="majorHAnsi" w:hAnsiTheme="majorHAnsi"/>
+              </w:rPr>
+            </w:pPr>
+            <w:r>
+              <w:rPr>
+                <w:rFonts w:asciiTheme="majorHAnsi" w:hAnsiTheme="majorHAnsi" w:ascii="Calibri Light" w:hAnsi="Calibri Light"/>
               </w:rPr>
             </w:r>
           </w:p>
@@ -3221,19 +3198,16 @@
             <w:pPr>
               <w:pStyle w:val="Normal"/>
               <w:widowControl/>
-              <w:spacing w:before="0" w:after="0"/>
-              <w:ind w:hanging="0"/>
-              <w:rPr>
-                <w:rFonts w:ascii="Calibri Light" w:hAnsi="Calibri Light" w:asciiTheme="majorHAnsi" w:hAnsiTheme="majorHAnsi"/>
-              </w:rPr>
-            </w:pPr>
-            <w:r>
-              <w:rPr>
-                <w:rFonts w:eastAsia="Calibri" w:cs="" w:ascii="Calibri Light" w:hAnsi="Calibri Light"/>
-                <w:kern w:val="0"/>
-                <w:sz w:val="24"/>
-                <w:szCs w:val="24"/>
-                <w:lang w:val="fr-FR" w:eastAsia="en-US" w:bidi="ar-SA"/>
+              <w:suppressAutoHyphens w:val="true"/>
+              <w:spacing w:before="0" w:after="0"/>
+              <w:ind w:hanging="0"/>
+              <w:rPr>
+                <w:rFonts w:ascii="Calibri Light" w:hAnsi="Calibri Light" w:asciiTheme="majorHAnsi" w:hAnsiTheme="majorHAnsi"/>
+              </w:rPr>
+            </w:pPr>
+            <w:r>
+              <w:rPr>
+                <w:rFonts w:asciiTheme="majorHAnsi" w:hAnsiTheme="majorHAnsi" w:ascii="Calibri Light" w:hAnsi="Calibri Light"/>
               </w:rPr>
             </w:r>
           </w:p>
@@ -3252,6 +3226,7 @@
             <w:pPr>
               <w:pStyle w:val="Normal"/>
               <w:widowControl/>
+              <w:suppressAutoHyphens w:val="true"/>
               <w:spacing w:before="0" w:after="0"/>
               <w:ind w:hanging="0"/>
               <w:rPr>
@@ -3273,19 +3248,16 @@
             <w:pPr>
               <w:pStyle w:val="Normal"/>
               <w:widowControl/>
-              <w:spacing w:before="0" w:after="0"/>
-              <w:ind w:hanging="0"/>
-              <w:rPr>
-                <w:rFonts w:ascii="Calibri Light" w:hAnsi="Calibri Light" w:asciiTheme="majorHAnsi" w:hAnsiTheme="majorHAnsi"/>
-              </w:rPr>
-            </w:pPr>
-            <w:r>
-              <w:rPr>
-                <w:rFonts w:eastAsia="Calibri" w:cs="" w:ascii="Calibri Light" w:hAnsi="Calibri Light"/>
-                <w:kern w:val="0"/>
-                <w:sz w:val="24"/>
-                <w:szCs w:val="24"/>
-                <w:lang w:val="fr-FR" w:eastAsia="en-US" w:bidi="ar-SA"/>
+              <w:suppressAutoHyphens w:val="true"/>
+              <w:spacing w:before="0" w:after="0"/>
+              <w:ind w:hanging="0"/>
+              <w:rPr>
+                <w:rFonts w:ascii="Calibri Light" w:hAnsi="Calibri Light" w:asciiTheme="majorHAnsi" w:hAnsiTheme="majorHAnsi"/>
+              </w:rPr>
+            </w:pPr>
+            <w:r>
+              <w:rPr>
+                <w:rFonts w:asciiTheme="majorHAnsi" w:hAnsiTheme="majorHAnsi" w:ascii="Calibri Light" w:hAnsi="Calibri Light"/>
               </w:rPr>
             </w:r>
           </w:p>
@@ -3299,18 +3271,15 @@
             <w:pPr>
               <w:pStyle w:val="Normal"/>
               <w:widowControl/>
-              <w:spacing w:before="0" w:after="0"/>
-              <w:rPr>
-                <w:rFonts w:ascii="Calibri Light" w:hAnsi="Calibri Light" w:asciiTheme="majorHAnsi" w:hAnsiTheme="majorHAnsi"/>
-              </w:rPr>
-            </w:pPr>
-            <w:r>
-              <w:rPr>
-                <w:rFonts w:eastAsia="Calibri" w:cs="" w:ascii="Calibri Light" w:hAnsi="Calibri Light"/>
-                <w:kern w:val="0"/>
-                <w:sz w:val="24"/>
-                <w:szCs w:val="24"/>
-                <w:lang w:val="fr-FR" w:eastAsia="en-US" w:bidi="ar-SA"/>
+              <w:suppressAutoHyphens w:val="true"/>
+              <w:spacing w:before="0" w:after="0"/>
+              <w:rPr>
+                <w:rFonts w:ascii="Calibri Light" w:hAnsi="Calibri Light" w:asciiTheme="majorHAnsi" w:hAnsiTheme="majorHAnsi"/>
+              </w:rPr>
+            </w:pPr>
+            <w:r>
+              <w:rPr>
+                <w:rFonts w:asciiTheme="majorHAnsi" w:hAnsiTheme="majorHAnsi" w:ascii="Calibri Light" w:hAnsi="Calibri Light"/>
               </w:rPr>
             </w:r>
           </w:p>
@@ -3324,19 +3293,16 @@
             <w:pPr>
               <w:pStyle w:val="Normal"/>
               <w:widowControl/>
-              <w:spacing w:before="0" w:after="0"/>
-              <w:ind w:hanging="0"/>
-              <w:rPr>
-                <w:rFonts w:ascii="Calibri Light" w:hAnsi="Calibri Light" w:asciiTheme="majorHAnsi" w:hAnsiTheme="majorHAnsi"/>
-              </w:rPr>
-            </w:pPr>
-            <w:r>
-              <w:rPr>
-                <w:rFonts w:eastAsia="Calibri" w:cs="" w:ascii="Calibri Light" w:hAnsi="Calibri Light"/>
-                <w:kern w:val="0"/>
-                <w:sz w:val="24"/>
-                <w:szCs w:val="24"/>
-                <w:lang w:val="fr-FR" w:eastAsia="en-US" w:bidi="ar-SA"/>
+              <w:suppressAutoHyphens w:val="true"/>
+              <w:spacing w:before="0" w:after="0"/>
+              <w:ind w:hanging="0"/>
+              <w:rPr>
+                <w:rFonts w:ascii="Calibri Light" w:hAnsi="Calibri Light" w:asciiTheme="majorHAnsi" w:hAnsiTheme="majorHAnsi"/>
+              </w:rPr>
+            </w:pPr>
+            <w:r>
+              <w:rPr>
+                <w:rFonts w:asciiTheme="majorHAnsi" w:hAnsiTheme="majorHAnsi" w:ascii="Calibri Light" w:hAnsi="Calibri Light"/>
               </w:rPr>
             </w:r>
           </w:p>
@@ -3355,6 +3321,7 @@
             <w:pPr>
               <w:pStyle w:val="Normal"/>
               <w:widowControl/>
+              <w:suppressAutoHyphens w:val="true"/>
               <w:spacing w:before="0" w:after="0"/>
               <w:ind w:hanging="0"/>
               <w:rPr>
@@ -3376,6 +3343,7 @@
             <w:pPr>
               <w:pStyle w:val="Normal"/>
               <w:widowControl/>
+              <w:suppressAutoHyphens w:val="true"/>
               <w:spacing w:before="0" w:after="0"/>
               <w:ind w:hanging="0"/>
               <w:rPr>
@@ -3403,19 +3371,16 @@
             <w:pPr>
               <w:pStyle w:val="Normal"/>
               <w:widowControl/>
-              <w:spacing w:before="0" w:after="0"/>
-              <w:ind w:hanging="0"/>
-              <w:rPr>
-                <w:rFonts w:ascii="Calibri Light" w:hAnsi="Calibri Light" w:asciiTheme="majorHAnsi" w:hAnsiTheme="majorHAnsi"/>
-              </w:rPr>
-            </w:pPr>
-            <w:r>
-              <w:rPr>
-                <w:rFonts w:eastAsia="Calibri" w:cs="" w:ascii="Calibri Light" w:hAnsi="Calibri Light"/>
-                <w:kern w:val="0"/>
-                <w:sz w:val="24"/>
-                <w:szCs w:val="24"/>
-                <w:lang w:val="fr-FR" w:eastAsia="en-US" w:bidi="ar-SA"/>
+              <w:suppressAutoHyphens w:val="true"/>
+              <w:spacing w:before="0" w:after="0"/>
+              <w:ind w:hanging="0"/>
+              <w:rPr>
+                <w:rFonts w:ascii="Calibri Light" w:hAnsi="Calibri Light" w:asciiTheme="majorHAnsi" w:hAnsiTheme="majorHAnsi"/>
+              </w:rPr>
+            </w:pPr>
+            <w:r>
+              <w:rPr>
+                <w:rFonts w:asciiTheme="majorHAnsi" w:hAnsiTheme="majorHAnsi" w:ascii="Calibri Light" w:hAnsi="Calibri Light"/>
               </w:rPr>
             </w:r>
           </w:p>
@@ -3429,19 +3394,16 @@
             <w:pPr>
               <w:pStyle w:val="Normal"/>
               <w:widowControl/>
-              <w:spacing w:before="0" w:after="0"/>
-              <w:ind w:hanging="0"/>
-              <w:rPr>
-                <w:rFonts w:ascii="Calibri Light" w:hAnsi="Calibri Light" w:asciiTheme="majorHAnsi" w:hAnsiTheme="majorHAnsi"/>
-              </w:rPr>
-            </w:pPr>
-            <w:r>
-              <w:rPr>
-                <w:rFonts w:eastAsia="Calibri" w:cs="" w:ascii="Calibri Light" w:hAnsi="Calibri Light"/>
-                <w:kern w:val="0"/>
-                <w:sz w:val="24"/>
-                <w:szCs w:val="24"/>
-                <w:lang w:val="fr-FR" w:eastAsia="en-US" w:bidi="ar-SA"/>
+              <w:suppressAutoHyphens w:val="true"/>
+              <w:spacing w:before="0" w:after="0"/>
+              <w:ind w:hanging="0"/>
+              <w:rPr>
+                <w:rFonts w:ascii="Calibri Light" w:hAnsi="Calibri Light" w:asciiTheme="majorHAnsi" w:hAnsiTheme="majorHAnsi"/>
+              </w:rPr>
+            </w:pPr>
+            <w:r>
+              <w:rPr>
+                <w:rFonts w:asciiTheme="majorHAnsi" w:hAnsiTheme="majorHAnsi" w:ascii="Calibri Light" w:hAnsi="Calibri Light"/>
               </w:rPr>
             </w:r>
           </w:p>
@@ -3494,6 +3456,7 @@
             <w:pPr>
               <w:pStyle w:val="Normal"/>
               <w:widowControl/>
+              <w:suppressAutoHyphens w:val="true"/>
               <w:spacing w:before="0" w:after="0"/>
               <w:ind w:hanging="0"/>
               <w:rPr>
@@ -3523,6 +3486,7 @@
             <w:pPr>
               <w:pStyle w:val="Normal"/>
               <w:widowControl/>
+              <w:suppressAutoHyphens w:val="true"/>
               <w:spacing w:before="0" w:after="0"/>
               <w:ind w:hanging="0"/>
               <w:rPr>
@@ -3552,6 +3516,7 @@
             <w:pPr>
               <w:pStyle w:val="Normal"/>
               <w:widowControl/>
+              <w:suppressAutoHyphens w:val="true"/>
               <w:spacing w:before="0" w:after="0"/>
               <w:ind w:hanging="0"/>
               <w:rPr>
@@ -3561,12 +3526,8 @@
             </w:pPr>
             <w:r>
               <w:rPr>
-                <w:rFonts w:eastAsia="Calibri" w:cs="" w:ascii="Calibri Light" w:hAnsi="Calibri Light"/>
+                <w:rFonts w:asciiTheme="majorHAnsi" w:hAnsiTheme="majorHAnsi" w:ascii="Calibri Light" w:hAnsi="Calibri Light"/>
                 <w:b/>
-                <w:kern w:val="0"/>
-                <w:sz w:val="24"/>
-                <w:szCs w:val="24"/>
-                <w:lang w:val="fr-FR" w:eastAsia="en-US" w:bidi="ar-SA"/>
               </w:rPr>
             </w:r>
           </w:p>
@@ -3585,6 +3546,7 @@
             <w:pPr>
               <w:pStyle w:val="Normal"/>
               <w:widowControl/>
+              <w:suppressAutoHyphens w:val="true"/>
               <w:spacing w:before="0" w:after="0"/>
               <w:ind w:hanging="0"/>
               <w:rPr>
@@ -3606,6 +3568,7 @@
             <w:pPr>
               <w:pStyle w:val="Normal"/>
               <w:widowControl/>
+              <w:suppressAutoHyphens w:val="true"/>
               <w:spacing w:before="0" w:after="0"/>
               <w:ind w:hanging="0"/>
               <w:rPr>
@@ -3633,19 +3596,16 @@
             <w:pPr>
               <w:pStyle w:val="Normal"/>
               <w:widowControl/>
-              <w:spacing w:before="0" w:after="0"/>
-              <w:ind w:hanging="0"/>
-              <w:rPr>
-                <w:rFonts w:ascii="Calibri Light" w:hAnsi="Calibri Light" w:asciiTheme="majorHAnsi" w:hAnsiTheme="majorHAnsi"/>
-              </w:rPr>
-            </w:pPr>
-            <w:r>
-              <w:rPr>
-                <w:rFonts w:eastAsia="Calibri" w:cs="" w:ascii="Calibri Light" w:hAnsi="Calibri Light"/>
-                <w:kern w:val="0"/>
-                <w:sz w:val="24"/>
-                <w:szCs w:val="24"/>
-                <w:lang w:val="fr-FR" w:eastAsia="en-US" w:bidi="ar-SA"/>
+              <w:suppressAutoHyphens w:val="true"/>
+              <w:spacing w:before="0" w:after="0"/>
+              <w:ind w:hanging="0"/>
+              <w:rPr>
+                <w:rFonts w:ascii="Calibri Light" w:hAnsi="Calibri Light" w:asciiTheme="majorHAnsi" w:hAnsiTheme="majorHAnsi"/>
+              </w:rPr>
+            </w:pPr>
+            <w:r>
+              <w:rPr>
+                <w:rFonts w:asciiTheme="majorHAnsi" w:hAnsiTheme="majorHAnsi" w:ascii="Calibri Light" w:hAnsi="Calibri Light"/>
               </w:rPr>
             </w:r>
           </w:p>
@@ -3659,19 +3619,16 @@
             <w:pPr>
               <w:pStyle w:val="Normal"/>
               <w:widowControl/>
-              <w:spacing w:before="0" w:after="0"/>
-              <w:ind w:hanging="0"/>
-              <w:rPr>
-                <w:rFonts w:ascii="Calibri Light" w:hAnsi="Calibri Light" w:asciiTheme="majorHAnsi" w:hAnsiTheme="majorHAnsi"/>
-              </w:rPr>
-            </w:pPr>
-            <w:r>
-              <w:rPr>
-                <w:rFonts w:eastAsia="Calibri" w:cs="" w:ascii="Calibri Light" w:hAnsi="Calibri Light"/>
-                <w:kern w:val="0"/>
-                <w:sz w:val="24"/>
-                <w:szCs w:val="24"/>
-                <w:lang w:val="fr-FR" w:eastAsia="en-US" w:bidi="ar-SA"/>
+              <w:suppressAutoHyphens w:val="true"/>
+              <w:spacing w:before="0" w:after="0"/>
+              <w:ind w:hanging="0"/>
+              <w:rPr>
+                <w:rFonts w:ascii="Calibri Light" w:hAnsi="Calibri Light" w:asciiTheme="majorHAnsi" w:hAnsiTheme="majorHAnsi"/>
+              </w:rPr>
+            </w:pPr>
+            <w:r>
+              <w:rPr>
+                <w:rFonts w:asciiTheme="majorHAnsi" w:hAnsiTheme="majorHAnsi" w:ascii="Calibri Light" w:hAnsi="Calibri Light"/>
               </w:rPr>
             </w:r>
           </w:p>
@@ -3688,6 +3645,7 @@
             <w:pPr>
               <w:pStyle w:val="Normal"/>
               <w:widowControl/>
+              <w:suppressAutoHyphens w:val="true"/>
               <w:spacing w:before="0" w:after="0"/>
               <w:ind w:hanging="0"/>
               <w:rPr>
@@ -3715,19 +3673,16 @@
             <w:pPr>
               <w:pStyle w:val="Normal"/>
               <w:widowControl/>
-              <w:spacing w:before="0" w:after="0"/>
-              <w:ind w:hanging="0"/>
-              <w:rPr>
-                <w:rFonts w:ascii="Calibri Light" w:hAnsi="Calibri Light" w:asciiTheme="majorHAnsi" w:hAnsiTheme="majorHAnsi"/>
-              </w:rPr>
-            </w:pPr>
-            <w:r>
-              <w:rPr>
-                <w:rFonts w:eastAsia="Calibri" w:cs="" w:ascii="Calibri Light" w:hAnsi="Calibri Light"/>
-                <w:kern w:val="0"/>
-                <w:sz w:val="24"/>
-                <w:szCs w:val="24"/>
-                <w:lang w:val="fr-FR" w:eastAsia="en-US" w:bidi="ar-SA"/>
+              <w:suppressAutoHyphens w:val="true"/>
+              <w:spacing w:before="0" w:after="0"/>
+              <w:ind w:hanging="0"/>
+              <w:rPr>
+                <w:rFonts w:ascii="Calibri Light" w:hAnsi="Calibri Light" w:asciiTheme="majorHAnsi" w:hAnsiTheme="majorHAnsi"/>
+              </w:rPr>
+            </w:pPr>
+            <w:r>
+              <w:rPr>
+                <w:rFonts w:asciiTheme="majorHAnsi" w:hAnsiTheme="majorHAnsi" w:ascii="Calibri Light" w:hAnsi="Calibri Light"/>
               </w:rPr>
             </w:r>
           </w:p>
@@ -3741,19 +3696,16 @@
             <w:pPr>
               <w:pStyle w:val="Normal"/>
               <w:widowControl/>
-              <w:spacing w:before="0" w:after="0"/>
-              <w:ind w:hanging="0"/>
-              <w:rPr>
-                <w:rFonts w:ascii="Calibri Light" w:hAnsi="Calibri Light" w:asciiTheme="majorHAnsi" w:hAnsiTheme="majorHAnsi"/>
-              </w:rPr>
-            </w:pPr>
-            <w:r>
-              <w:rPr>
-                <w:rFonts w:eastAsia="Calibri" w:cs="" w:ascii="Calibri Light" w:hAnsi="Calibri Light"/>
-                <w:kern w:val="0"/>
-                <w:sz w:val="24"/>
-                <w:szCs w:val="24"/>
-                <w:lang w:val="fr-FR" w:eastAsia="en-US" w:bidi="ar-SA"/>
+              <w:suppressAutoHyphens w:val="true"/>
+              <w:spacing w:before="0" w:after="0"/>
+              <w:ind w:hanging="0"/>
+              <w:rPr>
+                <w:rFonts w:ascii="Calibri Light" w:hAnsi="Calibri Light" w:asciiTheme="majorHAnsi" w:hAnsiTheme="majorHAnsi"/>
+              </w:rPr>
+            </w:pPr>
+            <w:r>
+              <w:rPr>
+                <w:rFonts w:asciiTheme="majorHAnsi" w:hAnsiTheme="majorHAnsi" w:ascii="Calibri Light" w:hAnsi="Calibri Light"/>
               </w:rPr>
             </w:r>
           </w:p>
@@ -3772,6 +3724,7 @@
             <w:pPr>
               <w:pStyle w:val="Normal"/>
               <w:widowControl/>
+              <w:suppressAutoHyphens w:val="true"/>
               <w:spacing w:before="0" w:after="0"/>
               <w:ind w:hanging="0"/>
               <w:rPr>
@@ -3793,6 +3746,7 @@
             <w:pPr>
               <w:pStyle w:val="Normal"/>
               <w:widowControl/>
+              <w:suppressAutoHyphens w:val="true"/>
               <w:spacing w:before="0" w:after="0"/>
               <w:ind w:hanging="0"/>
               <w:rPr>
@@ -3814,6 +3768,7 @@
             <w:pPr>
               <w:pStyle w:val="Normal"/>
               <w:widowControl/>
+              <w:suppressAutoHyphens w:val="true"/>
               <w:spacing w:before="0" w:after="0"/>
               <w:ind w:hanging="0"/>
               <w:rPr>
@@ -3835,6 +3790,7 @@
             <w:pPr>
               <w:pStyle w:val="Normal"/>
               <w:widowControl/>
+              <w:suppressAutoHyphens w:val="true"/>
               <w:spacing w:before="0" w:after="0"/>
               <w:ind w:hanging="0"/>
               <w:rPr>
@@ -3862,19 +3818,16 @@
             <w:pPr>
               <w:pStyle w:val="Normal"/>
               <w:widowControl/>
-              <w:spacing w:before="0" w:after="0"/>
-              <w:ind w:hanging="0"/>
-              <w:rPr>
-                <w:rFonts w:ascii="Calibri Light" w:hAnsi="Calibri Light" w:asciiTheme="majorHAnsi" w:hAnsiTheme="majorHAnsi"/>
-              </w:rPr>
-            </w:pPr>
-            <w:r>
-              <w:rPr>
-                <w:rFonts w:eastAsia="Calibri" w:cs="" w:ascii="Calibri Light" w:hAnsi="Calibri Light"/>
-                <w:kern w:val="0"/>
-                <w:sz w:val="24"/>
-                <w:szCs w:val="24"/>
-                <w:lang w:val="fr-FR" w:eastAsia="en-US" w:bidi="ar-SA"/>
+              <w:suppressAutoHyphens w:val="true"/>
+              <w:spacing w:before="0" w:after="0"/>
+              <w:ind w:hanging="0"/>
+              <w:rPr>
+                <w:rFonts w:ascii="Calibri Light" w:hAnsi="Calibri Light" w:asciiTheme="majorHAnsi" w:hAnsiTheme="majorHAnsi"/>
+              </w:rPr>
+            </w:pPr>
+            <w:r>
+              <w:rPr>
+                <w:rFonts w:asciiTheme="majorHAnsi" w:hAnsiTheme="majorHAnsi" w:ascii="Calibri Light" w:hAnsi="Calibri Light"/>
               </w:rPr>
             </w:r>
           </w:p>
@@ -3888,19 +3841,16 @@
             <w:pPr>
               <w:pStyle w:val="Normal"/>
               <w:widowControl/>
-              <w:spacing w:before="0" w:after="0"/>
-              <w:ind w:hanging="0"/>
-              <w:rPr>
-                <w:rFonts w:ascii="Calibri Light" w:hAnsi="Calibri Light" w:asciiTheme="majorHAnsi" w:hAnsiTheme="majorHAnsi"/>
-              </w:rPr>
-            </w:pPr>
-            <w:r>
-              <w:rPr>
-                <w:rFonts w:eastAsia="Calibri" w:cs="" w:ascii="Calibri Light" w:hAnsi="Calibri Light"/>
-                <w:kern w:val="0"/>
-                <w:sz w:val="24"/>
-                <w:szCs w:val="24"/>
-                <w:lang w:val="fr-FR" w:eastAsia="en-US" w:bidi="ar-SA"/>
+              <w:suppressAutoHyphens w:val="true"/>
+              <w:spacing w:before="0" w:after="0"/>
+              <w:ind w:hanging="0"/>
+              <w:rPr>
+                <w:rFonts w:ascii="Calibri Light" w:hAnsi="Calibri Light" w:asciiTheme="majorHAnsi" w:hAnsiTheme="majorHAnsi"/>
+              </w:rPr>
+            </w:pPr>
+            <w:r>
+              <w:rPr>
+                <w:rFonts w:asciiTheme="majorHAnsi" w:hAnsiTheme="majorHAnsi" w:ascii="Calibri Light" w:hAnsi="Calibri Light"/>
               </w:rPr>
             </w:r>
           </w:p>
@@ -3919,6 +3869,7 @@
             <w:pPr>
               <w:pStyle w:val="Normal"/>
               <w:widowControl/>
+              <w:suppressAutoHyphens w:val="true"/>
               <w:spacing w:before="0" w:after="0"/>
               <w:ind w:hanging="0"/>
               <w:rPr>
@@ -3940,6 +3891,7 @@
             <w:pPr>
               <w:pStyle w:val="Normal"/>
               <w:widowControl/>
+              <w:suppressAutoHyphens w:val="true"/>
               <w:spacing w:before="0" w:after="0"/>
               <w:ind w:hanging="0"/>
               <w:rPr>
@@ -3961,19 +3913,16 @@
             <w:pPr>
               <w:pStyle w:val="Normal"/>
               <w:widowControl/>
-              <w:spacing w:before="0" w:after="0"/>
-              <w:ind w:hanging="0"/>
-              <w:rPr>
-                <w:rFonts w:ascii="Calibri Light" w:hAnsi="Calibri Light" w:asciiTheme="majorHAnsi" w:hAnsiTheme="majorHAnsi"/>
-              </w:rPr>
-            </w:pPr>
-            <w:r>
-              <w:rPr>
-                <w:rFonts w:eastAsia="Calibri" w:cs="" w:ascii="Calibri Light" w:hAnsi="Calibri Light"/>
-                <w:kern w:val="0"/>
-                <w:sz w:val="24"/>
-                <w:szCs w:val="24"/>
-                <w:lang w:val="fr-FR" w:eastAsia="en-US" w:bidi="ar-SA"/>
+              <w:suppressAutoHyphens w:val="true"/>
+              <w:spacing w:before="0" w:after="0"/>
+              <w:ind w:hanging="0"/>
+              <w:rPr>
+                <w:rFonts w:ascii="Calibri Light" w:hAnsi="Calibri Light" w:asciiTheme="majorHAnsi" w:hAnsiTheme="majorHAnsi"/>
+              </w:rPr>
+            </w:pPr>
+            <w:r>
+              <w:rPr>
+                <w:rFonts w:asciiTheme="majorHAnsi" w:hAnsiTheme="majorHAnsi" w:ascii="Calibri Light" w:hAnsi="Calibri Light"/>
               </w:rPr>
             </w:r>
           </w:p>
@@ -3987,18 +3936,15 @@
             <w:pPr>
               <w:pStyle w:val="Normal"/>
               <w:widowControl/>
-              <w:spacing w:before="0" w:after="0"/>
-              <w:rPr>
-                <w:rFonts w:ascii="Calibri Light" w:hAnsi="Calibri Light" w:asciiTheme="majorHAnsi" w:hAnsiTheme="majorHAnsi"/>
-              </w:rPr>
-            </w:pPr>
-            <w:r>
-              <w:rPr>
-                <w:rFonts w:eastAsia="Calibri" w:cs="" w:ascii="Calibri Light" w:hAnsi="Calibri Light"/>
-                <w:kern w:val="0"/>
-                <w:sz w:val="24"/>
-                <w:szCs w:val="24"/>
-                <w:lang w:val="fr-FR" w:eastAsia="en-US" w:bidi="ar-SA"/>
+              <w:suppressAutoHyphens w:val="true"/>
+              <w:spacing w:before="0" w:after="0"/>
+              <w:rPr>
+                <w:rFonts w:ascii="Calibri Light" w:hAnsi="Calibri Light" w:asciiTheme="majorHAnsi" w:hAnsiTheme="majorHAnsi"/>
+              </w:rPr>
+            </w:pPr>
+            <w:r>
+              <w:rPr>
+                <w:rFonts w:asciiTheme="majorHAnsi" w:hAnsiTheme="majorHAnsi" w:ascii="Calibri Light" w:hAnsi="Calibri Light"/>
               </w:rPr>
             </w:r>
           </w:p>
@@ -4012,19 +3958,16 @@
             <w:pPr>
               <w:pStyle w:val="Normal"/>
               <w:widowControl/>
-              <w:spacing w:before="0" w:after="0"/>
-              <w:ind w:hanging="0"/>
-              <w:rPr>
-                <w:rFonts w:ascii="Calibri Light" w:hAnsi="Calibri Light" w:asciiTheme="majorHAnsi" w:hAnsiTheme="majorHAnsi"/>
-              </w:rPr>
-            </w:pPr>
-            <w:r>
-              <w:rPr>
-                <w:rFonts w:eastAsia="Calibri" w:cs="" w:ascii="Calibri Light" w:hAnsi="Calibri Light"/>
-                <w:kern w:val="0"/>
-                <w:sz w:val="24"/>
-                <w:szCs w:val="24"/>
-                <w:lang w:val="fr-FR" w:eastAsia="en-US" w:bidi="ar-SA"/>
+              <w:suppressAutoHyphens w:val="true"/>
+              <w:spacing w:before="0" w:after="0"/>
+              <w:ind w:hanging="0"/>
+              <w:rPr>
+                <w:rFonts w:ascii="Calibri Light" w:hAnsi="Calibri Light" w:asciiTheme="majorHAnsi" w:hAnsiTheme="majorHAnsi"/>
+              </w:rPr>
+            </w:pPr>
+            <w:r>
+              <w:rPr>
+                <w:rFonts w:asciiTheme="majorHAnsi" w:hAnsiTheme="majorHAnsi" w:ascii="Calibri Light" w:hAnsi="Calibri Light"/>
               </w:rPr>
             </w:r>
           </w:p>
@@ -4043,6 +3986,7 @@
             <w:pPr>
               <w:pStyle w:val="Normal"/>
               <w:widowControl/>
+              <w:suppressAutoHyphens w:val="true"/>
               <w:spacing w:before="0" w:after="0"/>
               <w:ind w:hanging="0"/>
               <w:rPr>
@@ -4064,19 +4008,16 @@
             <w:pPr>
               <w:pStyle w:val="Normal"/>
               <w:widowControl/>
-              <w:spacing w:before="0" w:after="0"/>
-              <w:ind w:hanging="0"/>
-              <w:rPr>
-                <w:rFonts w:ascii="Calibri Light" w:hAnsi="Calibri Light" w:asciiTheme="majorHAnsi" w:hAnsiTheme="majorHAnsi"/>
-              </w:rPr>
-            </w:pPr>
-            <w:r>
-              <w:rPr>
-                <w:rFonts w:eastAsia="Calibri" w:cs="" w:ascii="Calibri Light" w:hAnsi="Calibri Light"/>
-                <w:kern w:val="0"/>
-                <w:sz w:val="24"/>
-                <w:szCs w:val="24"/>
-                <w:lang w:val="fr-FR" w:eastAsia="en-US" w:bidi="ar-SA"/>
+              <w:suppressAutoHyphens w:val="true"/>
+              <w:spacing w:before="0" w:after="0"/>
+              <w:ind w:hanging="0"/>
+              <w:rPr>
+                <w:rFonts w:ascii="Calibri Light" w:hAnsi="Calibri Light" w:asciiTheme="majorHAnsi" w:hAnsiTheme="majorHAnsi"/>
+              </w:rPr>
+            </w:pPr>
+            <w:r>
+              <w:rPr>
+                <w:rFonts w:asciiTheme="majorHAnsi" w:hAnsiTheme="majorHAnsi" w:ascii="Calibri Light" w:hAnsi="Calibri Light"/>
               </w:rPr>
             </w:r>
           </w:p>
@@ -4090,18 +4031,15 @@
             <w:pPr>
               <w:pStyle w:val="Normal"/>
               <w:widowControl/>
-              <w:spacing w:before="0" w:after="0"/>
-              <w:rPr>
-                <w:rFonts w:ascii="Calibri Light" w:hAnsi="Calibri Light" w:asciiTheme="majorHAnsi" w:hAnsiTheme="majorHAnsi"/>
-              </w:rPr>
-            </w:pPr>
-            <w:r>
-              <w:rPr>
-                <w:rFonts w:eastAsia="Calibri" w:cs="" w:ascii="Calibri Light" w:hAnsi="Calibri Light"/>
-                <w:kern w:val="0"/>
-                <w:sz w:val="24"/>
-                <w:szCs w:val="24"/>
-                <w:lang w:val="fr-FR" w:eastAsia="en-US" w:bidi="ar-SA"/>
+              <w:suppressAutoHyphens w:val="true"/>
+              <w:spacing w:before="0" w:after="0"/>
+              <w:rPr>
+                <w:rFonts w:ascii="Calibri Light" w:hAnsi="Calibri Light" w:asciiTheme="majorHAnsi" w:hAnsiTheme="majorHAnsi"/>
+              </w:rPr>
+            </w:pPr>
+            <w:r>
+              <w:rPr>
+                <w:rFonts w:asciiTheme="majorHAnsi" w:hAnsiTheme="majorHAnsi" w:ascii="Calibri Light" w:hAnsi="Calibri Light"/>
               </w:rPr>
             </w:r>
           </w:p>
@@ -4115,19 +4053,16 @@
             <w:pPr>
               <w:pStyle w:val="Normal"/>
               <w:widowControl/>
-              <w:spacing w:before="0" w:after="0"/>
-              <w:ind w:hanging="0"/>
-              <w:rPr>
-                <w:rFonts w:ascii="Calibri Light" w:hAnsi="Calibri Light" w:asciiTheme="majorHAnsi" w:hAnsiTheme="majorHAnsi"/>
-              </w:rPr>
-            </w:pPr>
-            <w:r>
-              <w:rPr>
-                <w:rFonts w:eastAsia="Calibri" w:cs="" w:ascii="Calibri Light" w:hAnsi="Calibri Light"/>
-                <w:kern w:val="0"/>
-                <w:sz w:val="24"/>
-                <w:szCs w:val="24"/>
-                <w:lang w:val="fr-FR" w:eastAsia="en-US" w:bidi="ar-SA"/>
+              <w:suppressAutoHyphens w:val="true"/>
+              <w:spacing w:before="0" w:after="0"/>
+              <w:ind w:hanging="0"/>
+              <w:rPr>
+                <w:rFonts w:ascii="Calibri Light" w:hAnsi="Calibri Light" w:asciiTheme="majorHAnsi" w:hAnsiTheme="majorHAnsi"/>
+              </w:rPr>
+            </w:pPr>
+            <w:r>
+              <w:rPr>
+                <w:rFonts w:asciiTheme="majorHAnsi" w:hAnsiTheme="majorHAnsi" w:ascii="Calibri Light" w:hAnsi="Calibri Light"/>
               </w:rPr>
             </w:r>
           </w:p>
@@ -4146,6 +4081,7 @@
             <w:pPr>
               <w:pStyle w:val="Normal"/>
               <w:widowControl/>
+              <w:suppressAutoHyphens w:val="true"/>
               <w:spacing w:before="0" w:after="0"/>
               <w:ind w:hanging="0"/>
               <w:rPr>
@@ -4167,6 +4103,7 @@
             <w:pPr>
               <w:pStyle w:val="Normal"/>
               <w:widowControl/>
+              <w:suppressAutoHyphens w:val="true"/>
               <w:spacing w:before="0" w:after="0"/>
               <w:ind w:hanging="0"/>
               <w:rPr>
@@ -4194,19 +4131,16 @@
             <w:pPr>
               <w:pStyle w:val="Normal"/>
               <w:widowControl/>
-              <w:spacing w:before="0" w:after="0"/>
-              <w:ind w:hanging="0"/>
-              <w:rPr>
-                <w:rFonts w:ascii="Calibri Light" w:hAnsi="Calibri Light" w:asciiTheme="majorHAnsi" w:hAnsiTheme="majorHAnsi"/>
-              </w:rPr>
-            </w:pPr>
-            <w:r>
-              <w:rPr>
-                <w:rFonts w:eastAsia="Calibri" w:cs="" w:ascii="Calibri Light" w:hAnsi="Calibri Light"/>
-                <w:kern w:val="0"/>
-                <w:sz w:val="24"/>
-                <w:szCs w:val="24"/>
-                <w:lang w:val="fr-FR" w:eastAsia="en-US" w:bidi="ar-SA"/>
+              <w:suppressAutoHyphens w:val="true"/>
+              <w:spacing w:before="0" w:after="0"/>
+              <w:ind w:hanging="0"/>
+              <w:rPr>
+                <w:rFonts w:ascii="Calibri Light" w:hAnsi="Calibri Light" w:asciiTheme="majorHAnsi" w:hAnsiTheme="majorHAnsi"/>
+              </w:rPr>
+            </w:pPr>
+            <w:r>
+              <w:rPr>
+                <w:rFonts w:asciiTheme="majorHAnsi" w:hAnsiTheme="majorHAnsi" w:ascii="Calibri Light" w:hAnsi="Calibri Light"/>
               </w:rPr>
             </w:r>
           </w:p>
@@ -4220,19 +4154,16 @@
             <w:pPr>
               <w:pStyle w:val="Normal"/>
               <w:widowControl/>
-              <w:spacing w:before="0" w:after="0"/>
-              <w:ind w:hanging="0"/>
-              <w:rPr>
-                <w:rFonts w:ascii="Calibri Light" w:hAnsi="Calibri Light" w:asciiTheme="majorHAnsi" w:hAnsiTheme="majorHAnsi"/>
-              </w:rPr>
-            </w:pPr>
-            <w:r>
-              <w:rPr>
-                <w:rFonts w:eastAsia="Calibri" w:cs="" w:ascii="Calibri Light" w:hAnsi="Calibri Light"/>
-                <w:kern w:val="0"/>
-                <w:sz w:val="24"/>
-                <w:szCs w:val="24"/>
-                <w:lang w:val="fr-FR" w:eastAsia="en-US" w:bidi="ar-SA"/>
+              <w:suppressAutoHyphens w:val="true"/>
+              <w:spacing w:before="0" w:after="0"/>
+              <w:ind w:hanging="0"/>
+              <w:rPr>
+                <w:rFonts w:ascii="Calibri Light" w:hAnsi="Calibri Light" w:asciiTheme="majorHAnsi" w:hAnsiTheme="majorHAnsi"/>
+              </w:rPr>
+            </w:pPr>
+            <w:r>
+              <w:rPr>
+                <w:rFonts w:asciiTheme="majorHAnsi" w:hAnsiTheme="majorHAnsi" w:ascii="Calibri Light" w:hAnsi="Calibri Light"/>
               </w:rPr>
             </w:r>
           </w:p>
@@ -4285,6 +4216,7 @@
             <w:pPr>
               <w:pStyle w:val="Normal"/>
               <w:widowControl/>
+              <w:suppressAutoHyphens w:val="true"/>
               <w:spacing w:before="0" w:after="0"/>
               <w:ind w:hanging="0"/>
               <w:rPr>
@@ -4314,6 +4246,7 @@
             <w:pPr>
               <w:pStyle w:val="Normal"/>
               <w:widowControl/>
+              <w:suppressAutoHyphens w:val="true"/>
               <w:spacing w:before="0" w:after="0"/>
               <w:ind w:hanging="0"/>
               <w:rPr>
@@ -4343,6 +4276,7 @@
             <w:pPr>
               <w:pStyle w:val="Normal"/>
               <w:widowControl/>
+              <w:suppressAutoHyphens w:val="true"/>
               <w:spacing w:before="0" w:after="0"/>
               <w:ind w:hanging="0"/>
               <w:rPr>
@@ -4352,12 +4286,8 @@
             </w:pPr>
             <w:r>
               <w:rPr>
-                <w:rFonts w:eastAsia="Calibri" w:cs="" w:ascii="Calibri Light" w:hAnsi="Calibri Light"/>
+                <w:rFonts w:asciiTheme="majorHAnsi" w:hAnsiTheme="majorHAnsi" w:ascii="Calibri Light" w:hAnsi="Calibri Light"/>
                 <w:b/>
-                <w:kern w:val="0"/>
-                <w:sz w:val="24"/>
-                <w:szCs w:val="24"/>
-                <w:lang w:val="fr-FR" w:eastAsia="en-US" w:bidi="ar-SA"/>
               </w:rPr>
             </w:r>
           </w:p>
@@ -4376,6 +4306,7 @@
             <w:pPr>
               <w:pStyle w:val="Normal"/>
               <w:widowControl/>
+              <w:suppressAutoHyphens w:val="true"/>
               <w:spacing w:before="0" w:after="0"/>
               <w:ind w:hanging="0"/>
               <w:rPr>
@@ -4397,6 +4328,7 @@
             <w:pPr>
               <w:pStyle w:val="Normal"/>
               <w:widowControl/>
+              <w:suppressAutoHyphens w:val="true"/>
               <w:spacing w:before="0" w:after="0"/>
               <w:ind w:hanging="0"/>
               <w:rPr>
@@ -4424,19 +4356,16 @@
             <w:pPr>
               <w:pStyle w:val="Normal"/>
               <w:widowControl/>
-              <w:spacing w:before="0" w:after="0"/>
-              <w:ind w:hanging="0"/>
-              <w:rPr>
-                <w:rFonts w:ascii="Calibri Light" w:hAnsi="Calibri Light" w:asciiTheme="majorHAnsi" w:hAnsiTheme="majorHAnsi"/>
-              </w:rPr>
-            </w:pPr>
-            <w:r>
-              <w:rPr>
-                <w:rFonts w:eastAsia="Calibri" w:cs="" w:ascii="Calibri Light" w:hAnsi="Calibri Light"/>
-                <w:kern w:val="0"/>
-                <w:sz w:val="24"/>
-                <w:szCs w:val="24"/>
-                <w:lang w:val="fr-FR" w:eastAsia="en-US" w:bidi="ar-SA"/>
+              <w:suppressAutoHyphens w:val="true"/>
+              <w:spacing w:before="0" w:after="0"/>
+              <w:ind w:hanging="0"/>
+              <w:rPr>
+                <w:rFonts w:ascii="Calibri Light" w:hAnsi="Calibri Light" w:asciiTheme="majorHAnsi" w:hAnsiTheme="majorHAnsi"/>
+              </w:rPr>
+            </w:pPr>
+            <w:r>
+              <w:rPr>
+                <w:rFonts w:asciiTheme="majorHAnsi" w:hAnsiTheme="majorHAnsi" w:ascii="Calibri Light" w:hAnsi="Calibri Light"/>
               </w:rPr>
             </w:r>
           </w:p>
@@ -4450,19 +4379,16 @@
             <w:pPr>
               <w:pStyle w:val="Normal"/>
               <w:widowControl/>
-              <w:spacing w:before="0" w:after="0"/>
-              <w:ind w:hanging="0"/>
-              <w:rPr>
-                <w:rFonts w:ascii="Calibri Light" w:hAnsi="Calibri Light" w:asciiTheme="majorHAnsi" w:hAnsiTheme="majorHAnsi"/>
-              </w:rPr>
-            </w:pPr>
-            <w:r>
-              <w:rPr>
-                <w:rFonts w:eastAsia="Calibri" w:cs="" w:ascii="Calibri Light" w:hAnsi="Calibri Light"/>
-                <w:kern w:val="0"/>
-                <w:sz w:val="24"/>
-                <w:szCs w:val="24"/>
-                <w:lang w:val="fr-FR" w:eastAsia="en-US" w:bidi="ar-SA"/>
+              <w:suppressAutoHyphens w:val="true"/>
+              <w:spacing w:before="0" w:after="0"/>
+              <w:ind w:hanging="0"/>
+              <w:rPr>
+                <w:rFonts w:ascii="Calibri Light" w:hAnsi="Calibri Light" w:asciiTheme="majorHAnsi" w:hAnsiTheme="majorHAnsi"/>
+              </w:rPr>
+            </w:pPr>
+            <w:r>
+              <w:rPr>
+                <w:rFonts w:asciiTheme="majorHAnsi" w:hAnsiTheme="majorHAnsi" w:ascii="Calibri Light" w:hAnsi="Calibri Light"/>
               </w:rPr>
             </w:r>
           </w:p>
@@ -4479,6 +4405,7 @@
             <w:pPr>
               <w:pStyle w:val="Normal"/>
               <w:widowControl/>
+              <w:suppressAutoHyphens w:val="true"/>
               <w:spacing w:before="0" w:after="0"/>
               <w:ind w:hanging="0"/>
               <w:rPr>
@@ -4506,19 +4433,16 @@
             <w:pPr>
               <w:pStyle w:val="Normal"/>
               <w:widowControl/>
-              <w:spacing w:before="0" w:after="0"/>
-              <w:ind w:hanging="0"/>
-              <w:rPr>
-                <w:rFonts w:ascii="Calibri Light" w:hAnsi="Calibri Light" w:asciiTheme="majorHAnsi" w:hAnsiTheme="majorHAnsi"/>
-              </w:rPr>
-            </w:pPr>
-            <w:r>
-              <w:rPr>
-                <w:rFonts w:eastAsia="Calibri" w:cs="" w:ascii="Calibri Light" w:hAnsi="Calibri Light"/>
-                <w:kern w:val="0"/>
-                <w:sz w:val="24"/>
-                <w:szCs w:val="24"/>
-                <w:lang w:val="fr-FR" w:eastAsia="en-US" w:bidi="ar-SA"/>
+              <w:suppressAutoHyphens w:val="true"/>
+              <w:spacing w:before="0" w:after="0"/>
+              <w:ind w:hanging="0"/>
+              <w:rPr>
+                <w:rFonts w:ascii="Calibri Light" w:hAnsi="Calibri Light" w:asciiTheme="majorHAnsi" w:hAnsiTheme="majorHAnsi"/>
+              </w:rPr>
+            </w:pPr>
+            <w:r>
+              <w:rPr>
+                <w:rFonts w:asciiTheme="majorHAnsi" w:hAnsiTheme="majorHAnsi" w:ascii="Calibri Light" w:hAnsi="Calibri Light"/>
               </w:rPr>
             </w:r>
           </w:p>
@@ -4532,19 +4456,16 @@
             <w:pPr>
               <w:pStyle w:val="Normal"/>
               <w:widowControl/>
-              <w:spacing w:before="0" w:after="0"/>
-              <w:ind w:hanging="0"/>
-              <w:rPr>
-                <w:rFonts w:ascii="Calibri Light" w:hAnsi="Calibri Light" w:asciiTheme="majorHAnsi" w:hAnsiTheme="majorHAnsi"/>
-              </w:rPr>
-            </w:pPr>
-            <w:r>
-              <w:rPr>
-                <w:rFonts w:eastAsia="Calibri" w:cs="" w:ascii="Calibri Light" w:hAnsi="Calibri Light"/>
-                <w:kern w:val="0"/>
-                <w:sz w:val="24"/>
-                <w:szCs w:val="24"/>
-                <w:lang w:val="fr-FR" w:eastAsia="en-US" w:bidi="ar-SA"/>
+              <w:suppressAutoHyphens w:val="true"/>
+              <w:spacing w:before="0" w:after="0"/>
+              <w:ind w:hanging="0"/>
+              <w:rPr>
+                <w:rFonts w:ascii="Calibri Light" w:hAnsi="Calibri Light" w:asciiTheme="majorHAnsi" w:hAnsiTheme="majorHAnsi"/>
+              </w:rPr>
+            </w:pPr>
+            <w:r>
+              <w:rPr>
+                <w:rFonts w:asciiTheme="majorHAnsi" w:hAnsiTheme="majorHAnsi" w:ascii="Calibri Light" w:hAnsi="Calibri Light"/>
               </w:rPr>
             </w:r>
           </w:p>
@@ -4563,6 +4484,7 @@
             <w:pPr>
               <w:pStyle w:val="Normal"/>
               <w:widowControl/>
+              <w:suppressAutoHyphens w:val="true"/>
               <w:spacing w:before="0" w:after="0"/>
               <w:ind w:hanging="0"/>
               <w:rPr>
@@ -4584,6 +4506,7 @@
             <w:pPr>
               <w:pStyle w:val="Normal"/>
               <w:widowControl/>
+              <w:suppressAutoHyphens w:val="true"/>
               <w:spacing w:before="0" w:after="0"/>
               <w:ind w:hanging="0"/>
               <w:rPr>
@@ -4605,6 +4528,7 @@
             <w:pPr>
               <w:pStyle w:val="Normal"/>
               <w:widowControl/>
+              <w:suppressAutoHyphens w:val="true"/>
               <w:spacing w:before="0" w:after="0"/>
               <w:ind w:hanging="0"/>
               <w:rPr>
@@ -4626,6 +4550,7 @@
             <w:pPr>
               <w:pStyle w:val="Normal"/>
               <w:widowControl/>
+              <w:suppressAutoHyphens w:val="true"/>
               <w:spacing w:before="0" w:after="0"/>
               <w:ind w:hanging="0"/>
               <w:rPr>
@@ -4653,19 +4578,16 @@
             <w:pPr>
               <w:pStyle w:val="Normal"/>
               <w:widowControl/>
-              <w:spacing w:before="0" w:after="0"/>
-              <w:ind w:hanging="0"/>
-              <w:rPr>
-                <w:rFonts w:ascii="Calibri Light" w:hAnsi="Calibri Light" w:asciiTheme="majorHAnsi" w:hAnsiTheme="majorHAnsi"/>
-              </w:rPr>
-            </w:pPr>
-            <w:r>
-              <w:rPr>
-                <w:rFonts w:eastAsia="Calibri" w:cs="" w:ascii="Calibri Light" w:hAnsi="Calibri Light"/>
-                <w:kern w:val="0"/>
-                <w:sz w:val="24"/>
-                <w:szCs w:val="24"/>
-                <w:lang w:val="fr-FR" w:eastAsia="en-US" w:bidi="ar-SA"/>
+              <w:suppressAutoHyphens w:val="true"/>
+              <w:spacing w:before="0" w:after="0"/>
+              <w:ind w:hanging="0"/>
+              <w:rPr>
+                <w:rFonts w:ascii="Calibri Light" w:hAnsi="Calibri Light" w:asciiTheme="majorHAnsi" w:hAnsiTheme="majorHAnsi"/>
+              </w:rPr>
+            </w:pPr>
+            <w:r>
+              <w:rPr>
+                <w:rFonts w:asciiTheme="majorHAnsi" w:hAnsiTheme="majorHAnsi" w:ascii="Calibri Light" w:hAnsi="Calibri Light"/>
               </w:rPr>
             </w:r>
           </w:p>
@@ -4679,19 +4601,16 @@
             <w:pPr>
               <w:pStyle w:val="Normal"/>
               <w:widowControl/>
-              <w:spacing w:before="0" w:after="0"/>
-              <w:ind w:hanging="0"/>
-              <w:rPr>
-                <w:rFonts w:ascii="Calibri Light" w:hAnsi="Calibri Light" w:asciiTheme="majorHAnsi" w:hAnsiTheme="majorHAnsi"/>
-              </w:rPr>
-            </w:pPr>
-            <w:r>
-              <w:rPr>
-                <w:rFonts w:eastAsia="Calibri" w:cs="" w:ascii="Calibri Light" w:hAnsi="Calibri Light"/>
-                <w:kern w:val="0"/>
-                <w:sz w:val="24"/>
-                <w:szCs w:val="24"/>
-                <w:lang w:val="fr-FR" w:eastAsia="en-US" w:bidi="ar-SA"/>
+              <w:suppressAutoHyphens w:val="true"/>
+              <w:spacing w:before="0" w:after="0"/>
+              <w:ind w:hanging="0"/>
+              <w:rPr>
+                <w:rFonts w:ascii="Calibri Light" w:hAnsi="Calibri Light" w:asciiTheme="majorHAnsi" w:hAnsiTheme="majorHAnsi"/>
+              </w:rPr>
+            </w:pPr>
+            <w:r>
+              <w:rPr>
+                <w:rFonts w:asciiTheme="majorHAnsi" w:hAnsiTheme="majorHAnsi" w:ascii="Calibri Light" w:hAnsi="Calibri Light"/>
               </w:rPr>
             </w:r>
           </w:p>
@@ -4710,6 +4629,7 @@
             <w:pPr>
               <w:pStyle w:val="Normal"/>
               <w:widowControl/>
+              <w:suppressAutoHyphens w:val="true"/>
               <w:spacing w:before="0" w:after="0"/>
               <w:ind w:hanging="0"/>
               <w:rPr>
@@ -4731,6 +4651,7 @@
             <w:pPr>
               <w:pStyle w:val="Normal"/>
               <w:widowControl/>
+              <w:suppressAutoHyphens w:val="true"/>
               <w:spacing w:before="0" w:after="0"/>
               <w:ind w:hanging="0"/>
               <w:rPr>
@@ -4752,19 +4673,16 @@
             <w:pPr>
               <w:pStyle w:val="Normal"/>
               <w:widowControl/>
-              <w:spacing w:before="0" w:after="0"/>
-              <w:ind w:hanging="0"/>
-              <w:rPr>
-                <w:rFonts w:ascii="Calibri Light" w:hAnsi="Calibri Light" w:asciiTheme="majorHAnsi" w:hAnsiTheme="majorHAnsi"/>
-              </w:rPr>
-            </w:pPr>
-            <w:r>
-              <w:rPr>
-                <w:rFonts w:eastAsia="Calibri" w:cs="" w:ascii="Calibri Light" w:hAnsi="Calibri Light"/>
-                <w:kern w:val="0"/>
-                <w:sz w:val="24"/>
-                <w:szCs w:val="24"/>
-                <w:lang w:val="fr-FR" w:eastAsia="en-US" w:bidi="ar-SA"/>
+              <w:suppressAutoHyphens w:val="true"/>
+              <w:spacing w:before="0" w:after="0"/>
+              <w:ind w:hanging="0"/>
+              <w:rPr>
+                <w:rFonts w:ascii="Calibri Light" w:hAnsi="Calibri Light" w:asciiTheme="majorHAnsi" w:hAnsiTheme="majorHAnsi"/>
+              </w:rPr>
+            </w:pPr>
+            <w:r>
+              <w:rPr>
+                <w:rFonts w:asciiTheme="majorHAnsi" w:hAnsiTheme="majorHAnsi" w:ascii="Calibri Light" w:hAnsi="Calibri Light"/>
               </w:rPr>
             </w:r>
           </w:p>
@@ -4778,18 +4696,15 @@
             <w:pPr>
               <w:pStyle w:val="Normal"/>
               <w:widowControl/>
-              <w:spacing w:before="0" w:after="0"/>
-              <w:rPr>
-                <w:rFonts w:ascii="Calibri Light" w:hAnsi="Calibri Light" w:asciiTheme="majorHAnsi" w:hAnsiTheme="majorHAnsi"/>
-              </w:rPr>
-            </w:pPr>
-            <w:r>
-              <w:rPr>
-                <w:rFonts w:eastAsia="Calibri" w:cs="" w:ascii="Calibri Light" w:hAnsi="Calibri Light"/>
-                <w:kern w:val="0"/>
-                <w:sz w:val="24"/>
-                <w:szCs w:val="24"/>
-                <w:lang w:val="fr-FR" w:eastAsia="en-US" w:bidi="ar-SA"/>
+              <w:suppressAutoHyphens w:val="true"/>
+              <w:spacing w:before="0" w:after="0"/>
+              <w:rPr>
+                <w:rFonts w:ascii="Calibri Light" w:hAnsi="Calibri Light" w:asciiTheme="majorHAnsi" w:hAnsiTheme="majorHAnsi"/>
+              </w:rPr>
+            </w:pPr>
+            <w:r>
+              <w:rPr>
+                <w:rFonts w:asciiTheme="majorHAnsi" w:hAnsiTheme="majorHAnsi" w:ascii="Calibri Light" w:hAnsi="Calibri Light"/>
               </w:rPr>
             </w:r>
           </w:p>
@@ -4803,19 +4718,16 @@
             <w:pPr>
               <w:pStyle w:val="Normal"/>
               <w:widowControl/>
-              <w:spacing w:before="0" w:after="0"/>
-              <w:ind w:hanging="0"/>
-              <w:rPr>
-                <w:rFonts w:ascii="Calibri Light" w:hAnsi="Calibri Light" w:asciiTheme="majorHAnsi" w:hAnsiTheme="majorHAnsi"/>
-              </w:rPr>
-            </w:pPr>
-            <w:r>
-              <w:rPr>
-                <w:rFonts w:eastAsia="Calibri" w:cs="" w:ascii="Calibri Light" w:hAnsi="Calibri Light"/>
-                <w:kern w:val="0"/>
-                <w:sz w:val="24"/>
-                <w:szCs w:val="24"/>
-                <w:lang w:val="fr-FR" w:eastAsia="en-US" w:bidi="ar-SA"/>
+              <w:suppressAutoHyphens w:val="true"/>
+              <w:spacing w:before="0" w:after="0"/>
+              <w:ind w:hanging="0"/>
+              <w:rPr>
+                <w:rFonts w:ascii="Calibri Light" w:hAnsi="Calibri Light" w:asciiTheme="majorHAnsi" w:hAnsiTheme="majorHAnsi"/>
+              </w:rPr>
+            </w:pPr>
+            <w:r>
+              <w:rPr>
+                <w:rFonts w:asciiTheme="majorHAnsi" w:hAnsiTheme="majorHAnsi" w:ascii="Calibri Light" w:hAnsi="Calibri Light"/>
               </w:rPr>
             </w:r>
           </w:p>
@@ -4834,6 +4746,7 @@
             <w:pPr>
               <w:pStyle w:val="Normal"/>
               <w:widowControl/>
+              <w:suppressAutoHyphens w:val="true"/>
               <w:spacing w:before="0" w:after="0"/>
               <w:ind w:hanging="0"/>
               <w:rPr>
@@ -4855,19 +4768,16 @@
             <w:pPr>
               <w:pStyle w:val="Normal"/>
               <w:widowControl/>
-              <w:spacing w:before="0" w:after="0"/>
-              <w:ind w:hanging="0"/>
-              <w:rPr>
-                <w:rFonts w:ascii="Calibri Light" w:hAnsi="Calibri Light" w:asciiTheme="majorHAnsi" w:hAnsiTheme="majorHAnsi"/>
-              </w:rPr>
-            </w:pPr>
-            <w:r>
-              <w:rPr>
-                <w:rFonts w:eastAsia="Calibri" w:cs="" w:ascii="Calibri Light" w:hAnsi="Calibri Light"/>
-                <w:kern w:val="0"/>
-                <w:sz w:val="24"/>
-                <w:szCs w:val="24"/>
-                <w:lang w:val="fr-FR" w:eastAsia="en-US" w:bidi="ar-SA"/>
+              <w:suppressAutoHyphens w:val="true"/>
+              <w:spacing w:before="0" w:after="0"/>
+              <w:ind w:hanging="0"/>
+              <w:rPr>
+                <w:rFonts w:ascii="Calibri Light" w:hAnsi="Calibri Light" w:asciiTheme="majorHAnsi" w:hAnsiTheme="majorHAnsi"/>
+              </w:rPr>
+            </w:pPr>
+            <w:r>
+              <w:rPr>
+                <w:rFonts w:asciiTheme="majorHAnsi" w:hAnsiTheme="majorHAnsi" w:ascii="Calibri Light" w:hAnsi="Calibri Light"/>
               </w:rPr>
             </w:r>
           </w:p>
@@ -4881,18 +4791,15 @@
             <w:pPr>
               <w:pStyle w:val="Normal"/>
               <w:widowControl/>
-              <w:spacing w:before="0" w:after="0"/>
-              <w:rPr>
-                <w:rFonts w:ascii="Calibri Light" w:hAnsi="Calibri Light" w:asciiTheme="majorHAnsi" w:hAnsiTheme="majorHAnsi"/>
-              </w:rPr>
-            </w:pPr>
-            <w:r>
-              <w:rPr>
-                <w:rFonts w:eastAsia="Calibri" w:cs="" w:ascii="Calibri Light" w:hAnsi="Calibri Light"/>
-                <w:kern w:val="0"/>
-                <w:sz w:val="24"/>
-                <w:szCs w:val="24"/>
-                <w:lang w:val="fr-FR" w:eastAsia="en-US" w:bidi="ar-SA"/>
+              <w:suppressAutoHyphens w:val="true"/>
+              <w:spacing w:before="0" w:after="0"/>
+              <w:rPr>
+                <w:rFonts w:ascii="Calibri Light" w:hAnsi="Calibri Light" w:asciiTheme="majorHAnsi" w:hAnsiTheme="majorHAnsi"/>
+              </w:rPr>
+            </w:pPr>
+            <w:r>
+              <w:rPr>
+                <w:rFonts w:asciiTheme="majorHAnsi" w:hAnsiTheme="majorHAnsi" w:ascii="Calibri Light" w:hAnsi="Calibri Light"/>
               </w:rPr>
             </w:r>
           </w:p>
@@ -4906,19 +4813,16 @@
             <w:pPr>
               <w:pStyle w:val="Normal"/>
               <w:widowControl/>
-              <w:spacing w:before="0" w:after="0"/>
-              <w:ind w:hanging="0"/>
-              <w:rPr>
-                <w:rFonts w:ascii="Calibri Light" w:hAnsi="Calibri Light" w:asciiTheme="majorHAnsi" w:hAnsiTheme="majorHAnsi"/>
-              </w:rPr>
-            </w:pPr>
-            <w:r>
-              <w:rPr>
-                <w:rFonts w:eastAsia="Calibri" w:cs="" w:ascii="Calibri Light" w:hAnsi="Calibri Light"/>
-                <w:kern w:val="0"/>
-                <w:sz w:val="24"/>
-                <w:szCs w:val="24"/>
-                <w:lang w:val="fr-FR" w:eastAsia="en-US" w:bidi="ar-SA"/>
+              <w:suppressAutoHyphens w:val="true"/>
+              <w:spacing w:before="0" w:after="0"/>
+              <w:ind w:hanging="0"/>
+              <w:rPr>
+                <w:rFonts w:ascii="Calibri Light" w:hAnsi="Calibri Light" w:asciiTheme="majorHAnsi" w:hAnsiTheme="majorHAnsi"/>
+              </w:rPr>
+            </w:pPr>
+            <w:r>
+              <w:rPr>
+                <w:rFonts w:asciiTheme="majorHAnsi" w:hAnsiTheme="majorHAnsi" w:ascii="Calibri Light" w:hAnsi="Calibri Light"/>
               </w:rPr>
             </w:r>
           </w:p>
@@ -4937,6 +4841,7 @@
             <w:pPr>
               <w:pStyle w:val="Normal"/>
               <w:widowControl/>
+              <w:suppressAutoHyphens w:val="true"/>
               <w:spacing w:before="0" w:after="0"/>
               <w:ind w:hanging="0"/>
               <w:rPr>
@@ -4958,6 +4863,7 @@
             <w:pPr>
               <w:pStyle w:val="Normal"/>
               <w:widowControl/>
+              <w:suppressAutoHyphens w:val="true"/>
               <w:spacing w:before="0" w:after="0"/>
               <w:ind w:hanging="0"/>
               <w:rPr>
@@ -4985,19 +4891,16 @@
             <w:pPr>
               <w:pStyle w:val="Normal"/>
               <w:widowControl/>
-              <w:spacing w:before="0" w:after="0"/>
-              <w:ind w:hanging="0"/>
-              <w:rPr>
-                <w:rFonts w:ascii="Calibri Light" w:hAnsi="Calibri Light" w:asciiTheme="majorHAnsi" w:hAnsiTheme="majorHAnsi"/>
-              </w:rPr>
-            </w:pPr>
-            <w:r>
-              <w:rPr>
-                <w:rFonts w:eastAsia="Calibri" w:cs="" w:ascii="Calibri Light" w:hAnsi="Calibri Light"/>
-                <w:kern w:val="0"/>
-                <w:sz w:val="24"/>
-                <w:szCs w:val="24"/>
-                <w:lang w:val="fr-FR" w:eastAsia="en-US" w:bidi="ar-SA"/>
+              <w:suppressAutoHyphens w:val="true"/>
+              <w:spacing w:before="0" w:after="0"/>
+              <w:ind w:hanging="0"/>
+              <w:rPr>
+                <w:rFonts w:ascii="Calibri Light" w:hAnsi="Calibri Light" w:asciiTheme="majorHAnsi" w:hAnsiTheme="majorHAnsi"/>
+              </w:rPr>
+            </w:pPr>
+            <w:r>
+              <w:rPr>
+                <w:rFonts w:asciiTheme="majorHAnsi" w:hAnsiTheme="majorHAnsi" w:ascii="Calibri Light" w:hAnsi="Calibri Light"/>
               </w:rPr>
             </w:r>
           </w:p>
@@ -5011,19 +4914,16 @@
             <w:pPr>
               <w:pStyle w:val="Normal"/>
               <w:widowControl/>
-              <w:spacing w:before="0" w:after="0"/>
-              <w:ind w:hanging="0"/>
-              <w:rPr>
-                <w:rFonts w:ascii="Calibri Light" w:hAnsi="Calibri Light" w:asciiTheme="majorHAnsi" w:hAnsiTheme="majorHAnsi"/>
-              </w:rPr>
-            </w:pPr>
-            <w:r>
-              <w:rPr>
-                <w:rFonts w:eastAsia="Calibri" w:cs="" w:ascii="Calibri Light" w:hAnsi="Calibri Light"/>
-                <w:kern w:val="0"/>
-                <w:sz w:val="24"/>
-                <w:szCs w:val="24"/>
-                <w:lang w:val="fr-FR" w:eastAsia="en-US" w:bidi="ar-SA"/>
+              <w:suppressAutoHyphens w:val="true"/>
+              <w:spacing w:before="0" w:after="0"/>
+              <w:ind w:hanging="0"/>
+              <w:rPr>
+                <w:rFonts w:ascii="Calibri Light" w:hAnsi="Calibri Light" w:asciiTheme="majorHAnsi" w:hAnsiTheme="majorHAnsi"/>
+              </w:rPr>
+            </w:pPr>
+            <w:r>
+              <w:rPr>
+                <w:rFonts w:asciiTheme="majorHAnsi" w:hAnsiTheme="majorHAnsi" w:ascii="Calibri Light" w:hAnsi="Calibri Light"/>
               </w:rPr>
             </w:r>
           </w:p>
@@ -5076,6 +4976,7 @@
             <w:pPr>
               <w:pStyle w:val="Normal"/>
               <w:widowControl/>
+              <w:suppressAutoHyphens w:val="true"/>
               <w:spacing w:before="0" w:after="0"/>
               <w:ind w:hanging="0"/>
               <w:rPr>
@@ -5105,6 +5006,7 @@
             <w:pPr>
               <w:pStyle w:val="Normal"/>
               <w:widowControl/>
+              <w:suppressAutoHyphens w:val="true"/>
               <w:spacing w:before="0" w:after="0"/>
               <w:ind w:hanging="0"/>
               <w:rPr>
@@ -5134,6 +5036,7 @@
             <w:pPr>
               <w:pStyle w:val="Normal"/>
               <w:widowControl/>
+              <w:suppressAutoHyphens w:val="true"/>
               <w:spacing w:before="0" w:after="0"/>
               <w:ind w:hanging="0"/>
               <w:rPr>
@@ -5143,12 +5046,8 @@
             </w:pPr>
             <w:r>
               <w:rPr>
-                <w:rFonts w:eastAsia="Calibri" w:cs="" w:ascii="Calibri Light" w:hAnsi="Calibri Light"/>
+                <w:rFonts w:asciiTheme="majorHAnsi" w:hAnsiTheme="majorHAnsi" w:ascii="Calibri Light" w:hAnsi="Calibri Light"/>
                 <w:b/>
-                <w:kern w:val="0"/>
-                <w:sz w:val="24"/>
-                <w:szCs w:val="24"/>
-                <w:lang w:val="fr-FR" w:eastAsia="en-US" w:bidi="ar-SA"/>
               </w:rPr>
             </w:r>
           </w:p>
@@ -5167,6 +5066,7 @@
             <w:pPr>
               <w:pStyle w:val="Normal"/>
               <w:widowControl/>
+              <w:suppressAutoHyphens w:val="true"/>
               <w:spacing w:before="0" w:after="0"/>
               <w:ind w:hanging="0"/>
               <w:rPr>
@@ -5188,6 +5088,7 @@
             <w:pPr>
               <w:pStyle w:val="Normal"/>
               <w:widowControl/>
+              <w:suppressAutoHyphens w:val="true"/>
               <w:spacing w:before="0" w:after="0"/>
               <w:ind w:hanging="0"/>
               <w:rPr>
@@ -5215,19 +5116,16 @@
             <w:pPr>
               <w:pStyle w:val="Normal"/>
               <w:widowControl/>
-              <w:spacing w:before="0" w:after="0"/>
-              <w:ind w:hanging="0"/>
-              <w:rPr>
-                <w:rFonts w:ascii="Calibri Light" w:hAnsi="Calibri Light" w:asciiTheme="majorHAnsi" w:hAnsiTheme="majorHAnsi"/>
-              </w:rPr>
-            </w:pPr>
-            <w:r>
-              <w:rPr>
-                <w:rFonts w:eastAsia="Calibri" w:cs="" w:ascii="Calibri Light" w:hAnsi="Calibri Light"/>
-                <w:kern w:val="0"/>
-                <w:sz w:val="24"/>
-                <w:szCs w:val="24"/>
-                <w:lang w:val="fr-FR" w:eastAsia="en-US" w:bidi="ar-SA"/>
+              <w:suppressAutoHyphens w:val="true"/>
+              <w:spacing w:before="0" w:after="0"/>
+              <w:ind w:hanging="0"/>
+              <w:rPr>
+                <w:rFonts w:ascii="Calibri Light" w:hAnsi="Calibri Light" w:asciiTheme="majorHAnsi" w:hAnsiTheme="majorHAnsi"/>
+              </w:rPr>
+            </w:pPr>
+            <w:r>
+              <w:rPr>
+                <w:rFonts w:asciiTheme="majorHAnsi" w:hAnsiTheme="majorHAnsi" w:ascii="Calibri Light" w:hAnsi="Calibri Light"/>
               </w:rPr>
             </w:r>
           </w:p>
@@ -5241,19 +5139,16 @@
             <w:pPr>
               <w:pStyle w:val="Normal"/>
               <w:widowControl/>
-              <w:spacing w:before="0" w:after="0"/>
-              <w:ind w:hanging="0"/>
-              <w:rPr>
-                <w:rFonts w:ascii="Calibri Light" w:hAnsi="Calibri Light" w:asciiTheme="majorHAnsi" w:hAnsiTheme="majorHAnsi"/>
-              </w:rPr>
-            </w:pPr>
-            <w:r>
-              <w:rPr>
-                <w:rFonts w:eastAsia="Calibri" w:cs="" w:ascii="Calibri Light" w:hAnsi="Calibri Light"/>
-                <w:kern w:val="0"/>
-                <w:sz w:val="24"/>
-                <w:szCs w:val="24"/>
-                <w:lang w:val="fr-FR" w:eastAsia="en-US" w:bidi="ar-SA"/>
+              <w:suppressAutoHyphens w:val="true"/>
+              <w:spacing w:before="0" w:after="0"/>
+              <w:ind w:hanging="0"/>
+              <w:rPr>
+                <w:rFonts w:ascii="Calibri Light" w:hAnsi="Calibri Light" w:asciiTheme="majorHAnsi" w:hAnsiTheme="majorHAnsi"/>
+              </w:rPr>
+            </w:pPr>
+            <w:r>
+              <w:rPr>
+                <w:rFonts w:asciiTheme="majorHAnsi" w:hAnsiTheme="majorHAnsi" w:ascii="Calibri Light" w:hAnsi="Calibri Light"/>
               </w:rPr>
             </w:r>
           </w:p>
@@ -5270,6 +5165,7 @@
             <w:pPr>
               <w:pStyle w:val="Normal"/>
               <w:widowControl/>
+              <w:suppressAutoHyphens w:val="true"/>
               <w:spacing w:before="0" w:after="0"/>
               <w:ind w:hanging="0"/>
               <w:rPr>
@@ -5297,19 +5193,16 @@
             <w:pPr>
               <w:pStyle w:val="Normal"/>
               <w:widowControl/>
-              <w:spacing w:before="0" w:after="0"/>
-              <w:ind w:hanging="0"/>
-              <w:rPr>
-                <w:rFonts w:ascii="Calibri Light" w:hAnsi="Calibri Light" w:asciiTheme="majorHAnsi" w:hAnsiTheme="majorHAnsi"/>
-              </w:rPr>
-            </w:pPr>
-            <w:r>
-              <w:rPr>
-                <w:rFonts w:eastAsia="Calibri" w:cs="" w:ascii="Calibri Light" w:hAnsi="Calibri Light"/>
-                <w:kern w:val="0"/>
-                <w:sz w:val="24"/>
-                <w:szCs w:val="24"/>
-                <w:lang w:val="fr-FR" w:eastAsia="en-US" w:bidi="ar-SA"/>
+              <w:suppressAutoHyphens w:val="true"/>
+              <w:spacing w:before="0" w:after="0"/>
+              <w:ind w:hanging="0"/>
+              <w:rPr>
+                <w:rFonts w:ascii="Calibri Light" w:hAnsi="Calibri Light" w:asciiTheme="majorHAnsi" w:hAnsiTheme="majorHAnsi"/>
+              </w:rPr>
+            </w:pPr>
+            <w:r>
+              <w:rPr>
+                <w:rFonts w:asciiTheme="majorHAnsi" w:hAnsiTheme="majorHAnsi" w:ascii="Calibri Light" w:hAnsi="Calibri Light"/>
               </w:rPr>
             </w:r>
           </w:p>
@@ -5323,19 +5216,16 @@
             <w:pPr>
               <w:pStyle w:val="Normal"/>
               <w:widowControl/>
-              <w:spacing w:before="0" w:after="0"/>
-              <w:ind w:hanging="0"/>
-              <w:rPr>
-                <w:rFonts w:ascii="Calibri Light" w:hAnsi="Calibri Light" w:asciiTheme="majorHAnsi" w:hAnsiTheme="majorHAnsi"/>
-              </w:rPr>
-            </w:pPr>
-            <w:r>
-              <w:rPr>
-                <w:rFonts w:eastAsia="Calibri" w:cs="" w:ascii="Calibri Light" w:hAnsi="Calibri Light"/>
-                <w:kern w:val="0"/>
-                <w:sz w:val="24"/>
-                <w:szCs w:val="24"/>
-                <w:lang w:val="fr-FR" w:eastAsia="en-US" w:bidi="ar-SA"/>
+              <w:suppressAutoHyphens w:val="true"/>
+              <w:spacing w:before="0" w:after="0"/>
+              <w:ind w:hanging="0"/>
+              <w:rPr>
+                <w:rFonts w:ascii="Calibri Light" w:hAnsi="Calibri Light" w:asciiTheme="majorHAnsi" w:hAnsiTheme="majorHAnsi"/>
+              </w:rPr>
+            </w:pPr>
+            <w:r>
+              <w:rPr>
+                <w:rFonts w:asciiTheme="majorHAnsi" w:hAnsiTheme="majorHAnsi" w:ascii="Calibri Light" w:hAnsi="Calibri Light"/>
               </w:rPr>
             </w:r>
           </w:p>
@@ -5354,6 +5244,7 @@
             <w:pPr>
               <w:pStyle w:val="Normal"/>
               <w:widowControl/>
+              <w:suppressAutoHyphens w:val="true"/>
               <w:spacing w:before="0" w:after="0"/>
               <w:ind w:hanging="0"/>
               <w:rPr>
@@ -5375,6 +5266,7 @@
             <w:pPr>
               <w:pStyle w:val="Normal"/>
               <w:widowControl/>
+              <w:suppressAutoHyphens w:val="true"/>
               <w:spacing w:before="0" w:after="0"/>
               <w:ind w:hanging="0"/>
               <w:rPr>
@@ -5396,6 +5288,7 @@
             <w:pPr>
               <w:pStyle w:val="Normal"/>
               <w:widowControl/>
+              <w:suppressAutoHyphens w:val="true"/>
               <w:spacing w:before="0" w:after="0"/>
               <w:ind w:hanging="0"/>
               <w:rPr>
@@ -5417,6 +5310,7 @@
             <w:pPr>
               <w:pStyle w:val="Normal"/>
               <w:widowControl/>
+              <w:suppressAutoHyphens w:val="true"/>
               <w:spacing w:before="0" w:after="0"/>
               <w:ind w:hanging="0"/>
               <w:rPr>
@@ -5444,19 +5338,16 @@
             <w:pPr>
               <w:pStyle w:val="Normal"/>
               <w:widowControl/>
-              <w:spacing w:before="0" w:after="0"/>
-              <w:ind w:hanging="0"/>
-              <w:rPr>
-                <w:rFonts w:ascii="Calibri Light" w:hAnsi="Calibri Light" w:asciiTheme="majorHAnsi" w:hAnsiTheme="majorHAnsi"/>
-              </w:rPr>
-            </w:pPr>
-            <w:r>
-              <w:rPr>
-                <w:rFonts w:eastAsia="Calibri" w:cs="" w:ascii="Calibri Light" w:hAnsi="Calibri Light"/>
-                <w:kern w:val="0"/>
-                <w:sz w:val="24"/>
-                <w:szCs w:val="24"/>
-                <w:lang w:val="fr-FR" w:eastAsia="en-US" w:bidi="ar-SA"/>
+              <w:suppressAutoHyphens w:val="true"/>
+              <w:spacing w:before="0" w:after="0"/>
+              <w:ind w:hanging="0"/>
+              <w:rPr>
+                <w:rFonts w:ascii="Calibri Light" w:hAnsi="Calibri Light" w:asciiTheme="majorHAnsi" w:hAnsiTheme="majorHAnsi"/>
+              </w:rPr>
+            </w:pPr>
+            <w:r>
+              <w:rPr>
+                <w:rFonts w:asciiTheme="majorHAnsi" w:hAnsiTheme="majorHAnsi" w:ascii="Calibri Light" w:hAnsi="Calibri Light"/>
               </w:rPr>
             </w:r>
           </w:p>
@@ -5470,19 +5361,16 @@
             <w:pPr>
               <w:pStyle w:val="Normal"/>
               <w:widowControl/>
-              <w:spacing w:before="0" w:after="0"/>
-              <w:ind w:hanging="0"/>
-              <w:rPr>
-                <w:rFonts w:ascii="Calibri Light" w:hAnsi="Calibri Light" w:asciiTheme="majorHAnsi" w:hAnsiTheme="majorHAnsi"/>
-              </w:rPr>
-            </w:pPr>
-            <w:r>
-              <w:rPr>
-                <w:rFonts w:eastAsia="Calibri" w:cs="" w:ascii="Calibri Light" w:hAnsi="Calibri Light"/>
-                <w:kern w:val="0"/>
-                <w:sz w:val="24"/>
-                <w:szCs w:val="24"/>
-                <w:lang w:val="fr-FR" w:eastAsia="en-US" w:bidi="ar-SA"/>
+              <w:suppressAutoHyphens w:val="true"/>
+              <w:spacing w:before="0" w:after="0"/>
+              <w:ind w:hanging="0"/>
+              <w:rPr>
+                <w:rFonts w:ascii="Calibri Light" w:hAnsi="Calibri Light" w:asciiTheme="majorHAnsi" w:hAnsiTheme="majorHAnsi"/>
+              </w:rPr>
+            </w:pPr>
+            <w:r>
+              <w:rPr>
+                <w:rFonts w:asciiTheme="majorHAnsi" w:hAnsiTheme="majorHAnsi" w:ascii="Calibri Light" w:hAnsi="Calibri Light"/>
               </w:rPr>
             </w:r>
           </w:p>
@@ -5501,6 +5389,7 @@
             <w:pPr>
               <w:pStyle w:val="Normal"/>
               <w:widowControl/>
+              <w:suppressAutoHyphens w:val="true"/>
               <w:spacing w:before="0" w:after="0"/>
               <w:ind w:hanging="0"/>
               <w:rPr>
@@ -5522,6 +5411,7 @@
             <w:pPr>
               <w:pStyle w:val="Normal"/>
               <w:widowControl/>
+              <w:suppressAutoHyphens w:val="true"/>
               <w:spacing w:before="0" w:after="0"/>
               <w:ind w:hanging="0"/>
               <w:rPr>
@@ -5543,19 +5433,16 @@
             <w:pPr>
               <w:pStyle w:val="Normal"/>
               <w:widowControl/>
-              <w:spacing w:before="0" w:after="0"/>
-              <w:ind w:hanging="0"/>
-              <w:rPr>
-                <w:rFonts w:ascii="Calibri Light" w:hAnsi="Calibri Light" w:asciiTheme="majorHAnsi" w:hAnsiTheme="majorHAnsi"/>
-              </w:rPr>
-            </w:pPr>
-            <w:r>
-              <w:rPr>
-                <w:rFonts w:eastAsia="Calibri" w:cs="" w:ascii="Calibri Light" w:hAnsi="Calibri Light"/>
-                <w:kern w:val="0"/>
-                <w:sz w:val="24"/>
-                <w:szCs w:val="24"/>
-                <w:lang w:val="fr-FR" w:eastAsia="en-US" w:bidi="ar-SA"/>
+              <w:suppressAutoHyphens w:val="true"/>
+              <w:spacing w:before="0" w:after="0"/>
+              <w:ind w:hanging="0"/>
+              <w:rPr>
+                <w:rFonts w:ascii="Calibri Light" w:hAnsi="Calibri Light" w:asciiTheme="majorHAnsi" w:hAnsiTheme="majorHAnsi"/>
+              </w:rPr>
+            </w:pPr>
+            <w:r>
+              <w:rPr>
+                <w:rFonts w:asciiTheme="majorHAnsi" w:hAnsiTheme="majorHAnsi" w:ascii="Calibri Light" w:hAnsi="Calibri Light"/>
               </w:rPr>
             </w:r>
           </w:p>
@@ -5569,18 +5456,15 @@
             <w:pPr>
               <w:pStyle w:val="Normal"/>
               <w:widowControl/>
-              <w:spacing w:before="0" w:after="0"/>
-              <w:rPr>
-                <w:rFonts w:ascii="Calibri Light" w:hAnsi="Calibri Light" w:asciiTheme="majorHAnsi" w:hAnsiTheme="majorHAnsi"/>
-              </w:rPr>
-            </w:pPr>
-            <w:r>
-              <w:rPr>
-                <w:rFonts w:eastAsia="Calibri" w:cs="" w:ascii="Calibri Light" w:hAnsi="Calibri Light"/>
-                <w:kern w:val="0"/>
-                <w:sz w:val="24"/>
-                <w:szCs w:val="24"/>
-                <w:lang w:val="fr-FR" w:eastAsia="en-US" w:bidi="ar-SA"/>
+              <w:suppressAutoHyphens w:val="true"/>
+              <w:spacing w:before="0" w:after="0"/>
+              <w:rPr>
+                <w:rFonts w:ascii="Calibri Light" w:hAnsi="Calibri Light" w:asciiTheme="majorHAnsi" w:hAnsiTheme="majorHAnsi"/>
+              </w:rPr>
+            </w:pPr>
+            <w:r>
+              <w:rPr>
+                <w:rFonts w:asciiTheme="majorHAnsi" w:hAnsiTheme="majorHAnsi" w:ascii="Calibri Light" w:hAnsi="Calibri Light"/>
               </w:rPr>
             </w:r>
           </w:p>
@@ -5594,19 +5478,16 @@
             <w:pPr>
               <w:pStyle w:val="Normal"/>
               <w:widowControl/>
-              <w:spacing w:before="0" w:after="0"/>
-              <w:ind w:hanging="0"/>
-              <w:rPr>
-                <w:rFonts w:ascii="Calibri Light" w:hAnsi="Calibri Light" w:asciiTheme="majorHAnsi" w:hAnsiTheme="majorHAnsi"/>
-              </w:rPr>
-            </w:pPr>
-            <w:r>
-              <w:rPr>
-                <w:rFonts w:eastAsia="Calibri" w:cs="" w:ascii="Calibri Light" w:hAnsi="Calibri Light"/>
-                <w:kern w:val="0"/>
-                <w:sz w:val="24"/>
-                <w:szCs w:val="24"/>
-                <w:lang w:val="fr-FR" w:eastAsia="en-US" w:bidi="ar-SA"/>
+              <w:suppressAutoHyphens w:val="true"/>
+              <w:spacing w:before="0" w:after="0"/>
+              <w:ind w:hanging="0"/>
+              <w:rPr>
+                <w:rFonts w:ascii="Calibri Light" w:hAnsi="Calibri Light" w:asciiTheme="majorHAnsi" w:hAnsiTheme="majorHAnsi"/>
+              </w:rPr>
+            </w:pPr>
+            <w:r>
+              <w:rPr>
+                <w:rFonts w:asciiTheme="majorHAnsi" w:hAnsiTheme="majorHAnsi" w:ascii="Calibri Light" w:hAnsi="Calibri Light"/>
               </w:rPr>
             </w:r>
           </w:p>
@@ -5625,6 +5506,7 @@
             <w:pPr>
               <w:pStyle w:val="Normal"/>
               <w:widowControl/>
+              <w:suppressAutoHyphens w:val="true"/>
               <w:spacing w:before="0" w:after="0"/>
               <w:ind w:hanging="0"/>
               <w:rPr>
@@ -5646,19 +5528,16 @@
             <w:pPr>
               <w:pStyle w:val="Normal"/>
               <w:widowControl/>
-              <w:spacing w:before="0" w:after="0"/>
-              <w:ind w:hanging="0"/>
-              <w:rPr>
-                <w:rFonts w:ascii="Calibri Light" w:hAnsi="Calibri Light" w:asciiTheme="majorHAnsi" w:hAnsiTheme="majorHAnsi"/>
-              </w:rPr>
-            </w:pPr>
-            <w:r>
-              <w:rPr>
-                <w:rFonts w:eastAsia="Calibri" w:cs="" w:ascii="Calibri Light" w:hAnsi="Calibri Light"/>
-                <w:kern w:val="0"/>
-                <w:sz w:val="24"/>
-                <w:szCs w:val="24"/>
-                <w:lang w:val="fr-FR" w:eastAsia="en-US" w:bidi="ar-SA"/>
+              <w:suppressAutoHyphens w:val="true"/>
+              <w:spacing w:before="0" w:after="0"/>
+              <w:ind w:hanging="0"/>
+              <w:rPr>
+                <w:rFonts w:ascii="Calibri Light" w:hAnsi="Calibri Light" w:asciiTheme="majorHAnsi" w:hAnsiTheme="majorHAnsi"/>
+              </w:rPr>
+            </w:pPr>
+            <w:r>
+              <w:rPr>
+                <w:rFonts w:asciiTheme="majorHAnsi" w:hAnsiTheme="majorHAnsi" w:ascii="Calibri Light" w:hAnsi="Calibri Light"/>
               </w:rPr>
             </w:r>
           </w:p>
@@ -5672,18 +5551,15 @@
             <w:pPr>
               <w:pStyle w:val="Normal"/>
               <w:widowControl/>
-              <w:spacing w:before="0" w:after="0"/>
-              <w:rPr>
-                <w:rFonts w:ascii="Calibri Light" w:hAnsi="Calibri Light" w:asciiTheme="majorHAnsi" w:hAnsiTheme="majorHAnsi"/>
-              </w:rPr>
-            </w:pPr>
-            <w:r>
-              <w:rPr>
-                <w:rFonts w:eastAsia="Calibri" w:cs="" w:ascii="Calibri Light" w:hAnsi="Calibri Light"/>
-                <w:kern w:val="0"/>
-                <w:sz w:val="24"/>
-                <w:szCs w:val="24"/>
-                <w:lang w:val="fr-FR" w:eastAsia="en-US" w:bidi="ar-SA"/>
+              <w:suppressAutoHyphens w:val="true"/>
+              <w:spacing w:before="0" w:after="0"/>
+              <w:rPr>
+                <w:rFonts w:ascii="Calibri Light" w:hAnsi="Calibri Light" w:asciiTheme="majorHAnsi" w:hAnsiTheme="majorHAnsi"/>
+              </w:rPr>
+            </w:pPr>
+            <w:r>
+              <w:rPr>
+                <w:rFonts w:asciiTheme="majorHAnsi" w:hAnsiTheme="majorHAnsi" w:ascii="Calibri Light" w:hAnsi="Calibri Light"/>
               </w:rPr>
             </w:r>
           </w:p>
@@ -5697,19 +5573,16 @@
             <w:pPr>
               <w:pStyle w:val="Normal"/>
               <w:widowControl/>
-              <w:spacing w:before="0" w:after="0"/>
-              <w:ind w:hanging="0"/>
-              <w:rPr>
-                <w:rFonts w:ascii="Calibri Light" w:hAnsi="Calibri Light" w:asciiTheme="majorHAnsi" w:hAnsiTheme="majorHAnsi"/>
-              </w:rPr>
-            </w:pPr>
-            <w:r>
-              <w:rPr>
-                <w:rFonts w:eastAsia="Calibri" w:cs="" w:ascii="Calibri Light" w:hAnsi="Calibri Light"/>
-                <w:kern w:val="0"/>
-                <w:sz w:val="24"/>
-                <w:szCs w:val="24"/>
-                <w:lang w:val="fr-FR" w:eastAsia="en-US" w:bidi="ar-SA"/>
+              <w:suppressAutoHyphens w:val="true"/>
+              <w:spacing w:before="0" w:after="0"/>
+              <w:ind w:hanging="0"/>
+              <w:rPr>
+                <w:rFonts w:ascii="Calibri Light" w:hAnsi="Calibri Light" w:asciiTheme="majorHAnsi" w:hAnsiTheme="majorHAnsi"/>
+              </w:rPr>
+            </w:pPr>
+            <w:r>
+              <w:rPr>
+                <w:rFonts w:asciiTheme="majorHAnsi" w:hAnsiTheme="majorHAnsi" w:ascii="Calibri Light" w:hAnsi="Calibri Light"/>
               </w:rPr>
             </w:r>
           </w:p>
@@ -5728,6 +5601,7 @@
             <w:pPr>
               <w:pStyle w:val="Normal"/>
               <w:widowControl/>
+              <w:suppressAutoHyphens w:val="true"/>
               <w:spacing w:before="0" w:after="0"/>
               <w:ind w:hanging="0"/>
               <w:rPr>
@@ -5749,6 +5623,7 @@
             <w:pPr>
               <w:pStyle w:val="Normal"/>
               <w:widowControl/>
+              <w:suppressAutoHyphens w:val="true"/>
               <w:spacing w:before="0" w:after="0"/>
               <w:ind w:hanging="0"/>
               <w:rPr>
@@ -5776,19 +5651,16 @@
             <w:pPr>
               <w:pStyle w:val="Normal"/>
               <w:widowControl/>
-              <w:spacing w:before="0" w:after="0"/>
-              <w:ind w:hanging="0"/>
-              <w:rPr>
-                <w:rFonts w:ascii="Calibri Light" w:hAnsi="Calibri Light" w:asciiTheme="majorHAnsi" w:hAnsiTheme="majorHAnsi"/>
-              </w:rPr>
-            </w:pPr>
-            <w:r>
-              <w:rPr>
-                <w:rFonts w:eastAsia="Calibri" w:cs="" w:ascii="Calibri Light" w:hAnsi="Calibri Light"/>
-                <w:kern w:val="0"/>
-                <w:sz w:val="24"/>
-                <w:szCs w:val="24"/>
-                <w:lang w:val="fr-FR" w:eastAsia="en-US" w:bidi="ar-SA"/>
+              <w:suppressAutoHyphens w:val="true"/>
+              <w:spacing w:before="0" w:after="0"/>
+              <w:ind w:hanging="0"/>
+              <w:rPr>
+                <w:rFonts w:ascii="Calibri Light" w:hAnsi="Calibri Light" w:asciiTheme="majorHAnsi" w:hAnsiTheme="majorHAnsi"/>
+              </w:rPr>
+            </w:pPr>
+            <w:r>
+              <w:rPr>
+                <w:rFonts w:asciiTheme="majorHAnsi" w:hAnsiTheme="majorHAnsi" w:ascii="Calibri Light" w:hAnsi="Calibri Light"/>
               </w:rPr>
             </w:r>
           </w:p>
@@ -5802,19 +5674,16 @@
             <w:pPr>
               <w:pStyle w:val="Normal"/>
               <w:widowControl/>
-              <w:spacing w:before="0" w:after="0"/>
-              <w:ind w:hanging="0"/>
-              <w:rPr>
-                <w:rFonts w:ascii="Calibri Light" w:hAnsi="Calibri Light" w:asciiTheme="majorHAnsi" w:hAnsiTheme="majorHAnsi"/>
-              </w:rPr>
-            </w:pPr>
-            <w:r>
-              <w:rPr>
-                <w:rFonts w:eastAsia="Calibri" w:cs="" w:ascii="Calibri Light" w:hAnsi="Calibri Light"/>
-                <w:kern w:val="0"/>
-                <w:sz w:val="24"/>
-                <w:szCs w:val="24"/>
-                <w:lang w:val="fr-FR" w:eastAsia="en-US" w:bidi="ar-SA"/>
+              <w:suppressAutoHyphens w:val="true"/>
+              <w:spacing w:before="0" w:after="0"/>
+              <w:ind w:hanging="0"/>
+              <w:rPr>
+                <w:rFonts w:ascii="Calibri Light" w:hAnsi="Calibri Light" w:asciiTheme="majorHAnsi" w:hAnsiTheme="majorHAnsi"/>
+              </w:rPr>
+            </w:pPr>
+            <w:r>
+              <w:rPr>
+                <w:rFonts w:asciiTheme="majorHAnsi" w:hAnsiTheme="majorHAnsi" w:ascii="Calibri Light" w:hAnsi="Calibri Light"/>
               </w:rPr>
             </w:r>
           </w:p>
@@ -5867,6 +5736,7 @@
             <w:pPr>
               <w:pStyle w:val="Normal"/>
               <w:widowControl/>
+              <w:suppressAutoHyphens w:val="true"/>
               <w:spacing w:before="0" w:after="0"/>
               <w:ind w:hanging="0"/>
               <w:rPr>
@@ -5896,6 +5766,7 @@
             <w:pPr>
               <w:pStyle w:val="Normal"/>
               <w:widowControl/>
+              <w:suppressAutoHyphens w:val="true"/>
               <w:spacing w:before="0" w:after="0"/>
               <w:ind w:hanging="0"/>
               <w:rPr>
@@ -5925,6 +5796,7 @@
             <w:pPr>
               <w:pStyle w:val="Normal"/>
               <w:widowControl/>
+              <w:suppressAutoHyphens w:val="true"/>
               <w:spacing w:before="0" w:after="0"/>
               <w:ind w:hanging="0"/>
               <w:rPr>
@@ -5934,12 +5806,8 @@
             </w:pPr>
             <w:r>
               <w:rPr>
-                <w:rFonts w:eastAsia="Calibri" w:cs="" w:ascii="Calibri Light" w:hAnsi="Calibri Light"/>
+                <w:rFonts w:asciiTheme="majorHAnsi" w:hAnsiTheme="majorHAnsi" w:ascii="Calibri Light" w:hAnsi="Calibri Light"/>
                 <w:b/>
-                <w:kern w:val="0"/>
-                <w:sz w:val="24"/>
-                <w:szCs w:val="24"/>
-                <w:lang w:val="fr-FR" w:eastAsia="en-US" w:bidi="ar-SA"/>
               </w:rPr>
             </w:r>
           </w:p>
@@ -5958,6 +5826,7 @@
             <w:pPr>
               <w:pStyle w:val="Normal"/>
               <w:widowControl/>
+              <w:suppressAutoHyphens w:val="true"/>
               <w:spacing w:before="0" w:after="0"/>
               <w:ind w:hanging="0"/>
               <w:rPr>
@@ -5979,6 +5848,7 @@
             <w:pPr>
               <w:pStyle w:val="Normal"/>
               <w:widowControl/>
+              <w:suppressAutoHyphens w:val="true"/>
               <w:spacing w:before="0" w:after="0"/>
               <w:ind w:hanging="0"/>
               <w:rPr>
@@ -6006,19 +5876,16 @@
             <w:pPr>
               <w:pStyle w:val="Normal"/>
               <w:widowControl/>
-              <w:spacing w:before="0" w:after="0"/>
-              <w:ind w:hanging="0"/>
-              <w:rPr>
-                <w:rFonts w:ascii="Calibri Light" w:hAnsi="Calibri Light" w:asciiTheme="majorHAnsi" w:hAnsiTheme="majorHAnsi"/>
-              </w:rPr>
-            </w:pPr>
-            <w:r>
-              <w:rPr>
-                <w:rFonts w:eastAsia="Calibri" w:cs="" w:ascii="Calibri Light" w:hAnsi="Calibri Light"/>
-                <w:kern w:val="0"/>
-                <w:sz w:val="24"/>
-                <w:szCs w:val="24"/>
-                <w:lang w:val="fr-FR" w:eastAsia="en-US" w:bidi="ar-SA"/>
+              <w:suppressAutoHyphens w:val="true"/>
+              <w:spacing w:before="0" w:after="0"/>
+              <w:ind w:hanging="0"/>
+              <w:rPr>
+                <w:rFonts w:ascii="Calibri Light" w:hAnsi="Calibri Light" w:asciiTheme="majorHAnsi" w:hAnsiTheme="majorHAnsi"/>
+              </w:rPr>
+            </w:pPr>
+            <w:r>
+              <w:rPr>
+                <w:rFonts w:asciiTheme="majorHAnsi" w:hAnsiTheme="majorHAnsi" w:ascii="Calibri Light" w:hAnsi="Calibri Light"/>
               </w:rPr>
             </w:r>
           </w:p>
@@ -6032,19 +5899,16 @@
             <w:pPr>
               <w:pStyle w:val="Normal"/>
               <w:widowControl/>
-              <w:spacing w:before="0" w:after="0"/>
-              <w:ind w:hanging="0"/>
-              <w:rPr>
-                <w:rFonts w:ascii="Calibri Light" w:hAnsi="Calibri Light" w:asciiTheme="majorHAnsi" w:hAnsiTheme="majorHAnsi"/>
-              </w:rPr>
-            </w:pPr>
-            <w:r>
-              <w:rPr>
-                <w:rFonts w:eastAsia="Calibri" w:cs="" w:ascii="Calibri Light" w:hAnsi="Calibri Light"/>
-                <w:kern w:val="0"/>
-                <w:sz w:val="24"/>
-                <w:szCs w:val="24"/>
-                <w:lang w:val="fr-FR" w:eastAsia="en-US" w:bidi="ar-SA"/>
+              <w:suppressAutoHyphens w:val="true"/>
+              <w:spacing w:before="0" w:after="0"/>
+              <w:ind w:hanging="0"/>
+              <w:rPr>
+                <w:rFonts w:ascii="Calibri Light" w:hAnsi="Calibri Light" w:asciiTheme="majorHAnsi" w:hAnsiTheme="majorHAnsi"/>
+              </w:rPr>
+            </w:pPr>
+            <w:r>
+              <w:rPr>
+                <w:rFonts w:asciiTheme="majorHAnsi" w:hAnsiTheme="majorHAnsi" w:ascii="Calibri Light" w:hAnsi="Calibri Light"/>
               </w:rPr>
             </w:r>
           </w:p>
@@ -6061,6 +5925,7 @@
             <w:pPr>
               <w:pStyle w:val="Normal"/>
               <w:widowControl/>
+              <w:suppressAutoHyphens w:val="true"/>
               <w:spacing w:before="0" w:after="0"/>
               <w:ind w:hanging="0"/>
               <w:rPr>
@@ -6088,19 +5953,16 @@
             <w:pPr>
               <w:pStyle w:val="Normal"/>
               <w:widowControl/>
-              <w:spacing w:before="0" w:after="0"/>
-              <w:ind w:hanging="0"/>
-              <w:rPr>
-                <w:rFonts w:ascii="Calibri Light" w:hAnsi="Calibri Light" w:asciiTheme="majorHAnsi" w:hAnsiTheme="majorHAnsi"/>
-              </w:rPr>
-            </w:pPr>
-            <w:r>
-              <w:rPr>
-                <w:rFonts w:eastAsia="Calibri" w:cs="" w:ascii="Calibri Light" w:hAnsi="Calibri Light"/>
-                <w:kern w:val="0"/>
-                <w:sz w:val="24"/>
-                <w:szCs w:val="24"/>
-                <w:lang w:val="fr-FR" w:eastAsia="en-US" w:bidi="ar-SA"/>
+              <w:suppressAutoHyphens w:val="true"/>
+              <w:spacing w:before="0" w:after="0"/>
+              <w:ind w:hanging="0"/>
+              <w:rPr>
+                <w:rFonts w:ascii="Calibri Light" w:hAnsi="Calibri Light" w:asciiTheme="majorHAnsi" w:hAnsiTheme="majorHAnsi"/>
+              </w:rPr>
+            </w:pPr>
+            <w:r>
+              <w:rPr>
+                <w:rFonts w:asciiTheme="majorHAnsi" w:hAnsiTheme="majorHAnsi" w:ascii="Calibri Light" w:hAnsi="Calibri Light"/>
               </w:rPr>
             </w:r>
           </w:p>
@@ -6114,19 +5976,16 @@
             <w:pPr>
               <w:pStyle w:val="Normal"/>
               <w:widowControl/>
-              <w:spacing w:before="0" w:after="0"/>
-              <w:ind w:hanging="0"/>
-              <w:rPr>
-                <w:rFonts w:ascii="Calibri Light" w:hAnsi="Calibri Light" w:asciiTheme="majorHAnsi" w:hAnsiTheme="majorHAnsi"/>
-              </w:rPr>
-            </w:pPr>
-            <w:r>
-              <w:rPr>
-                <w:rFonts w:eastAsia="Calibri" w:cs="" w:ascii="Calibri Light" w:hAnsi="Calibri Light"/>
-                <w:kern w:val="0"/>
-                <w:sz w:val="24"/>
-                <w:szCs w:val="24"/>
-                <w:lang w:val="fr-FR" w:eastAsia="en-US" w:bidi="ar-SA"/>
+              <w:suppressAutoHyphens w:val="true"/>
+              <w:spacing w:before="0" w:after="0"/>
+              <w:ind w:hanging="0"/>
+              <w:rPr>
+                <w:rFonts w:ascii="Calibri Light" w:hAnsi="Calibri Light" w:asciiTheme="majorHAnsi" w:hAnsiTheme="majorHAnsi"/>
+              </w:rPr>
+            </w:pPr>
+            <w:r>
+              <w:rPr>
+                <w:rFonts w:asciiTheme="majorHAnsi" w:hAnsiTheme="majorHAnsi" w:ascii="Calibri Light" w:hAnsi="Calibri Light"/>
               </w:rPr>
             </w:r>
           </w:p>
@@ -6145,6 +6004,7 @@
             <w:pPr>
               <w:pStyle w:val="Normal"/>
               <w:widowControl/>
+              <w:suppressAutoHyphens w:val="true"/>
               <w:spacing w:before="0" w:after="0"/>
               <w:ind w:hanging="0"/>
               <w:rPr>
@@ -6166,6 +6026,7 @@
             <w:pPr>
               <w:pStyle w:val="Normal"/>
               <w:widowControl/>
+              <w:suppressAutoHyphens w:val="true"/>
               <w:spacing w:before="0" w:after="0"/>
               <w:ind w:hanging="0"/>
               <w:rPr>
@@ -6187,6 +6048,7 @@
             <w:pPr>
               <w:pStyle w:val="Normal"/>
               <w:widowControl/>
+              <w:suppressAutoHyphens w:val="true"/>
               <w:spacing w:before="0" w:after="0"/>
               <w:ind w:hanging="0"/>
               <w:rPr>
@@ -6208,6 +6070,7 @@
             <w:pPr>
               <w:pStyle w:val="Normal"/>
               <w:widowControl/>
+              <w:suppressAutoHyphens w:val="true"/>
               <w:spacing w:before="0" w:after="0"/>
               <w:ind w:hanging="0"/>
               <w:rPr>
@@ -6235,19 +6098,16 @@
             <w:pPr>
               <w:pStyle w:val="Normal"/>
               <w:widowControl/>
-              <w:spacing w:before="0" w:after="0"/>
-              <w:ind w:hanging="0"/>
-              <w:rPr>
-                <w:rFonts w:ascii="Calibri Light" w:hAnsi="Calibri Light" w:asciiTheme="majorHAnsi" w:hAnsiTheme="majorHAnsi"/>
-              </w:rPr>
-            </w:pPr>
-            <w:r>
-              <w:rPr>
-                <w:rFonts w:eastAsia="Calibri" w:cs="" w:ascii="Calibri Light" w:hAnsi="Calibri Light"/>
-                <w:kern w:val="0"/>
-                <w:sz w:val="24"/>
-                <w:szCs w:val="24"/>
-                <w:lang w:val="fr-FR" w:eastAsia="en-US" w:bidi="ar-SA"/>
+              <w:suppressAutoHyphens w:val="true"/>
+              <w:spacing w:before="0" w:after="0"/>
+              <w:ind w:hanging="0"/>
+              <w:rPr>
+                <w:rFonts w:ascii="Calibri Light" w:hAnsi="Calibri Light" w:asciiTheme="majorHAnsi" w:hAnsiTheme="majorHAnsi"/>
+              </w:rPr>
+            </w:pPr>
+            <w:r>
+              <w:rPr>
+                <w:rFonts w:asciiTheme="majorHAnsi" w:hAnsiTheme="majorHAnsi" w:ascii="Calibri Light" w:hAnsi="Calibri Light"/>
               </w:rPr>
             </w:r>
           </w:p>
@@ -6261,19 +6121,16 @@
             <w:pPr>
               <w:pStyle w:val="Normal"/>
               <w:widowControl/>
-              <w:spacing w:before="0" w:after="0"/>
-              <w:ind w:hanging="0"/>
-              <w:rPr>
-                <w:rFonts w:ascii="Calibri Light" w:hAnsi="Calibri Light" w:asciiTheme="majorHAnsi" w:hAnsiTheme="majorHAnsi"/>
-              </w:rPr>
-            </w:pPr>
-            <w:r>
-              <w:rPr>
-                <w:rFonts w:eastAsia="Calibri" w:cs="" w:ascii="Calibri Light" w:hAnsi="Calibri Light"/>
-                <w:kern w:val="0"/>
-                <w:sz w:val="24"/>
-                <w:szCs w:val="24"/>
-                <w:lang w:val="fr-FR" w:eastAsia="en-US" w:bidi="ar-SA"/>
+              <w:suppressAutoHyphens w:val="true"/>
+              <w:spacing w:before="0" w:after="0"/>
+              <w:ind w:hanging="0"/>
+              <w:rPr>
+                <w:rFonts w:ascii="Calibri Light" w:hAnsi="Calibri Light" w:asciiTheme="majorHAnsi" w:hAnsiTheme="majorHAnsi"/>
+              </w:rPr>
+            </w:pPr>
+            <w:r>
+              <w:rPr>
+                <w:rFonts w:asciiTheme="majorHAnsi" w:hAnsiTheme="majorHAnsi" w:ascii="Calibri Light" w:hAnsi="Calibri Light"/>
               </w:rPr>
             </w:r>
           </w:p>
@@ -6292,6 +6149,7 @@
             <w:pPr>
               <w:pStyle w:val="Normal"/>
               <w:widowControl/>
+              <w:suppressAutoHyphens w:val="true"/>
               <w:spacing w:before="0" w:after="0"/>
               <w:ind w:hanging="0"/>
               <w:rPr>
@@ -6313,6 +6171,7 @@
             <w:pPr>
               <w:pStyle w:val="Normal"/>
               <w:widowControl/>
+              <w:suppressAutoHyphens w:val="true"/>
               <w:spacing w:before="0" w:after="0"/>
               <w:ind w:hanging="0"/>
               <w:rPr>
@@ -6334,19 +6193,16 @@
             <w:pPr>
               <w:pStyle w:val="Normal"/>
               <w:widowControl/>
-              <w:spacing w:before="0" w:after="0"/>
-              <w:ind w:hanging="0"/>
-              <w:rPr>
-                <w:rFonts w:ascii="Calibri Light" w:hAnsi="Calibri Light" w:asciiTheme="majorHAnsi" w:hAnsiTheme="majorHAnsi"/>
-              </w:rPr>
-            </w:pPr>
-            <w:r>
-              <w:rPr>
-                <w:rFonts w:eastAsia="Calibri" w:cs="" w:ascii="Calibri Light" w:hAnsi="Calibri Light"/>
-                <w:kern w:val="0"/>
-                <w:sz w:val="24"/>
-                <w:szCs w:val="24"/>
-                <w:lang w:val="fr-FR" w:eastAsia="en-US" w:bidi="ar-SA"/>
+              <w:suppressAutoHyphens w:val="true"/>
+              <w:spacing w:before="0" w:after="0"/>
+              <w:ind w:hanging="0"/>
+              <w:rPr>
+                <w:rFonts w:ascii="Calibri Light" w:hAnsi="Calibri Light" w:asciiTheme="majorHAnsi" w:hAnsiTheme="majorHAnsi"/>
+              </w:rPr>
+            </w:pPr>
+            <w:r>
+              <w:rPr>
+                <w:rFonts w:asciiTheme="majorHAnsi" w:hAnsiTheme="majorHAnsi" w:ascii="Calibri Light" w:hAnsi="Calibri Light"/>
               </w:rPr>
             </w:r>
           </w:p>
@@ -6360,18 +6216,15 @@
             <w:pPr>
               <w:pStyle w:val="Normal"/>
               <w:widowControl/>
-              <w:spacing w:before="0" w:after="0"/>
-              <w:rPr>
-                <w:rFonts w:ascii="Calibri Light" w:hAnsi="Calibri Light" w:asciiTheme="majorHAnsi" w:hAnsiTheme="majorHAnsi"/>
-              </w:rPr>
-            </w:pPr>
-            <w:r>
-              <w:rPr>
-                <w:rFonts w:eastAsia="Calibri" w:cs="" w:ascii="Calibri Light" w:hAnsi="Calibri Light"/>
-                <w:kern w:val="0"/>
-                <w:sz w:val="24"/>
-                <w:szCs w:val="24"/>
-                <w:lang w:val="fr-FR" w:eastAsia="en-US" w:bidi="ar-SA"/>
+              <w:suppressAutoHyphens w:val="true"/>
+              <w:spacing w:before="0" w:after="0"/>
+              <w:rPr>
+                <w:rFonts w:ascii="Calibri Light" w:hAnsi="Calibri Light" w:asciiTheme="majorHAnsi" w:hAnsiTheme="majorHAnsi"/>
+              </w:rPr>
+            </w:pPr>
+            <w:r>
+              <w:rPr>
+                <w:rFonts w:asciiTheme="majorHAnsi" w:hAnsiTheme="majorHAnsi" w:ascii="Calibri Light" w:hAnsi="Calibri Light"/>
               </w:rPr>
             </w:r>
           </w:p>
@@ -6385,19 +6238,16 @@
             <w:pPr>
               <w:pStyle w:val="Normal"/>
               <w:widowControl/>
-              <w:spacing w:before="0" w:after="0"/>
-              <w:ind w:hanging="0"/>
-              <w:rPr>
-                <w:rFonts w:ascii="Calibri Light" w:hAnsi="Calibri Light" w:asciiTheme="majorHAnsi" w:hAnsiTheme="majorHAnsi"/>
-              </w:rPr>
-            </w:pPr>
-            <w:r>
-              <w:rPr>
-                <w:rFonts w:eastAsia="Calibri" w:cs="" w:ascii="Calibri Light" w:hAnsi="Calibri Light"/>
-                <w:kern w:val="0"/>
-                <w:sz w:val="24"/>
-                <w:szCs w:val="24"/>
-                <w:lang w:val="fr-FR" w:eastAsia="en-US" w:bidi="ar-SA"/>
+              <w:suppressAutoHyphens w:val="true"/>
+              <w:spacing w:before="0" w:after="0"/>
+              <w:ind w:hanging="0"/>
+              <w:rPr>
+                <w:rFonts w:ascii="Calibri Light" w:hAnsi="Calibri Light" w:asciiTheme="majorHAnsi" w:hAnsiTheme="majorHAnsi"/>
+              </w:rPr>
+            </w:pPr>
+            <w:r>
+              <w:rPr>
+                <w:rFonts w:asciiTheme="majorHAnsi" w:hAnsiTheme="majorHAnsi" w:ascii="Calibri Light" w:hAnsi="Calibri Light"/>
               </w:rPr>
             </w:r>
           </w:p>
@@ -6416,6 +6266,7 @@
             <w:pPr>
               <w:pStyle w:val="Normal"/>
               <w:widowControl/>
+              <w:suppressAutoHyphens w:val="true"/>
               <w:spacing w:before="0" w:after="0"/>
               <w:ind w:hanging="0"/>
               <w:rPr>
@@ -6437,19 +6288,16 @@
             <w:pPr>
               <w:pStyle w:val="Normal"/>
               <w:widowControl/>
-              <w:spacing w:before="0" w:after="0"/>
-              <w:ind w:hanging="0"/>
-              <w:rPr>
-                <w:rFonts w:ascii="Calibri Light" w:hAnsi="Calibri Light" w:asciiTheme="majorHAnsi" w:hAnsiTheme="majorHAnsi"/>
-              </w:rPr>
-            </w:pPr>
-            <w:r>
-              <w:rPr>
-                <w:rFonts w:eastAsia="Calibri" w:cs="" w:ascii="Calibri Light" w:hAnsi="Calibri Light"/>
-                <w:kern w:val="0"/>
-                <w:sz w:val="24"/>
-                <w:szCs w:val="24"/>
-                <w:lang w:val="fr-FR" w:eastAsia="en-US" w:bidi="ar-SA"/>
+              <w:suppressAutoHyphens w:val="true"/>
+              <w:spacing w:before="0" w:after="0"/>
+              <w:ind w:hanging="0"/>
+              <w:rPr>
+                <w:rFonts w:ascii="Calibri Light" w:hAnsi="Calibri Light" w:asciiTheme="majorHAnsi" w:hAnsiTheme="majorHAnsi"/>
+              </w:rPr>
+            </w:pPr>
+            <w:r>
+              <w:rPr>
+                <w:rFonts w:asciiTheme="majorHAnsi" w:hAnsiTheme="majorHAnsi" w:ascii="Calibri Light" w:hAnsi="Calibri Light"/>
               </w:rPr>
             </w:r>
           </w:p>
@@ -6463,18 +6311,15 @@
             <w:pPr>
               <w:pStyle w:val="Normal"/>
               <w:widowControl/>
-              <w:spacing w:before="0" w:after="0"/>
-              <w:rPr>
-                <w:rFonts w:ascii="Calibri Light" w:hAnsi="Calibri Light" w:asciiTheme="majorHAnsi" w:hAnsiTheme="majorHAnsi"/>
-              </w:rPr>
-            </w:pPr>
-            <w:r>
-              <w:rPr>
-                <w:rFonts w:eastAsia="Calibri" w:cs="" w:ascii="Calibri Light" w:hAnsi="Calibri Light"/>
-                <w:kern w:val="0"/>
-                <w:sz w:val="24"/>
-                <w:szCs w:val="24"/>
-                <w:lang w:val="fr-FR" w:eastAsia="en-US" w:bidi="ar-SA"/>
+              <w:suppressAutoHyphens w:val="true"/>
+              <w:spacing w:before="0" w:after="0"/>
+              <w:rPr>
+                <w:rFonts w:ascii="Calibri Light" w:hAnsi="Calibri Light" w:asciiTheme="majorHAnsi" w:hAnsiTheme="majorHAnsi"/>
+              </w:rPr>
+            </w:pPr>
+            <w:r>
+              <w:rPr>
+                <w:rFonts w:asciiTheme="majorHAnsi" w:hAnsiTheme="majorHAnsi" w:ascii="Calibri Light" w:hAnsi="Calibri Light"/>
               </w:rPr>
             </w:r>
           </w:p>
@@ -6488,19 +6333,16 @@
             <w:pPr>
               <w:pStyle w:val="Normal"/>
               <w:widowControl/>
-              <w:spacing w:before="0" w:after="0"/>
-              <w:ind w:hanging="0"/>
-              <w:rPr>
-                <w:rFonts w:ascii="Calibri Light" w:hAnsi="Calibri Light" w:asciiTheme="majorHAnsi" w:hAnsiTheme="majorHAnsi"/>
-              </w:rPr>
-            </w:pPr>
-            <w:r>
-              <w:rPr>
-                <w:rFonts w:eastAsia="Calibri" w:cs="" w:ascii="Calibri Light" w:hAnsi="Calibri Light"/>
-                <w:kern w:val="0"/>
-                <w:sz w:val="24"/>
-                <w:szCs w:val="24"/>
-                <w:lang w:val="fr-FR" w:eastAsia="en-US" w:bidi="ar-SA"/>
+              <w:suppressAutoHyphens w:val="true"/>
+              <w:spacing w:before="0" w:after="0"/>
+              <w:ind w:hanging="0"/>
+              <w:rPr>
+                <w:rFonts w:ascii="Calibri Light" w:hAnsi="Calibri Light" w:asciiTheme="majorHAnsi" w:hAnsiTheme="majorHAnsi"/>
+              </w:rPr>
+            </w:pPr>
+            <w:r>
+              <w:rPr>
+                <w:rFonts w:asciiTheme="majorHAnsi" w:hAnsiTheme="majorHAnsi" w:ascii="Calibri Light" w:hAnsi="Calibri Light"/>
               </w:rPr>
             </w:r>
           </w:p>
@@ -6519,6 +6361,7 @@
             <w:pPr>
               <w:pStyle w:val="Normal"/>
               <w:widowControl/>
+              <w:suppressAutoHyphens w:val="true"/>
               <w:spacing w:before="0" w:after="0"/>
               <w:ind w:hanging="0"/>
               <w:rPr>
@@ -6540,6 +6383,7 @@
             <w:pPr>
               <w:pStyle w:val="Normal"/>
               <w:widowControl/>
+              <w:suppressAutoHyphens w:val="true"/>
               <w:spacing w:before="0" w:after="0"/>
               <w:ind w:hanging="0"/>
               <w:rPr>
@@ -6567,19 +6411,16 @@
             <w:pPr>
               <w:pStyle w:val="Normal"/>
               <w:widowControl/>
-              <w:spacing w:before="0" w:after="0"/>
-              <w:ind w:hanging="0"/>
-              <w:rPr>
-                <w:rFonts w:ascii="Calibri Light" w:hAnsi="Calibri Light" w:asciiTheme="majorHAnsi" w:hAnsiTheme="majorHAnsi"/>
-              </w:rPr>
-            </w:pPr>
-            <w:r>
-              <w:rPr>
-                <w:rFonts w:eastAsia="Calibri" w:cs="" w:ascii="Calibri Light" w:hAnsi="Calibri Light"/>
-                <w:kern w:val="0"/>
-                <w:sz w:val="24"/>
-                <w:szCs w:val="24"/>
-                <w:lang w:val="fr-FR" w:eastAsia="en-US" w:bidi="ar-SA"/>
+              <w:suppressAutoHyphens w:val="true"/>
+              <w:spacing w:before="0" w:after="0"/>
+              <w:ind w:hanging="0"/>
+              <w:rPr>
+                <w:rFonts w:ascii="Calibri Light" w:hAnsi="Calibri Light" w:asciiTheme="majorHAnsi" w:hAnsiTheme="majorHAnsi"/>
+              </w:rPr>
+            </w:pPr>
+            <w:r>
+              <w:rPr>
+                <w:rFonts w:asciiTheme="majorHAnsi" w:hAnsiTheme="majorHAnsi" w:ascii="Calibri Light" w:hAnsi="Calibri Light"/>
               </w:rPr>
             </w:r>
           </w:p>
@@ -6593,19 +6434,16 @@
             <w:pPr>
               <w:pStyle w:val="Normal"/>
               <w:widowControl/>
-              <w:spacing w:before="0" w:after="0"/>
-              <w:ind w:hanging="0"/>
-              <w:rPr>
-                <w:rFonts w:ascii="Calibri Light" w:hAnsi="Calibri Light" w:asciiTheme="majorHAnsi" w:hAnsiTheme="majorHAnsi"/>
-              </w:rPr>
-            </w:pPr>
-            <w:r>
-              <w:rPr>
-                <w:rFonts w:eastAsia="Calibri" w:cs="" w:ascii="Calibri Light" w:hAnsi="Calibri Light"/>
-                <w:kern w:val="0"/>
-                <w:sz w:val="24"/>
-                <w:szCs w:val="24"/>
-                <w:lang w:val="fr-FR" w:eastAsia="en-US" w:bidi="ar-SA"/>
+              <w:suppressAutoHyphens w:val="true"/>
+              <w:spacing w:before="0" w:after="0"/>
+              <w:ind w:hanging="0"/>
+              <w:rPr>
+                <w:rFonts w:ascii="Calibri Light" w:hAnsi="Calibri Light" w:asciiTheme="majorHAnsi" w:hAnsiTheme="majorHAnsi"/>
+              </w:rPr>
+            </w:pPr>
+            <w:r>
+              <w:rPr>
+                <w:rFonts w:asciiTheme="majorHAnsi" w:hAnsiTheme="majorHAnsi" w:ascii="Calibri Light" w:hAnsi="Calibri Light"/>
               </w:rPr>
             </w:r>
           </w:p>
@@ -6658,6 +6496,7 @@
             <w:pPr>
               <w:pStyle w:val="Normal"/>
               <w:widowControl/>
+              <w:suppressAutoHyphens w:val="true"/>
               <w:spacing w:before="0" w:after="0"/>
               <w:ind w:hanging="0"/>
               <w:rPr>
@@ -6687,6 +6526,7 @@
             <w:pPr>
               <w:pStyle w:val="Normal"/>
               <w:widowControl/>
+              <w:suppressAutoHyphens w:val="true"/>
               <w:spacing w:before="0" w:after="0"/>
               <w:ind w:hanging="0"/>
               <w:rPr>
@@ -6716,6 +6556,7 @@
             <w:pPr>
               <w:pStyle w:val="Normal"/>
               <w:widowControl/>
+              <w:suppressAutoHyphens w:val="true"/>
               <w:spacing w:before="0" w:after="0"/>
               <w:ind w:hanging="0"/>
               <w:rPr>
@@ -6725,12 +6566,8 @@
             </w:pPr>
             <w:r>
               <w:rPr>
-                <w:rFonts w:eastAsia="Calibri" w:cs="" w:ascii="Calibri Light" w:hAnsi="Calibri Light"/>
+                <w:rFonts w:asciiTheme="majorHAnsi" w:hAnsiTheme="majorHAnsi" w:ascii="Calibri Light" w:hAnsi="Calibri Light"/>
                 <w:b/>
-                <w:kern w:val="0"/>
-                <w:sz w:val="24"/>
-                <w:szCs w:val="24"/>
-                <w:lang w:val="fr-FR" w:eastAsia="en-US" w:bidi="ar-SA"/>
               </w:rPr>
             </w:r>
           </w:p>
@@ -6749,6 +6586,7 @@
             <w:pPr>
               <w:pStyle w:val="Normal"/>
               <w:widowControl/>
+              <w:suppressAutoHyphens w:val="true"/>
               <w:spacing w:before="0" w:after="0"/>
               <w:ind w:hanging="0"/>
               <w:rPr>
@@ -6770,6 +6608,7 @@
             <w:pPr>
               <w:pStyle w:val="Normal"/>
               <w:widowControl/>
+              <w:suppressAutoHyphens w:val="true"/>
               <w:spacing w:before="0" w:after="0"/>
               <w:ind w:hanging="0"/>
               <w:rPr>
@@ -6797,19 +6636,16 @@
             <w:pPr>
               <w:pStyle w:val="Normal"/>
               <w:widowControl/>
-              <w:spacing w:before="0" w:after="0"/>
-              <w:ind w:hanging="0"/>
-              <w:rPr>
-                <w:rFonts w:ascii="Calibri Light" w:hAnsi="Calibri Light" w:asciiTheme="majorHAnsi" w:hAnsiTheme="majorHAnsi"/>
-              </w:rPr>
-            </w:pPr>
-            <w:r>
-              <w:rPr>
-                <w:rFonts w:eastAsia="Calibri" w:cs="" w:ascii="Calibri Light" w:hAnsi="Calibri Light"/>
-                <w:kern w:val="0"/>
-                <w:sz w:val="24"/>
-                <w:szCs w:val="24"/>
-                <w:lang w:val="fr-FR" w:eastAsia="en-US" w:bidi="ar-SA"/>
+              <w:suppressAutoHyphens w:val="true"/>
+              <w:spacing w:before="0" w:after="0"/>
+              <w:ind w:hanging="0"/>
+              <w:rPr>
+                <w:rFonts w:ascii="Calibri Light" w:hAnsi="Calibri Light" w:asciiTheme="majorHAnsi" w:hAnsiTheme="majorHAnsi"/>
+              </w:rPr>
+            </w:pPr>
+            <w:r>
+              <w:rPr>
+                <w:rFonts w:asciiTheme="majorHAnsi" w:hAnsiTheme="majorHAnsi" w:ascii="Calibri Light" w:hAnsi="Calibri Light"/>
               </w:rPr>
             </w:r>
           </w:p>
@@ -6823,19 +6659,16 @@
             <w:pPr>
               <w:pStyle w:val="Normal"/>
               <w:widowControl/>
-              <w:spacing w:before="0" w:after="0"/>
-              <w:ind w:hanging="0"/>
-              <w:rPr>
-                <w:rFonts w:ascii="Calibri Light" w:hAnsi="Calibri Light" w:asciiTheme="majorHAnsi" w:hAnsiTheme="majorHAnsi"/>
-              </w:rPr>
-            </w:pPr>
-            <w:r>
-              <w:rPr>
-                <w:rFonts w:eastAsia="Calibri" w:cs="" w:ascii="Calibri Light" w:hAnsi="Calibri Light"/>
-                <w:kern w:val="0"/>
-                <w:sz w:val="24"/>
-                <w:szCs w:val="24"/>
-                <w:lang w:val="fr-FR" w:eastAsia="en-US" w:bidi="ar-SA"/>
+              <w:suppressAutoHyphens w:val="true"/>
+              <w:spacing w:before="0" w:after="0"/>
+              <w:ind w:hanging="0"/>
+              <w:rPr>
+                <w:rFonts w:ascii="Calibri Light" w:hAnsi="Calibri Light" w:asciiTheme="majorHAnsi" w:hAnsiTheme="majorHAnsi"/>
+              </w:rPr>
+            </w:pPr>
+            <w:r>
+              <w:rPr>
+                <w:rFonts w:asciiTheme="majorHAnsi" w:hAnsiTheme="majorHAnsi" w:ascii="Calibri Light" w:hAnsi="Calibri Light"/>
               </w:rPr>
             </w:r>
           </w:p>
@@ -6852,6 +6685,7 @@
             <w:pPr>
               <w:pStyle w:val="Normal"/>
               <w:widowControl/>
+              <w:suppressAutoHyphens w:val="true"/>
               <w:spacing w:before="0" w:after="0"/>
               <w:ind w:hanging="0"/>
               <w:rPr>
@@ -6879,19 +6713,16 @@
             <w:pPr>
               <w:pStyle w:val="Normal"/>
               <w:widowControl/>
-              <w:spacing w:before="0" w:after="0"/>
-              <w:ind w:hanging="0"/>
-              <w:rPr>
-                <w:rFonts w:ascii="Calibri Light" w:hAnsi="Calibri Light" w:asciiTheme="majorHAnsi" w:hAnsiTheme="majorHAnsi"/>
-              </w:rPr>
-            </w:pPr>
-            <w:r>
-              <w:rPr>
-                <w:rFonts w:eastAsia="Calibri" w:cs="" w:ascii="Calibri Light" w:hAnsi="Calibri Light"/>
-                <w:kern w:val="0"/>
-                <w:sz w:val="24"/>
-                <w:szCs w:val="24"/>
-                <w:lang w:val="fr-FR" w:eastAsia="en-US" w:bidi="ar-SA"/>
+              <w:suppressAutoHyphens w:val="true"/>
+              <w:spacing w:before="0" w:after="0"/>
+              <w:ind w:hanging="0"/>
+              <w:rPr>
+                <w:rFonts w:ascii="Calibri Light" w:hAnsi="Calibri Light" w:asciiTheme="majorHAnsi" w:hAnsiTheme="majorHAnsi"/>
+              </w:rPr>
+            </w:pPr>
+            <w:r>
+              <w:rPr>
+                <w:rFonts w:asciiTheme="majorHAnsi" w:hAnsiTheme="majorHAnsi" w:ascii="Calibri Light" w:hAnsi="Calibri Light"/>
               </w:rPr>
             </w:r>
           </w:p>
@@ -6905,19 +6736,16 @@
             <w:pPr>
               <w:pStyle w:val="Normal"/>
               <w:widowControl/>
-              <w:spacing w:before="0" w:after="0"/>
-              <w:ind w:hanging="0"/>
-              <w:rPr>
-                <w:rFonts w:ascii="Calibri Light" w:hAnsi="Calibri Light" w:asciiTheme="majorHAnsi" w:hAnsiTheme="majorHAnsi"/>
-              </w:rPr>
-            </w:pPr>
-            <w:r>
-              <w:rPr>
-                <w:rFonts w:eastAsia="Calibri" w:cs="" w:ascii="Calibri Light" w:hAnsi="Calibri Light"/>
-                <w:kern w:val="0"/>
-                <w:sz w:val="24"/>
-                <w:szCs w:val="24"/>
-                <w:lang w:val="fr-FR" w:eastAsia="en-US" w:bidi="ar-SA"/>
+              <w:suppressAutoHyphens w:val="true"/>
+              <w:spacing w:before="0" w:after="0"/>
+              <w:ind w:hanging="0"/>
+              <w:rPr>
+                <w:rFonts w:ascii="Calibri Light" w:hAnsi="Calibri Light" w:asciiTheme="majorHAnsi" w:hAnsiTheme="majorHAnsi"/>
+              </w:rPr>
+            </w:pPr>
+            <w:r>
+              <w:rPr>
+                <w:rFonts w:asciiTheme="majorHAnsi" w:hAnsiTheme="majorHAnsi" w:ascii="Calibri Light" w:hAnsi="Calibri Light"/>
               </w:rPr>
             </w:r>
           </w:p>
@@ -6936,6 +6764,7 @@
             <w:pPr>
               <w:pStyle w:val="Normal"/>
               <w:widowControl/>
+              <w:suppressAutoHyphens w:val="true"/>
               <w:spacing w:before="0" w:after="0"/>
               <w:ind w:hanging="0"/>
               <w:rPr>
@@ -6957,6 +6786,7 @@
             <w:pPr>
               <w:pStyle w:val="Normal"/>
               <w:widowControl/>
+              <w:suppressAutoHyphens w:val="true"/>
               <w:spacing w:before="0" w:after="0"/>
               <w:ind w:hanging="0"/>
               <w:rPr>
@@ -6978,6 +6808,7 @@
             <w:pPr>
               <w:pStyle w:val="Normal"/>
               <w:widowControl/>
+              <w:suppressAutoHyphens w:val="true"/>
               <w:spacing w:before="0" w:after="0"/>
               <w:ind w:hanging="0"/>
               <w:rPr>
@@ -6999,6 +6830,7 @@
             <w:pPr>
               <w:pStyle w:val="Normal"/>
               <w:widowControl/>
+              <w:suppressAutoHyphens w:val="true"/>
               <w:spacing w:before="0" w:after="0"/>
               <w:ind w:hanging="0"/>
               <w:rPr>
@@ -7026,19 +6858,16 @@
             <w:pPr>
               <w:pStyle w:val="Normal"/>
               <w:widowControl/>
-              <w:spacing w:before="0" w:after="0"/>
-              <w:ind w:hanging="0"/>
-              <w:rPr>
-                <w:rFonts w:ascii="Calibri Light" w:hAnsi="Calibri Light" w:asciiTheme="majorHAnsi" w:hAnsiTheme="majorHAnsi"/>
-              </w:rPr>
-            </w:pPr>
-            <w:r>
-              <w:rPr>
-                <w:rFonts w:eastAsia="Calibri" w:cs="" w:ascii="Calibri Light" w:hAnsi="Calibri Light"/>
-                <w:kern w:val="0"/>
-                <w:sz w:val="24"/>
-                <w:szCs w:val="24"/>
-                <w:lang w:val="fr-FR" w:eastAsia="en-US" w:bidi="ar-SA"/>
+              <w:suppressAutoHyphens w:val="true"/>
+              <w:spacing w:before="0" w:after="0"/>
+              <w:ind w:hanging="0"/>
+              <w:rPr>
+                <w:rFonts w:ascii="Calibri Light" w:hAnsi="Calibri Light" w:asciiTheme="majorHAnsi" w:hAnsiTheme="majorHAnsi"/>
+              </w:rPr>
+            </w:pPr>
+            <w:r>
+              <w:rPr>
+                <w:rFonts w:asciiTheme="majorHAnsi" w:hAnsiTheme="majorHAnsi" w:ascii="Calibri Light" w:hAnsi="Calibri Light"/>
               </w:rPr>
             </w:r>
           </w:p>
@@ -7052,19 +6881,16 @@
             <w:pPr>
               <w:pStyle w:val="Normal"/>
               <w:widowControl/>
-              <w:spacing w:before="0" w:after="0"/>
-              <w:ind w:hanging="0"/>
-              <w:rPr>
-                <w:rFonts w:ascii="Calibri Light" w:hAnsi="Calibri Light" w:asciiTheme="majorHAnsi" w:hAnsiTheme="majorHAnsi"/>
-              </w:rPr>
-            </w:pPr>
-            <w:r>
-              <w:rPr>
-                <w:rFonts w:eastAsia="Calibri" w:cs="" w:ascii="Calibri Light" w:hAnsi="Calibri Light"/>
-                <w:kern w:val="0"/>
-                <w:sz w:val="24"/>
-                <w:szCs w:val="24"/>
-                <w:lang w:val="fr-FR" w:eastAsia="en-US" w:bidi="ar-SA"/>
+              <w:suppressAutoHyphens w:val="true"/>
+              <w:spacing w:before="0" w:after="0"/>
+              <w:ind w:hanging="0"/>
+              <w:rPr>
+                <w:rFonts w:ascii="Calibri Light" w:hAnsi="Calibri Light" w:asciiTheme="majorHAnsi" w:hAnsiTheme="majorHAnsi"/>
+              </w:rPr>
+            </w:pPr>
+            <w:r>
+              <w:rPr>
+                <w:rFonts w:asciiTheme="majorHAnsi" w:hAnsiTheme="majorHAnsi" w:ascii="Calibri Light" w:hAnsi="Calibri Light"/>
               </w:rPr>
             </w:r>
           </w:p>
@@ -7083,6 +6909,7 @@
             <w:pPr>
               <w:pStyle w:val="Normal"/>
               <w:widowControl/>
+              <w:suppressAutoHyphens w:val="true"/>
               <w:spacing w:before="0" w:after="0"/>
               <w:ind w:hanging="0"/>
               <w:rPr>
@@ -7104,6 +6931,7 @@
             <w:pPr>
               <w:pStyle w:val="Normal"/>
               <w:widowControl/>
+              <w:suppressAutoHyphens w:val="true"/>
               <w:spacing w:before="0" w:after="0"/>
               <w:ind w:hanging="0"/>
               <w:rPr>
@@ -7125,19 +6953,16 @@
             <w:pPr>
               <w:pStyle w:val="Normal"/>
               <w:widowControl/>
-              <w:spacing w:before="0" w:after="0"/>
-              <w:ind w:hanging="0"/>
-              <w:rPr>
-                <w:rFonts w:ascii="Calibri Light" w:hAnsi="Calibri Light" w:asciiTheme="majorHAnsi" w:hAnsiTheme="majorHAnsi"/>
-              </w:rPr>
-            </w:pPr>
-            <w:r>
-              <w:rPr>
-                <w:rFonts w:eastAsia="Calibri" w:cs="" w:ascii="Calibri Light" w:hAnsi="Calibri Light"/>
-                <w:kern w:val="0"/>
-                <w:sz w:val="24"/>
-                <w:szCs w:val="24"/>
-                <w:lang w:val="fr-FR" w:eastAsia="en-US" w:bidi="ar-SA"/>
+              <w:suppressAutoHyphens w:val="true"/>
+              <w:spacing w:before="0" w:after="0"/>
+              <w:ind w:hanging="0"/>
+              <w:rPr>
+                <w:rFonts w:ascii="Calibri Light" w:hAnsi="Calibri Light" w:asciiTheme="majorHAnsi" w:hAnsiTheme="majorHAnsi"/>
+              </w:rPr>
+            </w:pPr>
+            <w:r>
+              <w:rPr>
+                <w:rFonts w:asciiTheme="majorHAnsi" w:hAnsiTheme="majorHAnsi" w:ascii="Calibri Light" w:hAnsi="Calibri Light"/>
               </w:rPr>
             </w:r>
           </w:p>
@@ -7151,18 +6976,15 @@
             <w:pPr>
               <w:pStyle w:val="Normal"/>
               <w:widowControl/>
-              <w:spacing w:before="0" w:after="0"/>
-              <w:rPr>
-                <w:rFonts w:ascii="Calibri Light" w:hAnsi="Calibri Light" w:asciiTheme="majorHAnsi" w:hAnsiTheme="majorHAnsi"/>
-              </w:rPr>
-            </w:pPr>
-            <w:r>
-              <w:rPr>
-                <w:rFonts w:eastAsia="Calibri" w:cs="" w:ascii="Calibri Light" w:hAnsi="Calibri Light"/>
-                <w:kern w:val="0"/>
-                <w:sz w:val="24"/>
-                <w:szCs w:val="24"/>
-                <w:lang w:val="fr-FR" w:eastAsia="en-US" w:bidi="ar-SA"/>
+              <w:suppressAutoHyphens w:val="true"/>
+              <w:spacing w:before="0" w:after="0"/>
+              <w:rPr>
+                <w:rFonts w:ascii="Calibri Light" w:hAnsi="Calibri Light" w:asciiTheme="majorHAnsi" w:hAnsiTheme="majorHAnsi"/>
+              </w:rPr>
+            </w:pPr>
+            <w:r>
+              <w:rPr>
+                <w:rFonts w:asciiTheme="majorHAnsi" w:hAnsiTheme="majorHAnsi" w:ascii="Calibri Light" w:hAnsi="Calibri Light"/>
               </w:rPr>
             </w:r>
           </w:p>
@@ -7176,19 +6998,16 @@
             <w:pPr>
               <w:pStyle w:val="Normal"/>
               <w:widowControl/>
-              <w:spacing w:before="0" w:after="0"/>
-              <w:ind w:hanging="0"/>
-              <w:rPr>
-                <w:rFonts w:ascii="Calibri Light" w:hAnsi="Calibri Light" w:asciiTheme="majorHAnsi" w:hAnsiTheme="majorHAnsi"/>
-              </w:rPr>
-            </w:pPr>
-            <w:r>
-              <w:rPr>
-                <w:rFonts w:eastAsia="Calibri" w:cs="" w:ascii="Calibri Light" w:hAnsi="Calibri Light"/>
-                <w:kern w:val="0"/>
-                <w:sz w:val="24"/>
-                <w:szCs w:val="24"/>
-                <w:lang w:val="fr-FR" w:eastAsia="en-US" w:bidi="ar-SA"/>
+              <w:suppressAutoHyphens w:val="true"/>
+              <w:spacing w:before="0" w:after="0"/>
+              <w:ind w:hanging="0"/>
+              <w:rPr>
+                <w:rFonts w:ascii="Calibri Light" w:hAnsi="Calibri Light" w:asciiTheme="majorHAnsi" w:hAnsiTheme="majorHAnsi"/>
+              </w:rPr>
+            </w:pPr>
+            <w:r>
+              <w:rPr>
+                <w:rFonts w:asciiTheme="majorHAnsi" w:hAnsiTheme="majorHAnsi" w:ascii="Calibri Light" w:hAnsi="Calibri Light"/>
               </w:rPr>
             </w:r>
           </w:p>
@@ -7207,6 +7026,7 @@
             <w:pPr>
               <w:pStyle w:val="Normal"/>
               <w:widowControl/>
+              <w:suppressAutoHyphens w:val="true"/>
               <w:spacing w:before="0" w:after="0"/>
               <w:ind w:hanging="0"/>
               <w:rPr>
@@ -7228,19 +7048,16 @@
             <w:pPr>
               <w:pStyle w:val="Normal"/>
               <w:widowControl/>
-              <w:spacing w:before="0" w:after="0"/>
-              <w:ind w:hanging="0"/>
-              <w:rPr>
-                <w:rFonts w:ascii="Calibri Light" w:hAnsi="Calibri Light" w:asciiTheme="majorHAnsi" w:hAnsiTheme="majorHAnsi"/>
-              </w:rPr>
-            </w:pPr>
-            <w:r>
-              <w:rPr>
-                <w:rFonts w:eastAsia="Calibri" w:cs="" w:ascii="Calibri Light" w:hAnsi="Calibri Light"/>
-                <w:kern w:val="0"/>
-                <w:sz w:val="24"/>
-                <w:szCs w:val="24"/>
-                <w:lang w:val="fr-FR" w:eastAsia="en-US" w:bidi="ar-SA"/>
+              <w:suppressAutoHyphens w:val="true"/>
+              <w:spacing w:before="0" w:after="0"/>
+              <w:ind w:hanging="0"/>
+              <w:rPr>
+                <w:rFonts w:ascii="Calibri Light" w:hAnsi="Calibri Light" w:asciiTheme="majorHAnsi" w:hAnsiTheme="majorHAnsi"/>
+              </w:rPr>
+            </w:pPr>
+            <w:r>
+              <w:rPr>
+                <w:rFonts w:asciiTheme="majorHAnsi" w:hAnsiTheme="majorHAnsi" w:ascii="Calibri Light" w:hAnsi="Calibri Light"/>
               </w:rPr>
             </w:r>
           </w:p>
@@ -7254,18 +7071,15 @@
             <w:pPr>
               <w:pStyle w:val="Normal"/>
               <w:widowControl/>
-              <w:spacing w:before="0" w:after="0"/>
-              <w:rPr>
-                <w:rFonts w:ascii="Calibri Light" w:hAnsi="Calibri Light" w:asciiTheme="majorHAnsi" w:hAnsiTheme="majorHAnsi"/>
-              </w:rPr>
-            </w:pPr>
-            <w:r>
-              <w:rPr>
-                <w:rFonts w:eastAsia="Calibri" w:cs="" w:ascii="Calibri Light" w:hAnsi="Calibri Light"/>
-                <w:kern w:val="0"/>
-                <w:sz w:val="24"/>
-                <w:szCs w:val="24"/>
-                <w:lang w:val="fr-FR" w:eastAsia="en-US" w:bidi="ar-SA"/>
+              <w:suppressAutoHyphens w:val="true"/>
+              <w:spacing w:before="0" w:after="0"/>
+              <w:rPr>
+                <w:rFonts w:ascii="Calibri Light" w:hAnsi="Calibri Light" w:asciiTheme="majorHAnsi" w:hAnsiTheme="majorHAnsi"/>
+              </w:rPr>
+            </w:pPr>
+            <w:r>
+              <w:rPr>
+                <w:rFonts w:asciiTheme="majorHAnsi" w:hAnsiTheme="majorHAnsi" w:ascii="Calibri Light" w:hAnsi="Calibri Light"/>
               </w:rPr>
             </w:r>
           </w:p>
@@ -7279,19 +7093,16 @@
             <w:pPr>
               <w:pStyle w:val="Normal"/>
               <w:widowControl/>
-              <w:spacing w:before="0" w:after="0"/>
-              <w:ind w:hanging="0"/>
-              <w:rPr>
-                <w:rFonts w:ascii="Calibri Light" w:hAnsi="Calibri Light" w:asciiTheme="majorHAnsi" w:hAnsiTheme="majorHAnsi"/>
-              </w:rPr>
-            </w:pPr>
-            <w:r>
-              <w:rPr>
-                <w:rFonts w:eastAsia="Calibri" w:cs="" w:ascii="Calibri Light" w:hAnsi="Calibri Light"/>
-                <w:kern w:val="0"/>
-                <w:sz w:val="24"/>
-                <w:szCs w:val="24"/>
-                <w:lang w:val="fr-FR" w:eastAsia="en-US" w:bidi="ar-SA"/>
+              <w:suppressAutoHyphens w:val="true"/>
+              <w:spacing w:before="0" w:after="0"/>
+              <w:ind w:hanging="0"/>
+              <w:rPr>
+                <w:rFonts w:ascii="Calibri Light" w:hAnsi="Calibri Light" w:asciiTheme="majorHAnsi" w:hAnsiTheme="majorHAnsi"/>
+              </w:rPr>
+            </w:pPr>
+            <w:r>
+              <w:rPr>
+                <w:rFonts w:asciiTheme="majorHAnsi" w:hAnsiTheme="majorHAnsi" w:ascii="Calibri Light" w:hAnsi="Calibri Light"/>
               </w:rPr>
             </w:r>
           </w:p>
@@ -7310,6 +7121,7 @@
             <w:pPr>
               <w:pStyle w:val="Normal"/>
               <w:widowControl/>
+              <w:suppressAutoHyphens w:val="true"/>
               <w:spacing w:before="0" w:after="0"/>
               <w:ind w:hanging="0"/>
               <w:rPr>
@@ -7331,6 +7143,7 @@
             <w:pPr>
               <w:pStyle w:val="Normal"/>
               <w:widowControl/>
+              <w:suppressAutoHyphens w:val="true"/>
               <w:spacing w:before="0" w:after="0"/>
               <w:ind w:hanging="0"/>
               <w:rPr>
@@ -7358,19 +7171,16 @@
             <w:pPr>
               <w:pStyle w:val="Normal"/>
               <w:widowControl/>
-              <w:spacing w:before="0" w:after="0"/>
-              <w:ind w:hanging="0"/>
-              <w:rPr>
-                <w:rFonts w:ascii="Calibri Light" w:hAnsi="Calibri Light" w:asciiTheme="majorHAnsi" w:hAnsiTheme="majorHAnsi"/>
-              </w:rPr>
-            </w:pPr>
-            <w:r>
-              <w:rPr>
-                <w:rFonts w:eastAsia="Calibri" w:cs="" w:ascii="Calibri Light" w:hAnsi="Calibri Light"/>
-                <w:kern w:val="0"/>
-                <w:sz w:val="24"/>
-                <w:szCs w:val="24"/>
-                <w:lang w:val="fr-FR" w:eastAsia="en-US" w:bidi="ar-SA"/>
+              <w:suppressAutoHyphens w:val="true"/>
+              <w:spacing w:before="0" w:after="0"/>
+              <w:ind w:hanging="0"/>
+              <w:rPr>
+                <w:rFonts w:ascii="Calibri Light" w:hAnsi="Calibri Light" w:asciiTheme="majorHAnsi" w:hAnsiTheme="majorHAnsi"/>
+              </w:rPr>
+            </w:pPr>
+            <w:r>
+              <w:rPr>
+                <w:rFonts w:asciiTheme="majorHAnsi" w:hAnsiTheme="majorHAnsi" w:ascii="Calibri Light" w:hAnsi="Calibri Light"/>
               </w:rPr>
             </w:r>
           </w:p>
@@ -7384,19 +7194,16 @@
             <w:pPr>
               <w:pStyle w:val="Normal"/>
               <w:widowControl/>
-              <w:spacing w:before="0" w:after="0"/>
-              <w:ind w:hanging="0"/>
-              <w:rPr>
-                <w:rFonts w:ascii="Calibri Light" w:hAnsi="Calibri Light" w:asciiTheme="majorHAnsi" w:hAnsiTheme="majorHAnsi"/>
-              </w:rPr>
-            </w:pPr>
-            <w:r>
-              <w:rPr>
-                <w:rFonts w:eastAsia="Calibri" w:cs="" w:ascii="Calibri Light" w:hAnsi="Calibri Light"/>
-                <w:kern w:val="0"/>
-                <w:sz w:val="24"/>
-                <w:szCs w:val="24"/>
-                <w:lang w:val="fr-FR" w:eastAsia="en-US" w:bidi="ar-SA"/>
+              <w:suppressAutoHyphens w:val="true"/>
+              <w:spacing w:before="0" w:after="0"/>
+              <w:ind w:hanging="0"/>
+              <w:rPr>
+                <w:rFonts w:ascii="Calibri Light" w:hAnsi="Calibri Light" w:asciiTheme="majorHAnsi" w:hAnsiTheme="majorHAnsi"/>
+              </w:rPr>
+            </w:pPr>
+            <w:r>
+              <w:rPr>
+                <w:rFonts w:asciiTheme="majorHAnsi" w:hAnsiTheme="majorHAnsi" w:ascii="Calibri Light" w:hAnsi="Calibri Light"/>
               </w:rPr>
             </w:r>
           </w:p>
@@ -7442,7 +7249,7 @@
           <w:b w:val="false"/>
         </w:rPr>
       </w:pPr>
-      <w:bookmarkStart w:id="7" w:name="_Toc61806045"/>
+      <w:bookmarkStart w:id="5" w:name="_Toc61806045"/>
       <w:r>
         <w:rPr>
           <w:rFonts w:cs="Gill Sans" w:ascii="Avenir Next Regular" w:hAnsi="Avenir Next Regular"/>
@@ -7450,7 +7257,7 @@
         </w:rPr>
         <w:t>Bilan</w:t>
       </w:r>
-      <w:bookmarkEnd w:id="7"/>
+      <w:bookmarkEnd w:id="5"/>
     </w:p>
     <w:p>
       <w:pPr>
@@ -7610,12 +7417,10 @@
     </w:pPr>
     <w:r>
       <w:rPr/>
-    </w:r>
-    <w:r>
       <mc:AlternateContent>
         <mc:Choice Requires="wps">
           <w:drawing>
-            <wp:anchor behindDoc="0" distT="0" distB="0" distL="0" distR="0" simplePos="0" locked="0" layoutInCell="1" allowOverlap="1" relativeHeight="0">
+            <wp:anchor behindDoc="1" distT="0" distB="0" distL="0" distR="0" simplePos="0" locked="0" layoutInCell="0" allowOverlap="1" relativeHeight="3">
               <wp:simplePos x="0" y="0"/>
               <wp:positionH relativeFrom="margin">
                 <wp:align>center</wp:align>
@@ -7630,25 +7435,31 @@
               <a:graphic xmlns:a="http://schemas.openxmlformats.org/drawingml/2006/main">
                 <a:graphicData uri="http://schemas.microsoft.com/office/word/2010/wordprocessingShape">
                   <wps:wsp>
-                    <wps:cNvSpPr txBox="1"/>
+                    <wps:cNvSpPr/>
                     <wps:spPr>
                       <a:xfrm>
                         <a:off x="0" y="0"/>
-                        <a:ext cx="14605" cy="14605"/>
+                        <a:ext cx="14760" cy="14760"/>
                       </a:xfrm>
-                      <a:prstGeom prst="rect"/>
-                      <a:solidFill>
-                        <a:srgbClr val="FFFFFF">
-                          <a:alpha val="0"/>
-                        </a:srgbClr>
-                      </a:solidFill>
+                      <a:prstGeom prst="rect">
+                        <a:avLst/>
+                      </a:prstGeom>
+                      <a:noFill/>
+                      <a:ln w="0">
+                        <a:noFill/>
+                      </a:ln>
                     </wps:spPr>
+                    <wps:style>
+                      <a:lnRef idx="0"/>
+                      <a:fillRef idx="0"/>
+                      <a:effectRef idx="0"/>
+                      <a:fontRef idx="minor"/>
+                    </wps:style>
                     <wps:txbx>
                       <w:txbxContent>
                         <w:p>
                           <w:pPr>
                             <w:pStyle w:val="Footer"/>
-                            <w:pBdr/>
                             <w:rPr>
                               <w:rStyle w:val="PageNumber"/>
                             </w:rPr>
@@ -7686,7 +7497,7 @@
                         </w:p>
                       </w:txbxContent>
                     </wps:txbx>
-                    <wps:bodyPr anchor="t" lIns="0" tIns="0" rIns="0" bIns="0">
+                    <wps:bodyPr lIns="0" rIns="0" tIns="0" bIns="0" anchor="t">
                       <a:spAutoFit/>
                     </wps:bodyPr>
                   </wps:wsp>
@@ -7697,14 +7508,14 @@
         </mc:Choice>
         <mc:Fallback>
           <w:pict>
-            <v:rect fillcolor="#FFFFFF" style="position:absolute;rotation:-0;width:1.15pt;height:1.15pt;mso-wrap-distance-left:0pt;mso-wrap-distance-right:0pt;mso-wrap-distance-top:0pt;mso-wrap-distance-bottom:0pt;margin-top:0.05pt;mso-position-vertical-relative:text;margin-left:0pt;mso-position-horizontal:center;mso-position-horizontal-relative:margin">
-              <v:fill opacity="0f"/>
-              <v:textbox inset="0in,0in,0in,0in">
+            <v:rect id="shape_0" ID="Cadre1" path="m0,0l-2147483645,0l-2147483645,-2147483646l0,-2147483646xe" fillcolor="white" stroked="f" o:allowincell="f" style="position:absolute;margin-left:0pt;margin-top:0.05pt;width:1.1pt;height:1.1pt;mso-wrap-style:square;v-text-anchor:top;mso-position-horizontal:center;mso-position-horizontal-relative:margin">
+              <v:fill o:detectmouseclick="t" type="solid" color2="black" opacity="0"/>
+              <v:stroke color="#3465a4" joinstyle="round" endcap="flat"/>
+              <v:textbox>
                 <w:txbxContent>
                   <w:p>
                     <w:pPr>
                       <w:pStyle w:val="Footer"/>
-                      <w:pBdr/>
                       <w:rPr>
                         <w:rStyle w:val="PageNumber"/>
                       </w:rPr>
@@ -7761,12 +7572,10 @@
     </w:pPr>
     <w:r>
       <w:rPr/>
-    </w:r>
-    <w:r>
       <mc:AlternateContent>
         <mc:Choice Requires="wps">
           <w:drawing>
-            <wp:anchor behindDoc="0" distT="0" distB="0" distL="0" distR="0" simplePos="0" locked="0" layoutInCell="0" allowOverlap="1" relativeHeight="14">
+            <wp:anchor behindDoc="1" distT="0" distB="0" distL="0" distR="0" simplePos="0" locked="0" layoutInCell="0" allowOverlap="1" relativeHeight="24">
               <wp:simplePos x="0" y="0"/>
               <wp:positionH relativeFrom="margin">
                 <wp:align>center</wp:align>
@@ -7774,32 +7583,38 @@
               <wp:positionV relativeFrom="paragraph">
                 <wp:posOffset>635</wp:posOffset>
               </wp:positionV>
-              <wp:extent cx="625475" cy="207645"/>
+              <wp:extent cx="625475" cy="206375"/>
               <wp:effectExtent l="0" t="0" r="0" b="0"/>
               <wp:wrapSquare wrapText="bothSides"/>
               <wp:docPr id="4" name="Cadre2"/>
               <a:graphic xmlns:a="http://schemas.openxmlformats.org/drawingml/2006/main">
                 <a:graphicData uri="http://schemas.microsoft.com/office/word/2010/wordprocessingShape">
                   <wps:wsp>
-                    <wps:cNvSpPr txBox="1"/>
+                    <wps:cNvSpPr/>
                     <wps:spPr>
                       <a:xfrm>
                         <a:off x="0" y="0"/>
-                        <a:ext cx="625475" cy="207645"/>
+                        <a:ext cx="625320" cy="206280"/>
                       </a:xfrm>
-                      <a:prstGeom prst="rect"/>
-                      <a:solidFill>
-                        <a:srgbClr val="FFFFFF">
-                          <a:alpha val="0"/>
-                        </a:srgbClr>
-                      </a:solidFill>
+                      <a:prstGeom prst="rect">
+                        <a:avLst/>
+                      </a:prstGeom>
+                      <a:noFill/>
+                      <a:ln w="0">
+                        <a:noFill/>
+                      </a:ln>
                     </wps:spPr>
+                    <wps:style>
+                      <a:lnRef idx="0"/>
+                      <a:fillRef idx="0"/>
+                      <a:effectRef idx="0"/>
+                      <a:fontRef idx="minor"/>
+                    </wps:style>
                     <wps:txbx>
                       <w:txbxContent>
                         <w:p>
                           <w:pPr>
                             <w:pStyle w:val="Footer"/>
-                            <w:pBdr/>
                             <w:rPr>
                               <w:rStyle w:val="PageNumber"/>
                             </w:rPr>
@@ -7837,7 +7652,7 @@
                         </w:p>
                       </w:txbxContent>
                     </wps:txbx>
-                    <wps:bodyPr anchor="t" lIns="0" tIns="0" rIns="0" bIns="0">
+                    <wps:bodyPr lIns="0" rIns="0" tIns="0" bIns="0" anchor="t">
                       <a:spAutoFit/>
                     </wps:bodyPr>
                   </wps:wsp>
@@ -7848,14 +7663,14 @@
         </mc:Choice>
         <mc:Fallback>
           <w:pict>
-            <v:rect fillcolor="#FFFFFF" style="position:absolute;rotation:-0;width:49.25pt;height:16.35pt;mso-wrap-distance-left:0pt;mso-wrap-distance-right:0pt;mso-wrap-distance-top:0pt;mso-wrap-distance-bottom:0pt;margin-top:0.05pt;mso-position-vertical-relative:text;margin-left:202.2pt;mso-position-horizontal:center;mso-position-horizontal-relative:margin">
-              <v:fill opacity="0f"/>
-              <v:textbox inset="0in,0in,0in,0in">
+            <v:rect id="shape_0" ID="Cadre2" path="m0,0l-2147483645,0l-2147483645,-2147483646l0,-2147483646xe" fillcolor="white" stroked="f" o:allowincell="f" style="position:absolute;margin-left:202.15pt;margin-top:0.05pt;width:49.2pt;height:16.2pt;mso-wrap-style:square;v-text-anchor:top;mso-position-horizontal:center;mso-position-horizontal-relative:margin">
+              <v:fill o:detectmouseclick="t" type="solid" color2="black" opacity="0"/>
+              <v:stroke color="#3465a4" joinstyle="round" endcap="flat"/>
+              <v:textbox>
                 <w:txbxContent>
                   <w:p>
                     <w:pPr>
                       <w:pStyle w:val="Footer"/>
-                      <w:pBdr/>
                       <w:rPr>
                         <w:rStyle w:val="PageNumber"/>
                       </w:rPr>
@@ -8224,6 +8039,7 @@
     <w:rsid w:val="00597832"/>
     <w:pPr>
       <w:widowControl/>
+      <w:suppressAutoHyphens w:val="true"/>
       <w:bidi w:val="0"/>
       <w:spacing w:before="0" w:after="0"/>
       <w:ind w:firstLine="709"/>
@@ -8258,7 +8074,7 @@
       <w:outlineLvl w:val="0"/>
     </w:pPr>
     <w:rPr>
-      <w:rFonts w:eastAsia="游ゴシック Light" w:cs="Times New Roman (Titres CS)" w:eastAsiaTheme="majorEastAsia"/>
+      <w:rFonts w:eastAsia="" w:cs="Times New Roman (Titres CS)" w:eastAsiaTheme="majorEastAsia"/>
       <w:b/>
       <w:color w:themeColor="background2" w:themeShade="40" w:val="0070C0"/>
       <w:sz w:val="32"/>
@@ -8330,7 +8146,7 @@
       <w:outlineLvl w:val="3"/>
     </w:pPr>
     <w:rPr>
-      <w:rFonts w:ascii="Calibri Light" w:hAnsi="Calibri Light" w:eastAsia="游ゴシック Light" w:cs="" w:asciiTheme="majorHAnsi" w:cstheme="majorBidi" w:eastAsiaTheme="majorEastAsia" w:hAnsiTheme="majorHAnsi"/>
+      <w:rFonts w:ascii="Calibri Light" w:hAnsi="Calibri Light" w:eastAsia="" w:cs="" w:asciiTheme="majorHAnsi" w:cstheme="majorBidi" w:eastAsiaTheme="majorEastAsia" w:hAnsiTheme="majorHAnsi"/>
       <w:i/>
       <w:iCs/>
       <w:color w:themeColor="accent1" w:themeShade="bf" w:val="2F5496"/>
@@ -8357,7 +8173,7 @@
       <w:outlineLvl w:val="4"/>
     </w:pPr>
     <w:rPr>
-      <w:rFonts w:ascii="Calibri Light" w:hAnsi="Calibri Light" w:eastAsia="游ゴシック Light" w:cs="" w:asciiTheme="majorHAnsi" w:cstheme="majorBidi" w:eastAsiaTheme="majorEastAsia" w:hAnsiTheme="majorHAnsi"/>
+      <w:rFonts w:ascii="Calibri Light" w:hAnsi="Calibri Light" w:eastAsia="" w:cs="" w:asciiTheme="majorHAnsi" w:cstheme="majorBidi" w:eastAsiaTheme="majorEastAsia" w:hAnsiTheme="majorHAnsi"/>
       <w:color w:themeColor="accent1" w:themeShade="bf" w:val="2F5496"/>
     </w:rPr>
   </w:style>
@@ -8382,7 +8198,7 @@
       <w:outlineLvl w:val="5"/>
     </w:pPr>
     <w:rPr>
-      <w:rFonts w:ascii="Calibri Light" w:hAnsi="Calibri Light" w:eastAsia="游ゴシック Light" w:cs="" w:asciiTheme="majorHAnsi" w:cstheme="majorBidi" w:eastAsiaTheme="majorEastAsia" w:hAnsiTheme="majorHAnsi"/>
+      <w:rFonts w:ascii="Calibri Light" w:hAnsi="Calibri Light" w:eastAsia="" w:cs="" w:asciiTheme="majorHAnsi" w:cstheme="majorBidi" w:eastAsiaTheme="majorEastAsia" w:hAnsiTheme="majorHAnsi"/>
       <w:color w:themeColor="accent1" w:themeShade="7f" w:val="1F3763"/>
     </w:rPr>
   </w:style>
@@ -8407,7 +8223,7 @@
       <w:outlineLvl w:val="6"/>
     </w:pPr>
     <w:rPr>
-      <w:rFonts w:ascii="Calibri Light" w:hAnsi="Calibri Light" w:eastAsia="游ゴシック Light" w:cs="" w:asciiTheme="majorHAnsi" w:cstheme="majorBidi" w:eastAsiaTheme="majorEastAsia" w:hAnsiTheme="majorHAnsi"/>
+      <w:rFonts w:ascii="Calibri Light" w:hAnsi="Calibri Light" w:eastAsia="" w:cs="" w:asciiTheme="majorHAnsi" w:cstheme="majorBidi" w:eastAsiaTheme="majorEastAsia" w:hAnsiTheme="majorHAnsi"/>
       <w:i/>
       <w:iCs/>
       <w:color w:themeColor="accent1" w:themeShade="7f" w:val="1F3763"/>
@@ -8434,7 +8250,7 @@
       <w:outlineLvl w:val="7"/>
     </w:pPr>
     <w:rPr>
-      <w:rFonts w:ascii="Calibri Light" w:hAnsi="Calibri Light" w:eastAsia="游ゴシック Light" w:cs="" w:asciiTheme="majorHAnsi" w:cstheme="majorBidi" w:eastAsiaTheme="majorEastAsia" w:hAnsiTheme="majorHAnsi"/>
+      <w:rFonts w:ascii="Calibri Light" w:hAnsi="Calibri Light" w:eastAsia="" w:cs="" w:asciiTheme="majorHAnsi" w:cstheme="majorBidi" w:eastAsiaTheme="majorEastAsia" w:hAnsiTheme="majorHAnsi"/>
       <w:color w:themeColor="text1" w:themeTint="d8" w:val="272727"/>
       <w:sz w:val="21"/>
       <w:szCs w:val="21"/>
@@ -8461,7 +8277,7 @@
       <w:outlineLvl w:val="8"/>
     </w:pPr>
     <w:rPr>
-      <w:rFonts w:ascii="Calibri Light" w:hAnsi="Calibri Light" w:eastAsia="游ゴシック Light" w:cs="" w:asciiTheme="majorHAnsi" w:cstheme="majorBidi" w:eastAsiaTheme="majorEastAsia" w:hAnsiTheme="majorHAnsi"/>
+      <w:rFonts w:ascii="Calibri Light" w:hAnsi="Calibri Light" w:eastAsia="" w:cs="" w:asciiTheme="majorHAnsi" w:cstheme="majorBidi" w:eastAsiaTheme="majorEastAsia" w:hAnsiTheme="majorHAnsi"/>
       <w:i/>
       <w:iCs/>
       <w:color w:themeColor="text1" w:themeTint="d8" w:val="272727"/>
@@ -8508,7 +8324,7 @@
     <w:qFormat/>
     <w:rsid w:val="006a0525"/>
     <w:rPr>
-      <w:rFonts w:ascii="Times New Roman" w:hAnsi="Times New Roman" w:eastAsia="游ゴシック Light" w:cs="Times New Roman (Titres CS)" w:eastAsiaTheme="majorEastAsia"/>
+      <w:rFonts w:ascii="Times New Roman" w:hAnsi="Times New Roman" w:eastAsia="" w:cs="Times New Roman (Titres CS)" w:eastAsiaTheme="majorEastAsia"/>
       <w:b/>
       <w:color w:val="0070C0"/>
       <w:sz w:val="32"/>
@@ -8522,7 +8338,7 @@
     <w:qFormat/>
     <w:rsid w:val="006a0525"/>
     <w:rPr>
-      <w:rFonts w:ascii="Times New Roman" w:hAnsi="Times New Roman" w:eastAsia="游ゴシック Light" w:cs="Times New Roman (Titres CS)" w:eastAsiaTheme="majorEastAsia"/>
+      <w:rFonts w:ascii="Times New Roman" w:hAnsi="Times New Roman" w:eastAsia="" w:cs="Times New Roman (Titres CS)" w:eastAsiaTheme="majorEastAsia"/>
       <w:b/>
       <w:color w:val="0070C0"/>
       <w:sz w:val="26"/>
@@ -8536,7 +8352,7 @@
     <w:qFormat/>
     <w:rsid w:val="006a0525"/>
     <w:rPr>
-      <w:rFonts w:ascii="Times New Roman" w:hAnsi="Times New Roman" w:eastAsia="游ゴシック Light" w:cs="" w:cstheme="majorBidi" w:eastAsiaTheme="majorEastAsia"/>
+      <w:rFonts w:ascii="Times New Roman" w:hAnsi="Times New Roman" w:eastAsia="" w:cs="" w:cstheme="majorBidi" w:eastAsiaTheme="majorEastAsia"/>
       <w:b/>
       <w:color w:val="0070C0"/>
       <w:sz w:val="26"/>
@@ -8551,7 +8367,7 @@
     <w:qFormat/>
     <w:rsid w:val="000c4236"/>
     <w:rPr>
-      <w:rFonts w:ascii="Calibri Light" w:hAnsi="Calibri Light" w:eastAsia="游ゴシック Light" w:cs="" w:asciiTheme="majorHAnsi" w:cstheme="majorBidi" w:eastAsiaTheme="majorEastAsia" w:hAnsiTheme="majorHAnsi"/>
+      <w:rFonts w:ascii="Calibri Light" w:hAnsi="Calibri Light" w:eastAsia="" w:cs="" w:asciiTheme="majorHAnsi" w:cstheme="majorBidi" w:eastAsiaTheme="majorEastAsia" w:hAnsiTheme="majorHAnsi"/>
       <w:i/>
       <w:iCs/>
       <w:color w:themeColor="accent1" w:themeShade="bf" w:val="2F5496"/>
@@ -8565,7 +8381,7 @@
     <w:qFormat/>
     <w:rsid w:val="000c4236"/>
     <w:rPr>
-      <w:rFonts w:ascii="Calibri Light" w:hAnsi="Calibri Light" w:eastAsia="游ゴシック Light" w:cs="" w:asciiTheme="majorHAnsi" w:cstheme="majorBidi" w:eastAsiaTheme="majorEastAsia" w:hAnsiTheme="majorHAnsi"/>
+      <w:rFonts w:ascii="Calibri Light" w:hAnsi="Calibri Light" w:eastAsia="" w:cs="" w:asciiTheme="majorHAnsi" w:cstheme="majorBidi" w:eastAsiaTheme="majorEastAsia" w:hAnsiTheme="majorHAnsi"/>
       <w:color w:themeColor="accent1" w:themeShade="bf" w:val="2F5496"/>
     </w:rPr>
   </w:style>
@@ -8577,7 +8393,7 @@
     <w:qFormat/>
     <w:rsid w:val="000c4236"/>
     <w:rPr>
-      <w:rFonts w:ascii="Calibri Light" w:hAnsi="Calibri Light" w:eastAsia="游ゴシック Light" w:cs="" w:asciiTheme="majorHAnsi" w:cstheme="majorBidi" w:eastAsiaTheme="majorEastAsia" w:hAnsiTheme="majorHAnsi"/>
+      <w:rFonts w:ascii="Calibri Light" w:hAnsi="Calibri Light" w:eastAsia="" w:cs="" w:asciiTheme="majorHAnsi" w:cstheme="majorBidi" w:eastAsiaTheme="majorEastAsia" w:hAnsiTheme="majorHAnsi"/>
       <w:color w:themeColor="accent1" w:themeShade="7f" w:val="1F3763"/>
     </w:rPr>
   </w:style>
@@ -8589,7 +8405,7 @@
     <w:qFormat/>
     <w:rsid w:val="000c4236"/>
     <w:rPr>
-      <w:rFonts w:ascii="Calibri Light" w:hAnsi="Calibri Light" w:eastAsia="游ゴシック Light" w:cs="" w:asciiTheme="majorHAnsi" w:cstheme="majorBidi" w:eastAsiaTheme="majorEastAsia" w:hAnsiTheme="majorHAnsi"/>
+      <w:rFonts w:ascii="Calibri Light" w:hAnsi="Calibri Light" w:eastAsia="" w:cs="" w:asciiTheme="majorHAnsi" w:cstheme="majorBidi" w:eastAsiaTheme="majorEastAsia" w:hAnsiTheme="majorHAnsi"/>
       <w:i/>
       <w:iCs/>
       <w:color w:themeColor="accent1" w:themeShade="7f" w:val="1F3763"/>
@@ -8603,7 +8419,7 @@
     <w:qFormat/>
     <w:rsid w:val="000c4236"/>
     <w:rPr>
-      <w:rFonts w:ascii="Calibri Light" w:hAnsi="Calibri Light" w:eastAsia="游ゴシック Light" w:cs="" w:asciiTheme="majorHAnsi" w:cstheme="majorBidi" w:eastAsiaTheme="majorEastAsia" w:hAnsiTheme="majorHAnsi"/>
+      <w:rFonts w:ascii="Calibri Light" w:hAnsi="Calibri Light" w:eastAsia="" w:cs="" w:asciiTheme="majorHAnsi" w:cstheme="majorBidi" w:eastAsiaTheme="majorEastAsia" w:hAnsiTheme="majorHAnsi"/>
       <w:color w:themeColor="text1" w:themeTint="d8" w:val="272727"/>
       <w:sz w:val="21"/>
       <w:szCs w:val="21"/>
@@ -8617,7 +8433,7 @@
     <w:qFormat/>
     <w:rsid w:val="000c4236"/>
     <w:rPr>
-      <w:rFonts w:ascii="Calibri Light" w:hAnsi="Calibri Light" w:eastAsia="游ゴシック Light" w:cs="" w:asciiTheme="majorHAnsi" w:cstheme="majorBidi" w:eastAsiaTheme="majorEastAsia" w:hAnsiTheme="majorHAnsi"/>
+      <w:rFonts w:ascii="Calibri Light" w:hAnsi="Calibri Light" w:eastAsia="" w:cs="" w:asciiTheme="majorHAnsi" w:cstheme="majorBidi" w:eastAsiaTheme="majorEastAsia" w:hAnsiTheme="majorHAnsi"/>
       <w:i/>
       <w:iCs/>
       <w:color w:themeColor="text1" w:themeTint="d8" w:val="272727"/>
@@ -8632,7 +8448,7 @@
     <w:qFormat/>
     <w:rsid w:val="00ec4257"/>
     <w:rPr>
-      <w:rFonts w:ascii="Times New Roman" w:hAnsi="Times New Roman" w:eastAsia="游明朝" w:eastAsiaTheme="minorEastAsia"/>
+      <w:rFonts w:ascii="Times New Roman" w:hAnsi="Times New Roman" w:eastAsia="" w:eastAsiaTheme="minorEastAsia"/>
       <w:i/>
       <w:color w:val="37BCF3"/>
       <w:spacing w:val="15"/>
@@ -8646,7 +8462,7 @@
     <w:qFormat/>
     <w:rsid w:val="006a0525"/>
     <w:rPr>
-      <w:rFonts w:ascii="Times New Roman" w:hAnsi="Times New Roman" w:eastAsia="游ゴシック Light" w:cs="" w:cstheme="majorBidi" w:eastAsiaTheme="majorEastAsia"/>
+      <w:rFonts w:ascii="Times New Roman" w:hAnsi="Times New Roman" w:eastAsia="" w:cs="" w:cstheme="majorBidi" w:eastAsiaTheme="majorEastAsia"/>
       <w:b/>
       <w:color w:val="0070C0"/>
       <w:spacing w:val="-10"/>
@@ -8825,7 +8641,7 @@
       <w:ind w:firstLine="709"/>
     </w:pPr>
     <w:rPr>
-      <w:rFonts w:eastAsia="游明朝" w:eastAsiaTheme="minorEastAsia"/>
+      <w:rFonts w:eastAsia="" w:eastAsiaTheme="minorEastAsia"/>
       <w:i/>
       <w:color w:themeColor="background2" w:themeShade="40" w:val="37BCF3"/>
       <w:spacing w:val="15"/>
@@ -8845,7 +8661,7 @@
       <w:contextualSpacing/>
     </w:pPr>
     <w:rPr>
-      <w:rFonts w:eastAsia="游ゴシック Light" w:cs="" w:cstheme="majorBidi" w:eastAsiaTheme="majorEastAsia"/>
+      <w:rFonts w:eastAsia="" w:cs="" w:cstheme="majorBidi" w:eastAsiaTheme="majorEastAsia"/>
       <w:b/>
       <w:color w:themeColor="background2" w:themeShade="40" w:val="0070C0"/>
       <w:spacing w:val="-10"/>

</xml_diff>

<commit_message>
commit fin de journée 29 avril
</commit_message>
<xml_diff>
--- a/carnet de bord_LitterAi.docx
+++ b/carnet de bord_LitterAi.docx
@@ -1158,18 +1158,7 @@
                 <w:szCs w:val="24"/>
                 <w:lang w:val="fr-FR" w:eastAsia="en-US" w:bidi="ar-SA"/>
               </w:rPr>
-              <w:t>27/04/</w:t>
-            </w:r>
-            <w:r>
-              <w:rPr>
-                <w:rFonts w:eastAsia="Calibri" w:cs="" w:ascii="Calibri Light" w:hAnsi="Calibri Light" w:asciiTheme="majorHAnsi" w:hAnsiTheme="majorHAnsi"/>
-                <w:b/>
-                <w:kern w:val="0"/>
-                <w:sz w:val="24"/>
-                <w:szCs w:val="24"/>
-                <w:lang w:val="fr-FR" w:eastAsia="en-US" w:bidi="ar-SA"/>
-              </w:rPr>
-              <w:t>2026</w:t>
+              <w:t>27/04/2026</w:t>
             </w:r>
           </w:p>
         </w:tc>
@@ -1949,40 +1938,7 @@
                 <w:szCs w:val="24"/>
                 <w:lang w:val="fr-FR" w:eastAsia="en-US" w:bidi="ar-SA"/>
               </w:rPr>
-              <w:t>2</w:t>
-            </w:r>
-            <w:r>
-              <w:rPr>
-                <w:rFonts w:eastAsia="Calibri" w:cs="" w:ascii="Calibri Light" w:hAnsi="Calibri Light" w:asciiTheme="majorHAnsi" w:hAnsiTheme="majorHAnsi"/>
-                <w:b/>
-                <w:kern w:val="0"/>
-                <w:sz w:val="24"/>
-                <w:szCs w:val="24"/>
-                <w:lang w:val="fr-FR" w:eastAsia="en-US" w:bidi="ar-SA"/>
-              </w:rPr>
-              <w:t>8</w:t>
-            </w:r>
-            <w:r>
-              <w:rPr>
-                <w:rFonts w:eastAsia="Calibri" w:cs="" w:ascii="Calibri Light" w:hAnsi="Calibri Light" w:asciiTheme="majorHAnsi" w:hAnsiTheme="majorHAnsi"/>
-                <w:b/>
-                <w:kern w:val="0"/>
-                <w:sz w:val="24"/>
-                <w:szCs w:val="24"/>
-                <w:lang w:val="fr-FR" w:eastAsia="en-US" w:bidi="ar-SA"/>
-              </w:rPr>
-              <w:t>/04/</w:t>
-            </w:r>
-            <w:r>
-              <w:rPr>
-                <w:rFonts w:eastAsia="Calibri" w:cs="" w:ascii="Calibri Light" w:hAnsi="Calibri Light" w:asciiTheme="majorHAnsi" w:hAnsiTheme="majorHAnsi"/>
-                <w:b/>
-                <w:kern w:val="0"/>
-                <w:sz w:val="24"/>
-                <w:szCs w:val="24"/>
-                <w:lang w:val="fr-FR" w:eastAsia="en-US" w:bidi="ar-SA"/>
-              </w:rPr>
-              <w:t>2026</w:t>
+              <w:t>28/04/2026</w:t>
             </w:r>
           </w:p>
         </w:tc>
@@ -2306,7 +2262,7 @@
             </w:pPr>
             <w:r>
               <w:rPr>
-                <w:rFonts w:asciiTheme="majorHAnsi" w:hAnsiTheme="majorHAnsi" w:ascii="Calibri Light" w:hAnsi="Calibri Light"/>
+                <w:rFonts w:ascii="Calibri Light" w:hAnsi="Calibri Light" w:asciiTheme="majorHAnsi" w:hAnsiTheme="majorHAnsi"/>
               </w:rPr>
               <w:t>Donc aujourdhh’ui j’ai peaufinner un ptit peu le design avec la version mobile et j’ai msi en place les equations aléatoire pour les exemples  de la page de modélisation et debut de l’implementation de l’ia maintenant</w:t>
             </w:r>
@@ -2743,7 +2699,7 @@
                 <w:szCs w:val="24"/>
                 <w:lang w:val="fr-FR" w:eastAsia="en-US" w:bidi="ar-SA"/>
               </w:rPr>
-              <w:t>TP3</w:t>
+              <w:t>29 avril</w:t>
             </w:r>
           </w:p>
         </w:tc>
@@ -3063,12 +3019,19 @@
               <w:ind w:hanging="0"/>
               <w:rPr>
                 <w:rFonts w:ascii="Calibri Light" w:hAnsi="Calibri Light" w:asciiTheme="majorHAnsi" w:hAnsiTheme="majorHAnsi"/>
-              </w:rPr>
-            </w:pPr>
-            <w:r>
-              <w:rPr>
-                <w:rFonts w:asciiTheme="majorHAnsi" w:hAnsiTheme="majorHAnsi" w:ascii="Calibri Light" w:hAnsi="Calibri Light"/>
-              </w:rPr>
+                <w:sz w:val="18"/>
+                <w:szCs w:val="18"/>
+              </w:rPr>
+            </w:pPr>
+            <w:r>
+              <w:rPr>
+                <w:rFonts w:asciiTheme="majorHAnsi" w:hAnsiTheme="majorHAnsi" w:ascii="Calibri Light" w:hAnsi="Calibri Light"/>
+                <w:sz w:val="18"/>
+                <w:szCs w:val="18"/>
+              </w:rPr>
+              <w:t>Dans la page de modélisation j’ai modifier la partie exemple maintenant a chaque clique sur la fleche il ya une partie de l’exemple qui s’affiche et non seulement tout l’exemple / k’ai egalement ajouter une video localement pour que les eleves puissent la visionner en appuyer sur un bouton, c’est une vidéo explicative. J’ai également modifier l’utilisation de l’ia dans le backend pour qu’il ai une memoire donc qu’on puisse avoir une connexion avec lui.</w:t>
+              <w:br/>
+              <w:t>Dans le front end j’ai créer une requete vers l’api qui demande a l’ia de generer une equation a la demande en appuyant sur un bouton .</w:t>
             </w:r>
           </w:p>
         </w:tc>
@@ -7508,8 +7471,8 @@
         </mc:Choice>
         <mc:Fallback>
           <w:pict>
-            <v:rect id="shape_0" ID="Cadre1" path="m0,0l-2147483645,0l-2147483645,-2147483646l0,-2147483646xe" fillcolor="white" stroked="f" o:allowincell="f" style="position:absolute;margin-left:0pt;margin-top:0.05pt;width:1.1pt;height:1.1pt;mso-wrap-style:square;v-text-anchor:top;mso-position-horizontal:center;mso-position-horizontal-relative:margin">
-              <v:fill o:detectmouseclick="t" type="solid" color2="black" opacity="0"/>
+            <v:rect id="shape_0" ID="Cadre1" path="m0,0l-2147483645,0l-2147483645,-2147483646l0,-2147483646xe" stroked="f" o:allowincell="f" style="position:absolute;margin-left:0pt;margin-top:0.05pt;width:1.1pt;height:1.1pt;mso-wrap-style:square;v-text-anchor:top;mso-position-horizontal:center;mso-position-horizontal-relative:margin">
+              <v:fill o:detectmouseclick="t" on="false"/>
               <v:stroke color="#3465a4" joinstyle="round" endcap="flat"/>
               <v:textbox>
                 <w:txbxContent>
@@ -7663,8 +7626,8 @@
         </mc:Choice>
         <mc:Fallback>
           <w:pict>
-            <v:rect id="shape_0" ID="Cadre2" path="m0,0l-2147483645,0l-2147483645,-2147483646l0,-2147483646xe" fillcolor="white" stroked="f" o:allowincell="f" style="position:absolute;margin-left:202.15pt;margin-top:0.05pt;width:49.2pt;height:16.2pt;mso-wrap-style:square;v-text-anchor:top;mso-position-horizontal:center;mso-position-horizontal-relative:margin">
-              <v:fill o:detectmouseclick="t" type="solid" color2="black" opacity="0"/>
+            <v:rect id="shape_0" ID="Cadre2" path="m0,0l-2147483645,0l-2147483645,-2147483646l0,-2147483646xe" stroked="f" o:allowincell="f" style="position:absolute;margin-left:202.15pt;margin-top:0.05pt;width:49.2pt;height:16.2pt;mso-wrap-style:square;v-text-anchor:top;mso-position-horizontal:center;mso-position-horizontal-relative:margin">
+              <v:fill o:detectmouseclick="t" on="false"/>
               <v:stroke color="#3465a4" joinstyle="round" endcap="flat"/>
               <v:textbox>
                 <w:txbxContent>

</xml_diff>

<commit_message>
commit fin de seance
</commit_message>
<xml_diff>
--- a/carnet de bord_LitterAi.docx
+++ b/carnet de bord_LitterAi.docx
@@ -3025,7 +3025,7 @@
             </w:pPr>
             <w:r>
               <w:rPr>
-                <w:rFonts w:asciiTheme="majorHAnsi" w:hAnsiTheme="majorHAnsi" w:ascii="Calibri Light" w:hAnsi="Calibri Light"/>
+                <w:rFonts w:ascii="Calibri Light" w:hAnsi="Calibri Light" w:asciiTheme="majorHAnsi" w:hAnsiTheme="majorHAnsi"/>
                 <w:sz w:val="18"/>
                 <w:szCs w:val="18"/>
               </w:rPr>
@@ -3466,7 +3466,7 @@
                 <w:szCs w:val="24"/>
                 <w:lang w:val="fr-FR" w:eastAsia="en-US" w:bidi="ar-SA"/>
               </w:rPr>
-              <w:t>TP4</w:t>
+              <w:t>30 avril</w:t>
             </w:r>
           </w:p>
         </w:tc>
@@ -3786,12 +3786,21 @@
               <w:ind w:hanging="0"/>
               <w:rPr>
                 <w:rFonts w:ascii="Calibri Light" w:hAnsi="Calibri Light" w:asciiTheme="majorHAnsi" w:hAnsiTheme="majorHAnsi"/>
-              </w:rPr>
-            </w:pPr>
-            <w:r>
-              <w:rPr>
-                <w:rFonts w:asciiTheme="majorHAnsi" w:hAnsiTheme="majorHAnsi" w:ascii="Calibri Light" w:hAnsi="Calibri Light"/>
-              </w:rPr>
+                <w:sz w:val="18"/>
+                <w:szCs w:val="18"/>
+              </w:rPr>
+            </w:pPr>
+            <w:r>
+              <w:rPr>
+                <w:rFonts w:asciiTheme="majorHAnsi" w:hAnsiTheme="majorHAnsi" w:ascii="Calibri Light" w:hAnsi="Calibri Light"/>
+                <w:sz w:val="18"/>
+                <w:szCs w:val="18"/>
+              </w:rPr>
+              <w:t>Aujoud’hui j’ai fais le style pour la page d’apprentissage guidé</w:t>
+              <w:br/>
+              <w:t xml:space="preserve">c’etait tres long </w:t>
+              <w:br/>
+              <w:t>Ensuite l’aprem je suis passé a la page apprentissage autonome je pense qu’il reste 25 % du travail.</w:t>
             </w:r>
           </w:p>
         </w:tc>

</xml_diff>

<commit_message>
comit fin de seance
</commit_message>
<xml_diff>
--- a/carnet de bord_LitterAi.docx
+++ b/carnet de bord_LitterAi.docx
@@ -5865,7 +5865,7 @@
             </w:pPr>
             <w:r>
               <w:rPr>
-                <w:rFonts w:asciiTheme="majorHAnsi" w:hAnsiTheme="majorHAnsi" w:ascii="Calibri Light" w:hAnsi="Calibri Light"/>
+                <w:rFonts w:ascii="Calibri Light" w:hAnsi="Calibri Light" w:asciiTheme="majorHAnsi" w:hAnsiTheme="majorHAnsi"/>
                 <w:sz w:val="18"/>
                 <w:szCs w:val="18"/>
               </w:rPr>
@@ -6526,7 +6526,7 @@
                 <w:szCs w:val="24"/>
                 <w:lang w:val="fr-FR" w:eastAsia="en-US" w:bidi="ar-SA"/>
               </w:rPr>
-              <w:t>TP8-9</w:t>
+              <w:t xml:space="preserve">7 mai </w:t>
             </w:r>
           </w:p>
         </w:tc>
@@ -6846,12 +6846,17 @@
               <w:ind w:hanging="0"/>
               <w:rPr>
                 <w:rFonts w:ascii="Calibri Light" w:hAnsi="Calibri Light" w:asciiTheme="majorHAnsi" w:hAnsiTheme="majorHAnsi"/>
-              </w:rPr>
-            </w:pPr>
-            <w:r>
-              <w:rPr>
-                <w:rFonts w:asciiTheme="majorHAnsi" w:hAnsiTheme="majorHAnsi" w:ascii="Calibri Light" w:hAnsi="Calibri Light"/>
-              </w:rPr>
+                <w:sz w:val="18"/>
+                <w:szCs w:val="18"/>
+              </w:rPr>
+            </w:pPr>
+            <w:r>
+              <w:rPr>
+                <w:rFonts w:asciiTheme="majorHAnsi" w:hAnsiTheme="majorHAnsi" w:ascii="Calibri Light" w:hAnsi="Calibri Light"/>
+                <w:sz w:val="18"/>
+                <w:szCs w:val="18"/>
+              </w:rPr>
+              <w:t>Finalisation de la phase equations car il manquais des pages, et egalement la finalisation de la pase calcul literal, entament de la ficher 1.2 ici on veux créer une sorte d’activité pour les eleves, j’ai pas trop bosser aujourd’hui j’etais fatigeur j etacherai de faire mieux</w:t>
             </w:r>
           </w:p>
         </w:tc>

</xml_diff>

<commit_message>
commit fin de salle
</commit_message>
<xml_diff>
--- a/carnet de bord_LitterAi.docx
+++ b/carnet de bord_LitterAi.docx
@@ -7854,21 +7854,7 @@
                 <w:b/>
                 <w:bCs/>
               </w:rPr>
-              <w:t>1</w:t>
-            </w:r>
-            <w:r>
-              <w:rPr>
-                <w:b/>
-                <w:bCs/>
-              </w:rPr>
-              <w:t>8</w:t>
-            </w:r>
-            <w:r>
-              <w:rPr>
-                <w:b/>
-                <w:bCs/>
-              </w:rPr>
-              <w:t xml:space="preserve"> mai</w:t>
+              <w:t>18 mai</w:t>
             </w:r>
           </w:p>
         </w:tc>
@@ -7898,7 +7884,7 @@
       </w:tr>
       <w:tr>
         <w:trPr>
-          <w:trHeight w:val="1075" w:hRule="atLeast"/>
+          <w:trHeight w:val="4184" w:hRule="atLeast"/>
         </w:trPr>
         <w:tc>
           <w:tcPr>
@@ -7947,11 +7933,193 @@
             </w:pPr>
             <w:r>
               <w:rPr>
-                <w:rFonts w:asciiTheme="majorHAnsi" w:hAnsiTheme="majorHAnsi" w:ascii="Calibri Light" w:hAnsi="Calibri Light"/>
+                <w:rFonts w:ascii="Calibri Light" w:hAnsi="Calibri Light" w:asciiTheme="majorHAnsi" w:hAnsiTheme="majorHAnsi"/>
                 <w:sz w:val="18"/>
                 <w:szCs w:val="18"/>
               </w:rPr>
-              <w:t xml:space="preserve">Aujourd’hui j’ai effectuer tout le module B qui etais a rajouter dans la mission 2 donc la module par rapport au tests des inégalités, j’ai du réaliser énormement de fonction diffenrentes car chaque situatiion, cahque niveau est differente </w:t>
+              <w:t>Aujourd’hui j’ai effectuer tout le module B qui etais a rajouter dans la mission 2 donc la module par rapport au tests des inégalités, j’ai du réaliser énormement de fonction diffenrentes car chaque situatiion, cahque niveau est differente</w:t>
+            </w:r>
+          </w:p>
+        </w:tc>
+        <w:tc>
+          <w:tcPr>
+            <w:tcW w:w="4577" w:type="dxa"/>
+            <w:tcBorders>
+              <w:top w:val="nil"/>
+            </w:tcBorders>
+          </w:tcPr>
+          <w:p>
+            <w:pPr>
+              <w:pStyle w:val="Normal"/>
+              <w:widowControl/>
+              <w:suppressAutoHyphens w:val="true"/>
+              <w:spacing w:before="0" w:after="0"/>
+              <w:ind w:hanging="0"/>
+              <w:rPr>
+                <w:rFonts w:ascii="Calibri Light" w:hAnsi="Calibri Light" w:asciiTheme="majorHAnsi" w:hAnsiTheme="majorHAnsi"/>
+              </w:rPr>
+            </w:pPr>
+            <w:r>
+              <w:rPr>
+                <w:rFonts w:asciiTheme="majorHAnsi" w:hAnsiTheme="majorHAnsi" w:ascii="Calibri Light" w:hAnsi="Calibri Light"/>
+              </w:rPr>
+            </w:r>
+          </w:p>
+        </w:tc>
+      </w:tr>
+      <w:tr>
+        <w:trPr>
+          <w:trHeight w:val="341" w:hRule="atLeast"/>
+        </w:trPr>
+        <w:tc>
+          <w:tcPr>
+            <w:tcW w:w="2221" w:type="dxa"/>
+            <w:tcBorders>
+              <w:top w:val="nil"/>
+            </w:tcBorders>
+          </w:tcPr>
+          <w:p>
+            <w:pPr>
+              <w:pStyle w:val="Normal"/>
+              <w:widowControl/>
+              <w:suppressAutoHyphens w:val="true"/>
+              <w:spacing w:before="0" w:after="0"/>
+              <w:ind w:hanging="0"/>
+              <w:rPr>
+                <w:rFonts w:ascii="Calibri Light" w:hAnsi="Calibri Light" w:asciiTheme="majorHAnsi" w:hAnsiTheme="majorHAnsi"/>
+              </w:rPr>
+            </w:pPr>
+            <w:r>
+              <w:rPr>
+                <w:rFonts w:asciiTheme="majorHAnsi" w:hAnsiTheme="majorHAnsi" w:ascii="Calibri Light" w:hAnsi="Calibri Light"/>
+              </w:rPr>
+            </w:r>
+          </w:p>
+        </w:tc>
+        <w:tc>
+          <w:tcPr>
+            <w:tcW w:w="2484" w:type="dxa"/>
+            <w:tcBorders>
+              <w:top w:val="nil"/>
+            </w:tcBorders>
+          </w:tcPr>
+          <w:p>
+            <w:pPr>
+              <w:pStyle w:val="Normal"/>
+              <w:widowControl/>
+              <w:suppressAutoHyphens w:val="true"/>
+              <w:spacing w:before="0" w:after="0"/>
+              <w:rPr>
+                <w:rFonts w:ascii="Calibri Light" w:hAnsi="Calibri Light" w:asciiTheme="majorHAnsi" w:hAnsiTheme="majorHAnsi"/>
+                <w:b/>
+                <w:bCs/>
+              </w:rPr>
+            </w:pPr>
+            <w:r>
+              <w:rPr>
+                <w:b/>
+                <w:bCs/>
+              </w:rPr>
+              <w:t>1</w:t>
+            </w:r>
+            <w:r>
+              <w:rPr>
+                <w:b/>
+                <w:bCs/>
+              </w:rPr>
+              <w:t>9</w:t>
+            </w:r>
+            <w:r>
+              <w:rPr>
+                <w:b/>
+                <w:bCs/>
+              </w:rPr>
+              <w:t xml:space="preserve"> mai</w:t>
+            </w:r>
+          </w:p>
+        </w:tc>
+        <w:tc>
+          <w:tcPr>
+            <w:tcW w:w="4577" w:type="dxa"/>
+            <w:tcBorders>
+              <w:top w:val="nil"/>
+            </w:tcBorders>
+          </w:tcPr>
+          <w:p>
+            <w:pPr>
+              <w:pStyle w:val="Normal"/>
+              <w:widowControl/>
+              <w:suppressAutoHyphens w:val="true"/>
+              <w:spacing w:before="0" w:after="0"/>
+              <w:ind w:hanging="0"/>
+              <w:rPr>
+                <w:rFonts w:ascii="Calibri Light" w:hAnsi="Calibri Light" w:asciiTheme="majorHAnsi" w:hAnsiTheme="majorHAnsi"/>
+              </w:rPr>
+            </w:pPr>
+            <w:r>
+              <w:rPr>
+                <w:rFonts w:asciiTheme="majorHAnsi" w:hAnsiTheme="majorHAnsi" w:ascii="Calibri Light" w:hAnsi="Calibri Light"/>
+              </w:rPr>
+            </w:r>
+          </w:p>
+        </w:tc>
+      </w:tr>
+      <w:tr>
+        <w:trPr>
+          <w:trHeight w:val="4184" w:hRule="atLeast"/>
+        </w:trPr>
+        <w:tc>
+          <w:tcPr>
+            <w:tcW w:w="2221" w:type="dxa"/>
+            <w:tcBorders>
+              <w:top w:val="nil"/>
+            </w:tcBorders>
+          </w:tcPr>
+          <w:p>
+            <w:pPr>
+              <w:pStyle w:val="Normal"/>
+              <w:widowControl/>
+              <w:suppressAutoHyphens w:val="true"/>
+              <w:spacing w:before="0" w:after="0"/>
+              <w:ind w:hanging="0"/>
+              <w:rPr>
+                <w:rFonts w:ascii="Calibri Light" w:hAnsi="Calibri Light" w:asciiTheme="majorHAnsi" w:hAnsiTheme="majorHAnsi"/>
+              </w:rPr>
+            </w:pPr>
+            <w:r>
+              <w:rPr>
+                <w:rFonts w:asciiTheme="majorHAnsi" w:hAnsiTheme="majorHAnsi" w:ascii="Calibri Light" w:hAnsi="Calibri Light"/>
+              </w:rPr>
+            </w:r>
+          </w:p>
+        </w:tc>
+        <w:tc>
+          <w:tcPr>
+            <w:tcW w:w="2484" w:type="dxa"/>
+            <w:tcBorders>
+              <w:top w:val="nil"/>
+            </w:tcBorders>
+          </w:tcPr>
+          <w:p>
+            <w:pPr>
+              <w:pStyle w:val="Normal"/>
+              <w:widowControl/>
+              <w:suppressAutoHyphens w:val="true"/>
+              <w:spacing w:before="0" w:after="0"/>
+              <w:ind w:hanging="0"/>
+              <w:rPr>
+                <w:rFonts w:ascii="Calibri Light" w:hAnsi="Calibri Light" w:asciiTheme="majorHAnsi" w:hAnsiTheme="majorHAnsi"/>
+                <w:sz w:val="18"/>
+                <w:szCs w:val="18"/>
+              </w:rPr>
+            </w:pPr>
+            <w:r>
+              <w:rPr>
+                <w:rFonts w:asciiTheme="majorHAnsi" w:hAnsiTheme="majorHAnsi" w:ascii="Calibri Light" w:hAnsi="Calibri Light"/>
+                <w:sz w:val="18"/>
+                <w:szCs w:val="18"/>
+              </w:rPr>
+              <w:t>Creation de la page de sousAccueil utiliser dans chaque module et également la machine a exercice  autonomes qui n’ai pas encore été implementer partour mais qui a déjà été codé</w:t>
             </w:r>
           </w:p>
         </w:tc>
@@ -8332,7 +8500,7 @@
       <mc:AlternateContent>
         <mc:Choice Requires="wps">
           <w:drawing>
-            <wp:anchor behindDoc="1" distT="0" distB="0" distL="0" distR="0" simplePos="0" locked="0" layoutInCell="0" allowOverlap="1" relativeHeight="26">
+            <wp:anchor behindDoc="1" distT="0" distB="0" distL="0" distR="0" simplePos="0" locked="0" layoutInCell="0" allowOverlap="1" relativeHeight="28">
               <wp:simplePos x="0" y="0"/>
               <wp:positionH relativeFrom="margin">
                 <wp:align>center</wp:align>
@@ -8398,7 +8566,7 @@
                             <w:rPr>
                               <w:rStyle w:val="PageNumber"/>
                             </w:rPr>
-                            <w:t>11</w:t>
+                            <w:t>14</w:t>
                           </w:r>
                           <w:r>
                             <w:rPr>
@@ -8454,7 +8622,7 @@
                       <w:rPr>
                         <w:rStyle w:val="PageNumber"/>
                       </w:rPr>
-                      <w:t>11</w:t>
+                      <w:t>14</w:t>
                     </w:r>
                     <w:r>
                       <w:rPr>

</xml_diff>